<commit_message>
Entry 10 + progress doc refresh: deployment live at sabercast-mlb.streamlit.app
</commit_message>
<xml_diff>
--- a/docs/Sabercast_Build_Log.docx
+++ b/docs/Sabercast_Build_Log.docx
@@ -5395,6 +5395,519 @@
         </w:pBdr>
       </w:pPr>
     </w:p>
+    <w:p>
+      <w:r>
+        <w:rPr>
+          <w:rFonts w:ascii="Arial" w:hAnsi="Arial"/>
+          <w:b/>
+          <w:color w:val="202020"/>
+          <w:sz w:val="30"/>
+        </w:rPr>
+        <w:t>Entry 10 — May 31 (Final build): Public deployment on Streamlit Community Cloud</w:t>
+      </w:r>
+    </w:p>
+    <w:p>
+      <w:r>
+        <w:rPr>
+          <w:rFonts w:ascii="Arial" w:hAnsi="Arial"/>
+          <w:b/>
+          <w:sz w:val="20"/>
+        </w:rPr>
+        <w:t>Goal:</w:t>
+      </w:r>
+      <w:r>
+        <w:rPr>
+          <w:rFonts w:ascii="Arial" w:hAnsi="Arial"/>
+          <w:sz w:val="20"/>
+        </w:rPr>
+        <w:t xml:space="preserve"> Get a public URL so classmates, the professor, and Demo Day judges can interact with the app without setup. Surface deployment-only issues before Demo Day.</w:t>
+      </w:r>
+    </w:p>
+    <w:p>
+      <w:r>
+        <w:rPr>
+          <w:rFonts w:ascii="Arial" w:hAnsi="Arial"/>
+          <w:b/>
+          <w:sz w:val="20"/>
+        </w:rPr>
+        <w:t>What was built</w:t>
+      </w:r>
+    </w:p>
+    <w:p>
+      <w:pPr>
+        <w:pStyle w:val="ListBullet"/>
+      </w:pPr>
+      <w:r>
+        <w:rPr>
+          <w:rFonts w:ascii="Arial" w:hAnsi="Arial"/>
+          <w:b/>
+          <w:sz w:val="20"/>
+        </w:rPr>
+        <w:t>GitHub repository.</w:t>
+      </w:r>
+      <w:r>
+        <w:rPr>
+          <w:rFonts w:ascii="Arial" w:hAnsi="Arial"/>
+          <w:sz w:val="20"/>
+        </w:rPr>
+        <w:t xml:space="preserve"> </w:t>
+      </w:r>
+      <w:r>
+        <w:rPr>
+          <w:rFonts w:ascii="Consolas" w:hAnsi="Consolas"/>
+          <w:color w:val="444444"/>
+          <w:sz w:val="19"/>
+        </w:rPr>
+        <w:t>sabercast/</w:t>
+      </w:r>
+      <w:r>
+        <w:rPr>
+          <w:rFonts w:ascii="Arial" w:hAnsi="Arial"/>
+          <w:sz w:val="20"/>
+        </w:rPr>
+        <w:t xml:space="preserve"> initialized as a git repo, pushed to &lt;https://github.com/rwpeugh/sabercast&gt; (public). Initial commit covers everything: app code, 115 contracts, multi-year stats, 6 years of Statcast defensive data, ChromaDB vectorstore, archetypes CSV, eval results, all docs.</w:t>
+      </w:r>
+    </w:p>
+    <w:p>
+      <w:pPr>
+        <w:pStyle w:val="ListBullet"/>
+      </w:pPr>
+      <w:r>
+        <w:rPr>
+          <w:rFonts w:ascii="Arial" w:hAnsi="Arial"/>
+          <w:b/>
+          <w:sz w:val="20"/>
+        </w:rPr>
+        <w:t>`runtime.txt`</w:t>
+      </w:r>
+      <w:r>
+        <w:rPr>
+          <w:rFonts w:ascii="Arial" w:hAnsi="Arial"/>
+          <w:sz w:val="20"/>
+        </w:rPr>
+        <w:t xml:space="preserve"> specifying </w:t>
+      </w:r>
+      <w:r>
+        <w:rPr>
+          <w:rFonts w:ascii="Consolas" w:hAnsi="Consolas"/>
+          <w:color w:val="444444"/>
+          <w:sz w:val="19"/>
+        </w:rPr>
+        <w:t>python-3.11</w:t>
+      </w:r>
+      <w:r>
+        <w:rPr>
+          <w:rFonts w:ascii="Arial" w:hAnsi="Arial"/>
+          <w:sz w:val="20"/>
+        </w:rPr>
+        <w:t xml:space="preserve"> for compatibility with Streamlit Cloud's supported runtimes (Cloud picked Python 3.14 on its own — fine, our code runs on both).</w:t>
+      </w:r>
+    </w:p>
+    <w:p>
+      <w:pPr>
+        <w:pStyle w:val="ListBullet"/>
+      </w:pPr>
+      <w:r>
+        <w:rPr>
+          <w:rFonts w:ascii="Arial" w:hAnsi="Arial"/>
+          <w:b/>
+          <w:sz w:val="20"/>
+        </w:rPr>
+        <w:t>`.streamlit/config.toml`</w:t>
+      </w:r>
+      <w:r>
+        <w:rPr>
+          <w:rFonts w:ascii="Arial" w:hAnsi="Arial"/>
+          <w:sz w:val="20"/>
+        </w:rPr>
+        <w:t xml:space="preserve"> — theming, headless mode, telemetry off, and </w:t>
+      </w:r>
+      <w:r>
+        <w:rPr>
+          <w:rFonts w:ascii="Consolas" w:hAnsi="Consolas"/>
+          <w:color w:val="444444"/>
+          <w:sz w:val="19"/>
+        </w:rPr>
+        <w:t>[client] showErrorDetails = "full"</w:t>
+      </w:r>
+      <w:r>
+        <w:rPr>
+          <w:rFonts w:ascii="Arial" w:hAnsi="Arial"/>
+          <w:sz w:val="20"/>
+        </w:rPr>
+        <w:t xml:space="preserve"> for diagnosing deployment-only failures.</w:t>
+      </w:r>
+    </w:p>
+    <w:p>
+      <w:pPr>
+        <w:pStyle w:val="ListBullet"/>
+      </w:pPr>
+      <w:r>
+        <w:rPr>
+          <w:rFonts w:ascii="Arial" w:hAnsi="Arial"/>
+          <w:b/>
+          <w:sz w:val="20"/>
+        </w:rPr>
+        <w:t>`.gitignore`</w:t>
+      </w:r>
+      <w:r>
+        <w:rPr>
+          <w:rFonts w:ascii="Arial" w:hAnsi="Arial"/>
+          <w:sz w:val="20"/>
+        </w:rPr>
+        <w:t xml:space="preserve"> updated to allow </w:t>
+      </w:r>
+      <w:r>
+        <w:rPr>
+          <w:rFonts w:ascii="Consolas" w:hAnsi="Consolas"/>
+          <w:color w:val="444444"/>
+          <w:sz w:val="19"/>
+        </w:rPr>
+        <w:t>data/</w:t>
+      </w:r>
+      <w:r>
+        <w:rPr>
+          <w:rFonts w:ascii="Arial" w:hAnsi="Arial"/>
+          <w:sz w:val="20"/>
+        </w:rPr>
+        <w:t xml:space="preserve"> into the repo (under 25 MB total) so the deployed app doesn't need to rebuild Pipelines 01–04 on every cold start, while continuing to exclude secrets and OS noise.</w:t>
+      </w:r>
+    </w:p>
+    <w:p>
+      <w:pPr>
+        <w:pStyle w:val="ListBullet"/>
+      </w:pPr>
+      <w:r>
+        <w:rPr>
+          <w:rFonts w:ascii="Arial" w:hAnsi="Arial"/>
+          <w:b/>
+          <w:sz w:val="20"/>
+        </w:rPr>
+        <w:t>`DEPLOY.md`</w:t>
+      </w:r>
+      <w:r>
+        <w:rPr>
+          <w:rFonts w:ascii="Arial" w:hAnsi="Arial"/>
+          <w:sz w:val="20"/>
+        </w:rPr>
+        <w:t xml:space="preserve"> with the step-by-step instructions for the Streamlit Cloud side of the workflow.</w:t>
+      </w:r>
+    </w:p>
+    <w:p>
+      <w:pPr>
+        <w:pStyle w:val="ListBullet"/>
+      </w:pPr>
+      <w:r>
+        <w:rPr>
+          <w:rFonts w:ascii="Arial" w:hAnsi="Arial"/>
+          <w:b/>
+          <w:sz w:val="20"/>
+        </w:rPr>
+        <w:t>Streamlit Cloud app</w:t>
+      </w:r>
+      <w:r>
+        <w:rPr>
+          <w:rFonts w:ascii="Arial" w:hAnsi="Arial"/>
+          <w:sz w:val="20"/>
+        </w:rPr>
+        <w:t xml:space="preserve"> created at &lt;https://sabercast-mlb.streamlit.app&gt;, connected to the </w:t>
+      </w:r>
+      <w:r>
+        <w:rPr>
+          <w:rFonts w:ascii="Consolas" w:hAnsi="Consolas"/>
+          <w:color w:val="444444"/>
+          <w:sz w:val="19"/>
+        </w:rPr>
+        <w:t>main</w:t>
+      </w:r>
+      <w:r>
+        <w:rPr>
+          <w:rFonts w:ascii="Arial" w:hAnsi="Arial"/>
+          <w:sz w:val="20"/>
+        </w:rPr>
+        <w:t xml:space="preserve"> branch, </w:t>
+      </w:r>
+      <w:r>
+        <w:rPr>
+          <w:rFonts w:ascii="Consolas" w:hAnsi="Consolas"/>
+          <w:color w:val="444444"/>
+          <w:sz w:val="19"/>
+        </w:rPr>
+        <w:t>OPENAI_API_KEY</w:t>
+      </w:r>
+      <w:r>
+        <w:rPr>
+          <w:rFonts w:ascii="Arial" w:hAnsi="Arial"/>
+          <w:sz w:val="20"/>
+        </w:rPr>
+        <w:t xml:space="preserve"> set via the Cloud secrets pane.</w:t>
+      </w:r>
+    </w:p>
+    <w:p>
+      <w:r>
+        <w:rPr>
+          <w:rFonts w:ascii="Arial" w:hAnsi="Arial"/>
+          <w:b/>
+          <w:sz w:val="20"/>
+        </w:rPr>
+        <w:t>Two deployment-only bugs caught and fixed</w:t>
+      </w:r>
+    </w:p>
+    <w:p>
+      <w:pPr>
+        <w:pStyle w:val="ListNumber"/>
+      </w:pPr>
+      <w:r>
+        <w:rPr>
+          <w:rFonts w:ascii="Arial" w:hAnsi="Arial"/>
+          <w:b/>
+          <w:sz w:val="20"/>
+        </w:rPr>
+        <w:t>Secret retrieval.</w:t>
+      </w:r>
+      <w:r>
+        <w:rPr>
+          <w:rFonts w:ascii="Arial" w:hAnsi="Arial"/>
+          <w:sz w:val="20"/>
+        </w:rPr>
+        <w:t xml:space="preserve"> Our </w:t>
+      </w:r>
+      <w:r>
+        <w:rPr>
+          <w:rFonts w:ascii="Consolas" w:hAnsi="Consolas"/>
+          <w:color w:val="444444"/>
+          <w:sz w:val="19"/>
+        </w:rPr>
+        <w:t>get_openai_api_key()</w:t>
+      </w:r>
+      <w:r>
+        <w:rPr>
+          <w:rFonts w:ascii="Arial" w:hAnsi="Arial"/>
+          <w:sz w:val="20"/>
+        </w:rPr>
+        <w:t xml:space="preserve"> only checked </w:t>
+      </w:r>
+      <w:r>
+        <w:rPr>
+          <w:rFonts w:ascii="Consolas" w:hAnsi="Consolas"/>
+          <w:color w:val="444444"/>
+          <w:sz w:val="19"/>
+        </w:rPr>
+        <w:t>os.environ</w:t>
+      </w:r>
+      <w:r>
+        <w:rPr>
+          <w:rFonts w:ascii="Arial" w:hAnsi="Arial"/>
+          <w:sz w:val="20"/>
+        </w:rPr>
+        <w:t xml:space="preserve"> and local files. Streamlit Cloud puts secrets into </w:t>
+      </w:r>
+      <w:r>
+        <w:rPr>
+          <w:rFonts w:ascii="Consolas" w:hAnsi="Consolas"/>
+          <w:color w:val="444444"/>
+          <w:sz w:val="19"/>
+        </w:rPr>
+        <w:t>st.secrets[...]</w:t>
+      </w:r>
+      <w:r>
+        <w:rPr>
+          <w:rFonts w:ascii="Arial" w:hAnsi="Arial"/>
+          <w:sz w:val="20"/>
+        </w:rPr>
+        <w:t xml:space="preserve"> but does not always propagate them to environment variables. The app booted, the landing page rendered, then the Gap Filler diagnose call raised </w:t>
+      </w:r>
+      <w:r>
+        <w:rPr>
+          <w:rFonts w:ascii="Consolas" w:hAnsi="Consolas"/>
+          <w:color w:val="444444"/>
+          <w:sz w:val="19"/>
+        </w:rPr>
+        <w:t>RuntimeError: OpenAI API key not found</w:t>
+      </w:r>
+      <w:r>
+        <w:rPr>
+          <w:rFonts w:ascii="Arial" w:hAnsi="Arial"/>
+          <w:sz w:val="20"/>
+        </w:rPr>
+        <w:t xml:space="preserve"> from inside </w:t>
+      </w:r>
+      <w:r>
+        <w:rPr>
+          <w:rFonts w:ascii="Consolas" w:hAnsi="Consolas"/>
+          <w:color w:val="444444"/>
+          <w:sz w:val="19"/>
+        </w:rPr>
+        <w:t>_client()</w:t>
+      </w:r>
+      <w:r>
+        <w:rPr>
+          <w:rFonts w:ascii="Arial" w:hAnsi="Arial"/>
+          <w:sz w:val="20"/>
+        </w:rPr>
+        <w:t xml:space="preserve">. Fix: added </w:t>
+      </w:r>
+      <w:r>
+        <w:rPr>
+          <w:rFonts w:ascii="Consolas" w:hAnsi="Consolas"/>
+          <w:color w:val="444444"/>
+          <w:sz w:val="19"/>
+        </w:rPr>
+        <w:t>st.secrets["OPENAI_API_KEY"]</w:t>
+      </w:r>
+      <w:r>
+        <w:rPr>
+          <w:rFonts w:ascii="Arial" w:hAnsi="Arial"/>
+          <w:sz w:val="20"/>
+        </w:rPr>
+        <w:t xml:space="preserve"> as the second search location, between the env var and the local file lookups. Module remains importable from non-Streamlit contexts (pipelines, eval scripts) because the streamlit import is guarded by try/except.</w:t>
+      </w:r>
+    </w:p>
+    <w:p>
+      <w:pPr>
+        <w:pStyle w:val="ListNumber"/>
+      </w:pPr>
+      <w:r>
+        <w:rPr>
+          <w:rFonts w:ascii="Arial" w:hAnsi="Arial"/>
+          <w:b/>
+          <w:sz w:val="20"/>
+        </w:rPr>
+        <w:t>Redacted client errors.</w:t>
+      </w:r>
+      <w:r>
+        <w:rPr>
+          <w:rFonts w:ascii="Arial" w:hAnsi="Arial"/>
+          <w:sz w:val="20"/>
+        </w:rPr>
+        <w:t xml:space="preserve"> Streamlit Cloud redacts client-side error tracebacks for safety. The full traceback is available in *Manage app → Logs*. Documented in DEPLOY.md so anyone debugging future deploys knows where to look.</w:t>
+      </w:r>
+    </w:p>
+    <w:p>
+      <w:r>
+        <w:rPr>
+          <w:rFonts w:ascii="Arial" w:hAnsi="Arial"/>
+          <w:b/>
+          <w:sz w:val="20"/>
+        </w:rPr>
+        <w:t>What it produced</w:t>
+      </w:r>
+    </w:p>
+    <w:p>
+      <w:pPr>
+        <w:pStyle w:val="ListBullet"/>
+      </w:pPr>
+      <w:r>
+        <w:rPr>
+          <w:rFonts w:ascii="Arial" w:hAnsi="Arial"/>
+          <w:sz w:val="20"/>
+        </w:rPr>
+        <w:t>A live, public Streamlit app at &lt;https://sabercast-mlb.streamlit.app/&gt;</w:t>
+      </w:r>
+    </w:p>
+    <w:p>
+      <w:pPr>
+        <w:pStyle w:val="ListBullet"/>
+      </w:pPr>
+      <w:r>
+        <w:rPr>
+          <w:rFonts w:ascii="Arial" w:hAnsi="Arial"/>
+          <w:sz w:val="20"/>
+        </w:rPr>
+        <w:t xml:space="preserve">End-to-end Gap Filler run on the deployed instance: </w:t>
+      </w:r>
+      <w:r>
+        <w:rPr>
+          <w:rFonts w:ascii="Arial" w:hAnsi="Arial"/>
+          <w:b/>
+          <w:sz w:val="20"/>
+        </w:rPr>
+        <w:t>41.5 seconds, 1 gpt-4o + 11 gpt-4o-mini calls</w:t>
+      </w:r>
+      <w:r>
+        <w:rPr>
+          <w:rFonts w:ascii="Arial" w:hAnsi="Arial"/>
+          <w:sz w:val="20"/>
+        </w:rPr>
+        <w:t>. Roster summary, Plotly delta chart, gap cards, recommended targets (from the ChromaDB vectorstore), pricing comparables, and the highest-priority banner all render exactly as on local.</w:t>
+      </w:r>
+    </w:p>
+    <w:p>
+      <w:pPr>
+        <w:pStyle w:val="ListBullet"/>
+      </w:pPr>
+      <w:r>
+        <w:rPr>
+          <w:rFonts w:ascii="Arial" w:hAnsi="Arial"/>
+          <w:sz w:val="20"/>
+        </w:rPr>
+        <w:t xml:space="preserve">Two deployment-proof screenshots saved at </w:t>
+      </w:r>
+      <w:r>
+        <w:rPr>
+          <w:rFonts w:ascii="Consolas" w:hAnsi="Consolas"/>
+          <w:color w:val="444444"/>
+          <w:sz w:val="19"/>
+        </w:rPr>
+        <w:t>docs/checkpoint3/deployed_01_landing.png</w:t>
+      </w:r>
+      <w:r>
+        <w:rPr>
+          <w:rFonts w:ascii="Arial" w:hAnsi="Arial"/>
+          <w:sz w:val="20"/>
+        </w:rPr>
+        <w:t xml:space="preserve"> and </w:t>
+      </w:r>
+      <w:r>
+        <w:rPr>
+          <w:rFonts w:ascii="Consolas" w:hAnsi="Consolas"/>
+          <w:color w:val="444444"/>
+          <w:sz w:val="19"/>
+        </w:rPr>
+        <w:t>docs/checkpoint3/deployed_02_gap_filler_after_diagnose.png</w:t>
+      </w:r>
+      <w:r>
+        <w:rPr>
+          <w:rFonts w:ascii="Arial" w:hAnsi="Arial"/>
+          <w:sz w:val="20"/>
+        </w:rPr>
+        <w:t>.</w:t>
+      </w:r>
+    </w:p>
+    <w:p>
+      <w:pPr>
+        <w:pStyle w:val="ListBullet"/>
+      </w:pPr>
+      <w:r>
+        <w:rPr>
+          <w:rFonts w:ascii="Arial" w:hAnsi="Arial"/>
+          <w:sz w:val="20"/>
+        </w:rPr>
+        <w:t xml:space="preserve">Continuous deployment from the GitHub </w:t>
+      </w:r>
+      <w:r>
+        <w:rPr>
+          <w:rFonts w:ascii="Consolas" w:hAnsi="Consolas"/>
+          <w:color w:val="444444"/>
+          <w:sz w:val="19"/>
+        </w:rPr>
+        <w:t>main</w:t>
+      </w:r>
+      <w:r>
+        <w:rPr>
+          <w:rFonts w:ascii="Arial" w:hAnsi="Arial"/>
+          <w:sz w:val="20"/>
+        </w:rPr>
+        <w:t xml:space="preserve"> branch — every push redeploys in ~30 seconds.</w:t>
+      </w:r>
+    </w:p>
+    <w:p>
+      <w:pPr>
+        <w:pBdr>
+          <w:bottom w:val="single" w:sz="6" w:color="B0B0B0"/>
+        </w:pBdr>
+      </w:pPr>
+    </w:p>
     <w:sectPr>
       <w:pgSz w:w="12240" w:h="15840"/>
       <w:pgMar w:top="1440" w:right="1440" w:bottom="1440" w:left="1440" w:header="720" w:footer="720" w:gutter="0"/>

</xml_diff>

<commit_message>
Roster Builder tab functional + Entry 11 + doc refresh
Adds run_roster_builder_simple to core/orchestrator.py (one gpt-4o call
returning structured lineup + matchup analysis grounded in both teams'
aggregates and opponent OAA deltas). Replaces the placeholder
app/tabs/roster_builder.py with a working implementation: team + opponent
dropdowns, 9-slot lineup table, matchup advantages with leverage chips,
matchup risks with mitigations, reference-data expander, session cache.

Three-tab parity achieved. SEA vs HOU demo run: 5 seconds, one gpt-4o
call, produces a 9-Mariners lineup citing HOU 1B/2B OAA deficits as
advantages and CF/3B defense as risks.
</commit_message>
<xml_diff>
--- a/docs/Sabercast_Build_Log.docx
+++ b/docs/Sabercast_Build_Log.docx
@@ -5908,6 +5908,887 @@
         </w:pBdr>
       </w:pPr>
     </w:p>
+    <w:p>
+      <w:r>
+        <w:rPr>
+          <w:rFonts w:ascii="Arial" w:hAnsi="Arial"/>
+          <w:b/>
+          <w:color w:val="202020"/>
+          <w:sz w:val="30"/>
+        </w:rPr>
+        <w:t>Entry 11 — May 31 (Final build): Roster Builder tab functional — three-tab parity</w:t>
+      </w:r>
+    </w:p>
+    <w:p>
+      <w:r>
+        <w:rPr>
+          <w:rFonts w:ascii="Arial" w:hAnsi="Arial"/>
+          <w:b/>
+          <w:sz w:val="20"/>
+        </w:rPr>
+        <w:t>Goal:</w:t>
+      </w:r>
+      <w:r>
+        <w:rPr>
+          <w:rFonts w:ascii="Arial" w:hAnsi="Arial"/>
+          <w:sz w:val="20"/>
+        </w:rPr>
+        <w:t xml:space="preserve"> Replace the "in work" placeholder on the Roster Builder tab with a working implementation. Achieve three-tabs-functional parity so the Demo Day pitch becomes *"pick any team for any of three decision tasks — build a lineup, scout an opponent, fill gaps."*</w:t>
+      </w:r>
+    </w:p>
+    <w:p>
+      <w:r>
+        <w:rPr>
+          <w:rFonts w:ascii="Arial" w:hAnsi="Arial"/>
+          <w:b/>
+          <w:sz w:val="20"/>
+        </w:rPr>
+        <w:t>What was built</w:t>
+      </w:r>
+    </w:p>
+    <w:p>
+      <w:pPr>
+        <w:pStyle w:val="ListBullet"/>
+      </w:pPr>
+      <w:r>
+        <w:rPr>
+          <w:rFonts w:ascii="Arial" w:hAnsi="Arial"/>
+          <w:b/>
+          <w:sz w:val="20"/>
+        </w:rPr>
+        <w:t>`run_roster_builder_simple`</w:t>
+      </w:r>
+      <w:r>
+        <w:rPr>
+          <w:rFonts w:ascii="Arial" w:hAnsi="Arial"/>
+          <w:sz w:val="20"/>
+        </w:rPr>
+        <w:t xml:space="preserve"> in </w:t>
+      </w:r>
+      <w:r>
+        <w:rPr>
+          <w:rFonts w:ascii="Consolas" w:hAnsi="Consolas"/>
+          <w:color w:val="444444"/>
+          <w:sz w:val="19"/>
+        </w:rPr>
+        <w:t>core/orchestrator.py</w:t>
+      </w:r>
+      <w:r>
+        <w:rPr>
+          <w:rFonts w:ascii="Arial" w:hAnsi="Arial"/>
+          <w:sz w:val="20"/>
+        </w:rPr>
+        <w:t xml:space="preserve"> — the third orchestrator, paralleling </w:t>
+      </w:r>
+      <w:r>
+        <w:rPr>
+          <w:rFonts w:ascii="Consolas" w:hAnsi="Consolas"/>
+          <w:color w:val="444444"/>
+          <w:sz w:val="19"/>
+        </w:rPr>
+        <w:t>run_gap_filler_simple</w:t>
+      </w:r>
+      <w:r>
+        <w:rPr>
+          <w:rFonts w:ascii="Arial" w:hAnsi="Arial"/>
+          <w:sz w:val="20"/>
+        </w:rPr>
+        <w:t xml:space="preserve"> and </w:t>
+      </w:r>
+      <w:r>
+        <w:rPr>
+          <w:rFonts w:ascii="Consolas" w:hAnsi="Consolas"/>
+          <w:color w:val="444444"/>
+          <w:sz w:val="19"/>
+        </w:rPr>
+        <w:t>run_opponent_scouting_simple</w:t>
+      </w:r>
+      <w:r>
+        <w:rPr>
+          <w:rFonts w:ascii="Arial" w:hAnsi="Arial"/>
+          <w:sz w:val="20"/>
+        </w:rPr>
+        <w:t xml:space="preserve">. Takes </w:t>
+      </w:r>
+      <w:r>
+        <w:rPr>
+          <w:rFonts w:ascii="Consolas" w:hAnsi="Consolas"/>
+          <w:color w:val="444444"/>
+          <w:sz w:val="19"/>
+        </w:rPr>
+        <w:t>(team_abbr, opponent_abbr, max_budget, evaluation_year)</w:t>
+      </w:r>
+      <w:r>
+        <w:rPr>
+          <w:rFonts w:ascii="Arial" w:hAnsi="Arial"/>
+          <w:sz w:val="20"/>
+        </w:rPr>
+        <w:t>. Aggregates:</w:t>
+      </w:r>
+    </w:p>
+    <w:p>
+      <w:pPr>
+        <w:pStyle w:val="ListBullet"/>
+      </w:pPr>
+      <w:r>
+        <w:rPr>
+          <w:rFonts w:ascii="Arial" w:hAnsi="Arial"/>
+          <w:sz w:val="20"/>
+        </w:rPr>
+        <w:t>Team's top 12 hitters (PA ≥ 200, by 2024 OPS)</w:t>
+      </w:r>
+    </w:p>
+    <w:p>
+      <w:pPr>
+        <w:pStyle w:val="ListBullet"/>
+      </w:pPr>
+      <w:r>
+        <w:rPr>
+          <w:rFonts w:ascii="Arial" w:hAnsi="Arial"/>
+          <w:sz w:val="20"/>
+        </w:rPr>
+        <w:t>Opponent's top 5 pitchers (IP ≥ 30, by 2024 ERA — mix of starters and relievers)</w:t>
+      </w:r>
+    </w:p>
+    <w:p>
+      <w:pPr>
+        <w:pStyle w:val="ListBullet"/>
+      </w:pPr>
+      <w:r>
+        <w:rPr>
+          <w:rFonts w:ascii="Arial" w:hAnsi="Arial"/>
+          <w:sz w:val="20"/>
+        </w:rPr>
+        <w:t>Opponent's per-position defensive deltas (Statcast OAA + catcher pop time + sprint speed), if available</w:t>
+      </w:r>
+    </w:p>
+    <w:p>
+      <w:r>
+        <w:rPr>
+          <w:rFonts w:ascii="Arial" w:hAnsi="Arial"/>
+          <w:sz w:val="20"/>
+        </w:rPr>
+        <w:t xml:space="preserve">  Makes one </w:t>
+      </w:r>
+      <w:r>
+        <w:rPr>
+          <w:rFonts w:ascii="Consolas" w:hAnsi="Consolas"/>
+          <w:color w:val="444444"/>
+          <w:sz w:val="19"/>
+        </w:rPr>
+        <w:t>gpt-4o</w:t>
+      </w:r>
+      <w:r>
+        <w:rPr>
+          <w:rFonts w:ascii="Arial" w:hAnsi="Arial"/>
+          <w:sz w:val="20"/>
+        </w:rPr>
+        <w:t xml:space="preserve"> call (</w:t>
+      </w:r>
+      <w:r>
+        <w:rPr>
+          <w:rFonts w:ascii="Consolas" w:hAnsi="Consolas"/>
+          <w:color w:val="444444"/>
+          <w:sz w:val="19"/>
+        </w:rPr>
+        <w:t>temperature=0</w:t>
+      </w:r>
+      <w:r>
+        <w:rPr>
+          <w:rFonts w:ascii="Arial" w:hAnsi="Arial"/>
+          <w:sz w:val="20"/>
+        </w:rPr>
+        <w:t xml:space="preserve">, </w:t>
+      </w:r>
+      <w:r>
+        <w:rPr>
+          <w:rFonts w:ascii="Consolas" w:hAnsi="Consolas"/>
+          <w:color w:val="444444"/>
+          <w:sz w:val="19"/>
+        </w:rPr>
+        <w:t>seed=42</w:t>
+      </w:r>
+      <w:r>
+        <w:rPr>
+          <w:rFonts w:ascii="Arial" w:hAnsi="Arial"/>
+          <w:sz w:val="20"/>
+        </w:rPr>
+        <w:t xml:space="preserve">) using the new </w:t>
+      </w:r>
+      <w:r>
+        <w:rPr>
+          <w:rFonts w:ascii="Consolas" w:hAnsi="Consolas"/>
+          <w:color w:val="444444"/>
+          <w:sz w:val="19"/>
+        </w:rPr>
+        <w:t>ROSTER_BUILDER_SYSTEM</w:t>
+      </w:r>
+      <w:r>
+        <w:rPr>
+          <w:rFonts w:ascii="Arial" w:hAnsi="Arial"/>
+          <w:sz w:val="20"/>
+        </w:rPr>
+        <w:t xml:space="preserve"> prompt that returns structured JSON: a 9-slot lineup, three matchup advantages, two matchup risks, and a 2–3 sentence strategic summary.</w:t>
+      </w:r>
+    </w:p>
+    <w:p>
+      <w:pPr>
+        <w:pStyle w:val="ListBullet"/>
+      </w:pPr>
+      <w:r>
+        <w:rPr>
+          <w:rFonts w:ascii="Arial" w:hAnsi="Arial"/>
+          <w:b/>
+          <w:sz w:val="20"/>
+        </w:rPr>
+        <w:t>`build_roster_llm`</w:t>
+      </w:r>
+      <w:r>
+        <w:rPr>
+          <w:rFonts w:ascii="Arial" w:hAnsi="Arial"/>
+          <w:sz w:val="20"/>
+        </w:rPr>
+        <w:t xml:space="preserve"> helper for the LLM call, mirroring the pattern used elsewhere.</w:t>
+      </w:r>
+    </w:p>
+    <w:p>
+      <w:pPr>
+        <w:pStyle w:val="ListBullet"/>
+      </w:pPr>
+      <w:r>
+        <w:rPr>
+          <w:rFonts w:ascii="Arial" w:hAnsi="Arial"/>
+          <w:b/>
+          <w:sz w:val="20"/>
+        </w:rPr>
+        <w:t>`app/tabs/roster_builder.py`</w:t>
+      </w:r>
+      <w:r>
+        <w:rPr>
+          <w:rFonts w:ascii="Arial" w:hAnsi="Arial"/>
+          <w:sz w:val="20"/>
+        </w:rPr>
+        <w:t xml:space="preserve"> — full rewrite of the placeholder:</w:t>
+      </w:r>
+    </w:p>
+    <w:p>
+      <w:pPr>
+        <w:pStyle w:val="ListBullet"/>
+      </w:pPr>
+      <w:r>
+        <w:rPr>
+          <w:rFonts w:ascii="Arial" w:hAnsi="Arial"/>
+          <w:sz w:val="20"/>
+        </w:rPr>
+        <w:t>Team + opponent + payroll inputs (the opponent selector automatically excludes the chosen team)</w:t>
+      </w:r>
+    </w:p>
+    <w:p>
+      <w:pPr>
+        <w:pStyle w:val="ListBullet"/>
+      </w:pPr>
+      <w:r>
+        <w:rPr>
+          <w:rFonts w:ascii="Arial" w:hAnsi="Arial"/>
+          <w:sz w:val="20"/>
+        </w:rPr>
+        <w:t>Session-scoped cache so repeat queries for the same (team, opponent) tuple return instantly</w:t>
+      </w:r>
+    </w:p>
+    <w:p>
+      <w:pPr>
+        <w:pStyle w:val="ListBullet"/>
+      </w:pPr>
+      <w:r>
+        <w:rPr>
+          <w:rFonts w:ascii="Arial" w:hAnsi="Arial"/>
+          <w:sz w:val="20"/>
+        </w:rPr>
+        <w:t>Multi-step status widget driven by the same progress callback pattern</w:t>
+      </w:r>
+    </w:p>
+    <w:p>
+      <w:pPr>
+        <w:pStyle w:val="ListBullet"/>
+      </w:pPr>
+      <w:r>
+        <w:rPr>
+          <w:rFonts w:ascii="Arial" w:hAnsi="Arial"/>
+          <w:sz w:val="20"/>
+        </w:rPr>
+        <w:t>Strategy narrative section</w:t>
+      </w:r>
+    </w:p>
+    <w:p>
+      <w:pPr>
+        <w:pStyle w:val="ListBullet"/>
+      </w:pPr>
+      <w:r>
+        <w:rPr>
+          <w:rFonts w:ascii="Arial" w:hAnsi="Arial"/>
+          <w:sz w:val="20"/>
+        </w:rPr>
+        <w:t>Recommended starting-lineup table (Order / Position / Player / Rationale)</w:t>
+      </w:r>
+    </w:p>
+    <w:p>
+      <w:pPr>
+        <w:pStyle w:val="ListBullet"/>
+      </w:pPr>
+      <w:r>
+        <w:rPr>
+          <w:rFonts w:ascii="Arial" w:hAnsi="Arial"/>
+          <w:sz w:val="20"/>
+        </w:rPr>
+        <w:t>Two-column matchup-analysis layout: *Advantages to lean into* (with HIGH/MEDIUM/LOW leverage chips) and *Risks to mitigate*</w:t>
+      </w:r>
+    </w:p>
+    <w:p>
+      <w:pPr>
+        <w:pStyle w:val="ListBullet"/>
+      </w:pPr>
+      <w:r>
+        <w:rPr>
+          <w:rFonts w:ascii="Arial" w:hAnsi="Arial"/>
+          <w:sz w:val="20"/>
+        </w:rPr>
+        <w:t>"Reference data fed to the LLM" expander surfacing the raw top-hitter, top-pitcher, and opponent-defense tables so users can audit the LLM's reasoning against ground truth</w:t>
+      </w:r>
+    </w:p>
+    <w:p>
+      <w:pPr>
+        <w:pStyle w:val="ListBullet"/>
+      </w:pPr>
+      <w:r>
+        <w:rPr>
+          <w:rFonts w:ascii="Arial" w:hAnsi="Arial"/>
+          <w:b/>
+          <w:sz w:val="20"/>
+        </w:rPr>
+        <w:t>`demo/capture_roster_builder.py`</w:t>
+      </w:r>
+      <w:r>
+        <w:rPr>
+          <w:rFonts w:ascii="Arial" w:hAnsi="Arial"/>
+          <w:sz w:val="20"/>
+        </w:rPr>
+        <w:t xml:space="preserve"> — captures two new screenshots: tab top (inputs + narrative + lineup top) and matchup analysis section (full lineup + advantages + risks).</w:t>
+      </w:r>
+    </w:p>
+    <w:p>
+      <w:r>
+        <w:rPr>
+          <w:rFonts w:ascii="Arial" w:hAnsi="Arial"/>
+          <w:b/>
+          <w:sz w:val="20"/>
+        </w:rPr>
+        <w:t>What it produced — SEA vs HOU demo run</w:t>
+      </w:r>
+    </w:p>
+    <w:p>
+      <w:pPr>
+        <w:pStyle w:val="ListBullet"/>
+      </w:pPr>
+      <w:r>
+        <w:rPr>
+          <w:rFonts w:ascii="Arial" w:hAnsi="Arial"/>
+          <w:sz w:val="20"/>
+        </w:rPr>
+        <w:t>5.07 seconds, one gpt-4o call</w:t>
+      </w:r>
+    </w:p>
+    <w:p>
+      <w:pPr>
+        <w:pStyle w:val="ListBullet"/>
+      </w:pPr>
+      <w:r>
+        <w:rPr>
+          <w:rFonts w:ascii="Arial" w:hAnsi="Arial"/>
+          <w:b/>
+          <w:sz w:val="20"/>
+        </w:rPr>
+        <w:t>Narrative:</w:t>
+      </w:r>
+      <w:r>
+        <w:rPr>
+          <w:rFonts w:ascii="Arial" w:hAnsi="Arial"/>
+          <w:sz w:val="20"/>
+        </w:rPr>
+        <w:t xml:space="preserve"> *"Seattle should focus on exploiting Houston's defensive weaknesses at first and second base while being cautious of their strong center field and third base defense. Prioritizing contact hitters and speed will be key against Houston's strong pitching staff."*</w:t>
+      </w:r>
+    </w:p>
+    <w:p>
+      <w:pPr>
+        <w:pStyle w:val="ListBullet"/>
+      </w:pPr>
+      <w:r>
+        <w:rPr>
+          <w:rFonts w:ascii="Arial" w:hAnsi="Arial"/>
+          <w:b/>
+          <w:sz w:val="20"/>
+        </w:rPr>
+        <w:t>Lineup</w:t>
+      </w:r>
+      <w:r>
+        <w:rPr>
+          <w:rFonts w:ascii="Arial" w:hAnsi="Arial"/>
+          <w:sz w:val="20"/>
+        </w:rPr>
+        <w:t xml:space="preserve"> (9 actual Mariners 2024 players):</w:t>
+      </w:r>
+    </w:p>
+    <w:p>
+      <w:pPr>
+        <w:pStyle w:val="ListNumber"/>
+      </w:pPr>
+      <w:r>
+        <w:rPr>
+          <w:rFonts w:ascii="Arial" w:hAnsi="Arial"/>
+          <w:sz w:val="20"/>
+        </w:rPr>
+        <w:t>CF Julio Rodríguez — *Leadoff with speed and decent OBP*</w:t>
+      </w:r>
+    </w:p>
+    <w:p>
+      <w:pPr>
+        <w:pStyle w:val="ListNumber"/>
+      </w:pPr>
+      <w:r>
+        <w:rPr>
+          <w:rFonts w:ascii="Arial" w:hAnsi="Arial"/>
+          <w:sz w:val="20"/>
+        </w:rPr>
+        <w:t>RF Víctor Robles — *High OPS and contact ability*</w:t>
+      </w:r>
+    </w:p>
+    <w:p>
+      <w:pPr>
+        <w:pStyle w:val="ListNumber"/>
+      </w:pPr>
+      <w:r>
+        <w:rPr>
+          <w:rFonts w:ascii="Arial" w:hAnsi="Arial"/>
+          <w:sz w:val="20"/>
+        </w:rPr>
+        <w:t>LF Luke Raley — *Power threat in the heart of the order*</w:t>
+      </w:r>
+    </w:p>
+    <w:p>
+      <w:pPr>
+        <w:pStyle w:val="ListNumber"/>
+      </w:pPr>
+      <w:r>
+        <w:rPr>
+          <w:rFonts w:ascii="Arial" w:hAnsi="Arial"/>
+          <w:sz w:val="20"/>
+        </w:rPr>
+        <w:t>C  Cal Raleigh — *Power bat in cleanup spot*</w:t>
+      </w:r>
+    </w:p>
+    <w:p>
+      <w:pPr>
+        <w:pStyle w:val="ListNumber"/>
+      </w:pPr>
+      <w:r>
+        <w:rPr>
+          <w:rFonts w:ascii="Arial" w:hAnsi="Arial"/>
+          <w:sz w:val="20"/>
+        </w:rPr>
+        <w:t>3B Justin Turner — *Veteran presence and OBP skills*</w:t>
+      </w:r>
+    </w:p>
+    <w:p>
+      <w:pPr>
+        <w:pStyle w:val="ListNumber"/>
+      </w:pPr>
+      <w:r>
+        <w:rPr>
+          <w:rFonts w:ascii="Arial" w:hAnsi="Arial"/>
+          <w:sz w:val="20"/>
+        </w:rPr>
+        <w:t>DH Randy Arozarena — *Power and speed combination*</w:t>
+      </w:r>
+    </w:p>
+    <w:p>
+      <w:pPr>
+        <w:pStyle w:val="ListNumber"/>
+      </w:pPr>
+      <w:r>
+        <w:rPr>
+          <w:rFonts w:ascii="Arial" w:hAnsi="Arial"/>
+          <w:sz w:val="20"/>
+        </w:rPr>
+        <w:t>1B Ty France — *Exploit weak 1B defense*</w:t>
+      </w:r>
+    </w:p>
+    <w:p>
+      <w:pPr>
+        <w:pStyle w:val="ListNumber"/>
+      </w:pPr>
+      <w:r>
+        <w:rPr>
+          <w:rFonts w:ascii="Arial" w:hAnsi="Arial"/>
+          <w:sz w:val="20"/>
+        </w:rPr>
+        <w:t>2B Jorge Polanco — *Exploit weak 2B defense*</w:t>
+      </w:r>
+    </w:p>
+    <w:p>
+      <w:pPr>
+        <w:pStyle w:val="ListNumber"/>
+      </w:pPr>
+      <w:r>
+        <w:rPr>
+          <w:rFonts w:ascii="Arial" w:hAnsi="Arial"/>
+          <w:sz w:val="20"/>
+        </w:rPr>
+        <w:t>SS J.P. Crawford — *Solid defense and OBP at the bottom*</w:t>
+      </w:r>
+    </w:p>
+    <w:p>
+      <w:pPr>
+        <w:pStyle w:val="ListBullet"/>
+      </w:pPr>
+      <w:r>
+        <w:rPr>
+          <w:rFonts w:ascii="Arial" w:hAnsi="Arial"/>
+          <w:b/>
+          <w:sz w:val="20"/>
+        </w:rPr>
+        <w:t>Advantages:</w:t>
+      </w:r>
+      <w:r>
+        <w:rPr>
+          <w:rFonts w:ascii="Arial" w:hAnsi="Arial"/>
+          <w:sz w:val="20"/>
+        </w:rPr>
+        <w:t xml:space="preserve"> opposing 1B defensive weakness (HIGH, citing HOU 1B OAA delta −5.53), opposing 2B defensive weakness (HIGH, citing −11.13 OAA delta), opposing LHP weakness vs RHB (MEDIUM, citing Framber Valdez ERA/WHIP)</w:t>
+      </w:r>
+    </w:p>
+    <w:p>
+      <w:pPr>
+        <w:pStyle w:val="ListBullet"/>
+      </w:pPr>
+      <w:r>
+        <w:rPr>
+          <w:rFonts w:ascii="Arial" w:hAnsi="Arial"/>
+          <w:b/>
+          <w:sz w:val="20"/>
+        </w:rPr>
+        <w:t>Risks:</w:t>
+      </w:r>
+      <w:r>
+        <w:rPr>
+          <w:rFonts w:ascii="Arial" w:hAnsi="Arial"/>
+          <w:sz w:val="20"/>
+        </w:rPr>
+        <w:t xml:space="preserve"> strong CF defense (*"Avoid hitting fly balls to center field; focus on line drives and ground balls"*), strong 3B defense (*"Encourage hitters to pull the ball away from third base"*)</w:t>
+      </w:r>
+    </w:p>
+    <w:p>
+      <w:r>
+        <w:rPr>
+          <w:rFonts w:ascii="Arial" w:hAnsi="Arial"/>
+          <w:b/>
+          <w:sz w:val="20"/>
+        </w:rPr>
+        <w:t>State of the app after this entry</w:t>
+      </w:r>
+    </w:p>
+    <w:p>
+      <w:r>
+        <w:rPr>
+          <w:rFonts w:ascii="Arial" w:hAnsi="Arial"/>
+          <w:sz w:val="20"/>
+        </w:rPr>
+        <w:t>Three tabs, all functional, all powered by structured-output LLM calls grounded in 2024 stats + defensive metrics:</w:t>
+      </w:r>
+    </w:p>
+    <w:tbl>
+      <w:tblPr>
+        <w:tblW w:type="auto" w:w="0"/>
+        <w:tblLayout w:type="fixed"/>
+        <w:tblLook w:firstColumn="1" w:firstRow="1" w:lastColumn="0" w:lastRow="0" w:noHBand="0" w:noVBand="1" w:val="04A0"/>
+      </w:tblPr>
+      <w:tblGrid>
+        <w:gridCol w:w="2340"/>
+        <w:gridCol w:w="2340"/>
+        <w:gridCol w:w="2340"/>
+        <w:gridCol w:w="2340"/>
+      </w:tblGrid>
+      <w:tr>
+        <w:tc>
+          <w:tcPr>
+            <w:tcW w:type="dxa" w:w="2304"/>
+            <w:shd w:val="clear" w:color="auto" w:fill="EEEEEE"/>
+          </w:tcPr>
+          <w:p>
+            <w:r/>
+            <w:r>
+              <w:rPr>
+                <w:rFonts w:ascii="Arial" w:hAnsi="Arial"/>
+                <w:b/>
+                <w:sz w:val="19"/>
+              </w:rPr>
+              <w:t>Tab</w:t>
+            </w:r>
+          </w:p>
+        </w:tc>
+        <w:tc>
+          <w:tcPr>
+            <w:tcW w:type="dxa" w:w="2304"/>
+            <w:shd w:val="clear" w:color="auto" w:fill="EEEEEE"/>
+          </w:tcPr>
+          <w:p>
+            <w:r/>
+            <w:r>
+              <w:rPr>
+                <w:rFonts w:ascii="Arial" w:hAnsi="Arial"/>
+                <w:b/>
+                <w:sz w:val="19"/>
+              </w:rPr>
+              <w:t>Purpose</w:t>
+            </w:r>
+          </w:p>
+        </w:tc>
+        <w:tc>
+          <w:tcPr>
+            <w:tcW w:type="dxa" w:w="2304"/>
+            <w:shd w:val="clear" w:color="auto" w:fill="EEEEEE"/>
+          </w:tcPr>
+          <w:p>
+            <w:r/>
+            <w:r>
+              <w:rPr>
+                <w:rFonts w:ascii="Arial" w:hAnsi="Arial"/>
+                <w:b/>
+                <w:sz w:val="19"/>
+              </w:rPr>
+              <w:t>LLM cost per run</w:t>
+            </w:r>
+          </w:p>
+        </w:tc>
+        <w:tc>
+          <w:tcPr>
+            <w:tcW w:type="dxa" w:w="2304"/>
+            <w:shd w:val="clear" w:color="auto" w:fill="EEEEEE"/>
+          </w:tcPr>
+          <w:p>
+            <w:r/>
+            <w:r>
+              <w:rPr>
+                <w:rFonts w:ascii="Arial" w:hAnsi="Arial"/>
+                <w:b/>
+                <w:sz w:val="19"/>
+              </w:rPr>
+              <w:t>Wall time</w:t>
+            </w:r>
+          </w:p>
+        </w:tc>
+      </w:tr>
+      <w:tr>
+        <w:tc>
+          <w:tcPr>
+            <w:tcW w:type="dxa" w:w="2304"/>
+          </w:tcPr>
+          <w:p>
+            <w:r/>
+            <w:r>
+              <w:rPr>
+                <w:rFonts w:ascii="Arial" w:hAnsi="Arial"/>
+                <w:sz w:val="19"/>
+              </w:rPr>
+              <w:t>Roster Builder</w:t>
+            </w:r>
+          </w:p>
+        </w:tc>
+        <w:tc>
+          <w:tcPr>
+            <w:tcW w:type="dxa" w:w="2304"/>
+          </w:tcPr>
+          <w:p>
+            <w:r/>
+            <w:r>
+              <w:rPr>
+                <w:rFonts w:ascii="Arial" w:hAnsi="Arial"/>
+                <w:sz w:val="19"/>
+              </w:rPr>
+              <w:t>Build a lineup vs a specific opponent</w:t>
+            </w:r>
+          </w:p>
+        </w:tc>
+        <w:tc>
+          <w:tcPr>
+            <w:tcW w:type="dxa" w:w="2304"/>
+          </w:tcPr>
+          <w:p>
+            <w:r/>
+            <w:r>
+              <w:rPr>
+                <w:rFonts w:ascii="Arial" w:hAnsi="Arial"/>
+                <w:sz w:val="19"/>
+              </w:rPr>
+              <w:t>1 gpt-4o call</w:t>
+            </w:r>
+          </w:p>
+        </w:tc>
+        <w:tc>
+          <w:tcPr>
+            <w:tcW w:type="dxa" w:w="2304"/>
+          </w:tcPr>
+          <w:p>
+            <w:r/>
+            <w:r>
+              <w:rPr>
+                <w:rFonts w:ascii="Arial" w:hAnsi="Arial"/>
+                <w:sz w:val="19"/>
+              </w:rPr>
+              <w:t>~5 s</w:t>
+            </w:r>
+          </w:p>
+        </w:tc>
+      </w:tr>
+      <w:tr>
+        <w:tc>
+          <w:tcPr>
+            <w:tcW w:type="dxa" w:w="2304"/>
+          </w:tcPr>
+          <w:p>
+            <w:r/>
+            <w:r>
+              <w:rPr>
+                <w:rFonts w:ascii="Arial" w:hAnsi="Arial"/>
+                <w:sz w:val="19"/>
+              </w:rPr>
+              <w:t>Opponent Scouting</w:t>
+            </w:r>
+          </w:p>
+        </w:tc>
+        <w:tc>
+          <w:tcPr>
+            <w:tcW w:type="dxa" w:w="2304"/>
+          </w:tcPr>
+          <w:p>
+            <w:r/>
+            <w:r>
+              <w:rPr>
+                <w:rFonts w:ascii="Arial" w:hAnsi="Arial"/>
+                <w:sz w:val="19"/>
+              </w:rPr>
+              <w:t>Identify exploitable weaknesses + strategy</w:t>
+            </w:r>
+          </w:p>
+        </w:tc>
+        <w:tc>
+          <w:tcPr>
+            <w:tcW w:type="dxa" w:w="2304"/>
+          </w:tcPr>
+          <w:p>
+            <w:r/>
+            <w:r>
+              <w:rPr>
+                <w:rFonts w:ascii="Arial" w:hAnsi="Arial"/>
+                <w:sz w:val="19"/>
+              </w:rPr>
+              <w:t>1 gpt-4o call</w:t>
+            </w:r>
+          </w:p>
+        </w:tc>
+        <w:tc>
+          <w:tcPr>
+            <w:tcW w:type="dxa" w:w="2304"/>
+          </w:tcPr>
+          <w:p>
+            <w:r/>
+            <w:r>
+              <w:rPr>
+                <w:rFonts w:ascii="Arial" w:hAnsi="Arial"/>
+                <w:sz w:val="19"/>
+              </w:rPr>
+              <w:t>~5 s</w:t>
+            </w:r>
+          </w:p>
+        </w:tc>
+      </w:tr>
+      <w:tr>
+        <w:tc>
+          <w:tcPr>
+            <w:tcW w:type="dxa" w:w="2304"/>
+          </w:tcPr>
+          <w:p>
+            <w:r/>
+            <w:r>
+              <w:rPr>
+                <w:rFonts w:ascii="Arial" w:hAnsi="Arial"/>
+                <w:sz w:val="19"/>
+              </w:rPr>
+              <w:t>Gap Filler</w:t>
+            </w:r>
+          </w:p>
+        </w:tc>
+        <w:tc>
+          <w:tcPr>
+            <w:tcW w:type="dxa" w:w="2304"/>
+          </w:tcPr>
+          <w:p>
+            <w:r/>
+            <w:r>
+              <w:rPr>
+                <w:rFonts w:ascii="Arial" w:hAnsi="Arial"/>
+                <w:sz w:val="19"/>
+              </w:rPr>
+              <w:t>Diagnose gaps + recommend targets + price</w:t>
+            </w:r>
+          </w:p>
+        </w:tc>
+        <w:tc>
+          <w:tcPr>
+            <w:tcW w:type="dxa" w:w="2304"/>
+          </w:tcPr>
+          <w:p>
+            <w:r/>
+            <w:r>
+              <w:rPr>
+                <w:rFonts w:ascii="Arial" w:hAnsi="Arial"/>
+                <w:sz w:val="19"/>
+              </w:rPr>
+              <w:t>1 gpt-4o + ~11 gpt-4o-mini</w:t>
+            </w:r>
+          </w:p>
+        </w:tc>
+        <w:tc>
+          <w:tcPr>
+            <w:tcW w:type="dxa" w:w="2304"/>
+          </w:tcPr>
+          <w:p>
+            <w:r/>
+            <w:r>
+              <w:rPr>
+                <w:rFonts w:ascii="Arial" w:hAnsi="Arial"/>
+                <w:sz w:val="19"/>
+              </w:rPr>
+              <w:t>~40 s</w:t>
+            </w:r>
+          </w:p>
+        </w:tc>
+      </w:tr>
+    </w:tbl>
+    <w:p>
+      <w:r>
+        <w:rPr>
+          <w:rFonts w:ascii="Arial" w:hAnsi="Arial"/>
+          <w:sz w:val="20"/>
+        </w:rPr>
+        <w:t>Demo Day narrative: *"Pick any of 30 teams. Pick an opponent. Pick a payroll. Sabercast supports three decision tasks in one app, each one running real-time grounded LLM reasoning over the same underlying Statcast + bref + Spotrac data pipeline."*</w:t>
+      </w:r>
+    </w:p>
+    <w:p>
+      <w:pPr>
+        <w:pBdr>
+          <w:bottom w:val="single" w:sz="6" w:color="B0B0B0"/>
+        </w:pBdr>
+      </w:pPr>
+    </w:p>
     <w:sectPr>
       <w:pgSz w:w="12240" w:h="15840"/>
       <w:pgMar w:top="1440" w:right="1440" w:bottom="1440" w:left="1440" w:header="720" w:footer="720" w:gutter="0"/>

</xml_diff>

<commit_message>
Roster Builder design correction: drop payroll input
Day-to-day lineup construction uses the existing roster as is. Payroll
belongs only on the Gap Filler tab where free-agent acquisitions are
being evaluated. Removed the input from the UI and dropped max_budget
from run_roster_builder_simple's signature. Entry 12 appended to
BUILD_LOG.md documenting the correction.
</commit_message>
<xml_diff>
--- a/docs/Sabercast_Build_Log.docx
+++ b/docs/Sabercast_Build_Log.docx
@@ -6789,6 +6789,315 @@
         </w:pBdr>
       </w:pPr>
     </w:p>
+    <w:p>
+      <w:r>
+        <w:rPr>
+          <w:rFonts w:ascii="Arial" w:hAnsi="Arial"/>
+          <w:b/>
+          <w:color w:val="202020"/>
+          <w:sz w:val="30"/>
+        </w:rPr>
+        <w:t>Entry 12 — May 31 (Final build): Roster Builder design correction — drop payroll input</w:t>
+      </w:r>
+    </w:p>
+    <w:p>
+      <w:r>
+        <w:rPr>
+          <w:rFonts w:ascii="Arial" w:hAnsi="Arial"/>
+          <w:b/>
+          <w:sz w:val="20"/>
+        </w:rPr>
+        <w:t>Goal:</w:t>
+      </w:r>
+      <w:r>
+        <w:rPr>
+          <w:rFonts w:ascii="Arial" w:hAnsi="Arial"/>
+          <w:sz w:val="20"/>
+        </w:rPr>
+        <w:t xml:space="preserve"> Remove the max-payroll input from the Roster Builder tab. Day-to-day lineup construction uses the existing roster as is; payroll only matters on the Gap Filler tab where free-agent acquisitions are being evaluated. Mixing the two confuses what the tab is for.</w:t>
+      </w:r>
+    </w:p>
+    <w:p>
+      <w:r>
+        <w:rPr>
+          <w:rFonts w:ascii="Arial" w:hAnsi="Arial"/>
+          <w:b/>
+          <w:sz w:val="20"/>
+        </w:rPr>
+        <w:t>What changed</w:t>
+      </w:r>
+    </w:p>
+    <w:p>
+      <w:pPr>
+        <w:pStyle w:val="ListBullet"/>
+      </w:pPr>
+      <w:r>
+        <w:rPr>
+          <w:rFonts w:ascii="Arial" w:hAnsi="Arial"/>
+          <w:sz w:val="20"/>
+        </w:rPr>
+        <w:t xml:space="preserve">Removed the </w:t>
+      </w:r>
+      <w:r>
+        <w:rPr>
+          <w:rFonts w:ascii="Consolas" w:hAnsi="Consolas"/>
+          <w:color w:val="444444"/>
+          <w:sz w:val="19"/>
+        </w:rPr>
+        <w:t>Max payroll for 2025</w:t>
+      </w:r>
+      <w:r>
+        <w:rPr>
+          <w:rFonts w:ascii="Arial" w:hAnsi="Arial"/>
+          <w:sz w:val="20"/>
+        </w:rPr>
+        <w:t xml:space="preserve"> </w:t>
+      </w:r>
+      <w:r>
+        <w:rPr>
+          <w:rFonts w:ascii="Consolas" w:hAnsi="Consolas"/>
+          <w:color w:val="444444"/>
+          <w:sz w:val="19"/>
+        </w:rPr>
+        <w:t>st.number_input</w:t>
+      </w:r>
+      <w:r>
+        <w:rPr>
+          <w:rFonts w:ascii="Arial" w:hAnsi="Arial"/>
+          <w:sz w:val="20"/>
+        </w:rPr>
+        <w:t xml:space="preserve"> from </w:t>
+      </w:r>
+      <w:r>
+        <w:rPr>
+          <w:rFonts w:ascii="Consolas" w:hAnsi="Consolas"/>
+          <w:color w:val="444444"/>
+          <w:sz w:val="19"/>
+        </w:rPr>
+        <w:t>app/tabs/roster_builder.py</w:t>
+      </w:r>
+      <w:r>
+        <w:rPr>
+          <w:rFonts w:ascii="Arial" w:hAnsi="Arial"/>
+          <w:sz w:val="20"/>
+        </w:rPr>
+        <w:t>. The third column now shows the evaluation-year label ("end of 2024 season") instead.</w:t>
+      </w:r>
+    </w:p>
+    <w:p>
+      <w:pPr>
+        <w:pStyle w:val="ListBullet"/>
+      </w:pPr>
+      <w:r>
+        <w:rPr>
+          <w:rFonts w:ascii="Arial" w:hAnsi="Arial"/>
+          <w:sz w:val="20"/>
+        </w:rPr>
+        <w:t xml:space="preserve">Dropped </w:t>
+      </w:r>
+      <w:r>
+        <w:rPr>
+          <w:rFonts w:ascii="Consolas" w:hAnsi="Consolas"/>
+          <w:color w:val="444444"/>
+          <w:sz w:val="19"/>
+        </w:rPr>
+        <w:t>max_budget</w:t>
+      </w:r>
+      <w:r>
+        <w:rPr>
+          <w:rFonts w:ascii="Arial" w:hAnsi="Arial"/>
+          <w:sz w:val="20"/>
+        </w:rPr>
+        <w:t xml:space="preserve"> from </w:t>
+      </w:r>
+      <w:r>
+        <w:rPr>
+          <w:rFonts w:ascii="Consolas" w:hAnsi="Consolas"/>
+          <w:color w:val="444444"/>
+          <w:sz w:val="19"/>
+        </w:rPr>
+        <w:t>run_roster_builder_simple</w:t>
+      </w:r>
+      <w:r>
+        <w:rPr>
+          <w:rFonts w:ascii="Arial" w:hAnsi="Arial"/>
+          <w:sz w:val="20"/>
+        </w:rPr>
+        <w:t xml:space="preserve">'s signature in </w:t>
+      </w:r>
+      <w:r>
+        <w:rPr>
+          <w:rFonts w:ascii="Consolas" w:hAnsi="Consolas"/>
+          <w:color w:val="444444"/>
+          <w:sz w:val="19"/>
+        </w:rPr>
+        <w:t>core/orchestrator.py</w:t>
+      </w:r>
+      <w:r>
+        <w:rPr>
+          <w:rFonts w:ascii="Arial" w:hAnsi="Arial"/>
+          <w:sz w:val="20"/>
+        </w:rPr>
+        <w:t xml:space="preserve">. Also removed the unused </w:t>
+      </w:r>
+      <w:r>
+        <w:rPr>
+          <w:rFonts w:ascii="Consolas" w:hAnsi="Consolas"/>
+          <w:color w:val="444444"/>
+          <w:sz w:val="19"/>
+        </w:rPr>
+        <w:t>max_budget</w:t>
+      </w:r>
+      <w:r>
+        <w:rPr>
+          <w:rFonts w:ascii="Arial" w:hAnsi="Arial"/>
+          <w:sz w:val="20"/>
+        </w:rPr>
+        <w:t xml:space="preserve"> field from the return dict. The function is now cleanly scoped: *team + opponent + year → lineup + matchup plan*.</w:t>
+      </w:r>
+    </w:p>
+    <w:p>
+      <w:pPr>
+        <w:pStyle w:val="ListBullet"/>
+      </w:pPr>
+      <w:r>
+        <w:rPr>
+          <w:rFonts w:ascii="Arial" w:hAnsi="Arial"/>
+          <w:sz w:val="20"/>
+        </w:rPr>
+        <w:t>Updated the tab caption to make the intent explicit: *"Day-to-day lineup construction. Pick the team you're managing and the opponent for an upcoming game ... No payroll input — this tab uses the existing roster as is."*</w:t>
+      </w:r>
+    </w:p>
+    <w:p>
+      <w:pPr>
+        <w:pStyle w:val="ListBullet"/>
+      </w:pPr>
+      <w:r>
+        <w:rPr>
+          <w:rFonts w:ascii="Arial" w:hAnsi="Arial"/>
+          <w:sz w:val="20"/>
+        </w:rPr>
+        <w:t xml:space="preserve">Removed the unused </w:t>
+      </w:r>
+      <w:r>
+        <w:rPr>
+          <w:rFonts w:ascii="Consolas" w:hAnsi="Consolas"/>
+          <w:color w:val="444444"/>
+          <w:sz w:val="19"/>
+        </w:rPr>
+        <w:t>_fmt_money</w:t>
+      </w:r>
+      <w:r>
+        <w:rPr>
+          <w:rFonts w:ascii="Arial" w:hAnsi="Arial"/>
+          <w:sz w:val="20"/>
+        </w:rPr>
+        <w:t xml:space="preserve"> helper and the </w:t>
+      </w:r>
+      <w:r>
+        <w:rPr>
+          <w:rFonts w:ascii="Consolas" w:hAnsi="Consolas"/>
+          <w:color w:val="444444"/>
+          <w:sz w:val="19"/>
+        </w:rPr>
+        <w:t>TEAM_DEFAULT_PAYROLL</w:t>
+      </w:r>
+      <w:r>
+        <w:rPr>
+          <w:rFonts w:ascii="Arial" w:hAnsi="Arial"/>
+          <w:sz w:val="20"/>
+        </w:rPr>
+        <w:t xml:space="preserve"> import from </w:t>
+      </w:r>
+      <w:r>
+        <w:rPr>
+          <w:rFonts w:ascii="Consolas" w:hAnsi="Consolas"/>
+          <w:color w:val="444444"/>
+          <w:sz w:val="19"/>
+        </w:rPr>
+        <w:t>roster_builder.py</w:t>
+      </w:r>
+      <w:r>
+        <w:rPr>
+          <w:rFonts w:ascii="Arial" w:hAnsi="Arial"/>
+          <w:sz w:val="20"/>
+        </w:rPr>
+        <w:t>.</w:t>
+      </w:r>
+    </w:p>
+    <w:p>
+      <w:r>
+        <w:rPr>
+          <w:rFonts w:ascii="Arial" w:hAnsi="Arial"/>
+          <w:b/>
+          <w:sz w:val="20"/>
+        </w:rPr>
+        <w:t>Why</w:t>
+      </w:r>
+    </w:p>
+    <w:p>
+      <w:r>
+        <w:rPr>
+          <w:rFonts w:ascii="Arial" w:hAnsi="Arial"/>
+          <w:sz w:val="20"/>
+        </w:rPr>
+        <w:t>The Roster Builder answers a manager's day-to-day question: *given today's game against this specific opponent, what is my best lineup?* That has nothing to do with the team's payroll. Payroll belongs on the Gap Filler tab, which answers a GM's offseason question: *what free agents should we sign within this budget?* Separating the inputs by tab keeps each tab's mental model clean.</w:t>
+      </w:r>
+    </w:p>
+    <w:p>
+      <w:r>
+        <w:rPr>
+          <w:rFonts w:ascii="Arial" w:hAnsi="Arial"/>
+          <w:b/>
+          <w:sz w:val="20"/>
+        </w:rPr>
+        <w:t>Re-captured screenshots</w:t>
+      </w:r>
+      <w:r>
+        <w:rPr>
+          <w:rFonts w:ascii="Arial" w:hAnsi="Arial"/>
+          <w:sz w:val="20"/>
+        </w:rPr>
+        <w:t xml:space="preserve"> (</w:t>
+      </w:r>
+      <w:r>
+        <w:rPr>
+          <w:rFonts w:ascii="Consolas" w:hAnsi="Consolas"/>
+          <w:color w:val="444444"/>
+          <w:sz w:val="19"/>
+        </w:rPr>
+        <w:t>07_roster_builder_top.png</w:t>
+      </w:r>
+      <w:r>
+        <w:rPr>
+          <w:rFonts w:ascii="Arial" w:hAnsi="Arial"/>
+          <w:sz w:val="20"/>
+        </w:rPr>
+        <w:t xml:space="preserve">, </w:t>
+      </w:r>
+      <w:r>
+        <w:rPr>
+          <w:rFonts w:ascii="Consolas" w:hAnsi="Consolas"/>
+          <w:color w:val="444444"/>
+          <w:sz w:val="19"/>
+        </w:rPr>
+        <w:t>08_roster_builder_lineup_and_matchup.png</w:t>
+      </w:r>
+      <w:r>
+        <w:rPr>
+          <w:rFonts w:ascii="Arial" w:hAnsi="Arial"/>
+          <w:sz w:val="20"/>
+        </w:rPr>
+        <w:t>) confirm the new layout. SEA-vs-HOU run is 4.83 s, one gpt-4o call, same lineup and matchup output as Entry 11 (the LLM didn't use the payroll number anyway).</w:t>
+      </w:r>
+    </w:p>
+    <w:p>
+      <w:pPr>
+        <w:pBdr>
+          <w:bottom w:val="single" w:sz="6" w:color="B0B0B0"/>
+        </w:pBdr>
+      </w:pPr>
+    </w:p>
     <w:sectPr>
       <w:pgSz w:w="12240" w:h="15840"/>
       <w:pgMar w:top="1440" w:right="1440" w:bottom="1440" w:left="1440" w:header="720" w:footer="720" w:gutter="0"/>

</xml_diff>

<commit_message>
Contract MAE eval: pooled MAE $4.30M on 26 held-out contracts + Entry 13
Adds eval/contract_mae.py: samples 30 contracts signed 2019-2024,
forecasts each via prompt-based valuator with no-leakage comparable
pool (signed_year strictly less than test), computes pooled and
per-position MAE. Results: pooled MAE $4.30M (median $3.00M, MAPE
20.4%), best accuracy on SP at 12.9% MAPE, worst on DH driven by
Ohtani outlier. Aaron Judge predicted exactly, Tyler Glasnow within
$0.7M.

Sets the baseline for Pipeline 05 fine-tuning comparison.
</commit_message>
<xml_diff>
--- a/docs/Sabercast_Build_Log.docx
+++ b/docs/Sabercast_Build_Log.docx
@@ -7089,6 +7089,1437 @@
           <w:sz w:val="20"/>
         </w:rPr>
         <w:t>) confirm the new layout. SEA-vs-HOU run is 4.83 s, one gpt-4o call, same lineup and matchup output as Entry 11 (the LLM didn't use the payroll number anyway).</w:t>
+      </w:r>
+    </w:p>
+    <w:p>
+      <w:pPr>
+        <w:pBdr>
+          <w:bottom w:val="single" w:sz="6" w:color="B0B0B0"/>
+        </w:pBdr>
+      </w:pPr>
+    </w:p>
+    <w:p>
+      <w:r>
+        <w:rPr>
+          <w:rFonts w:ascii="Arial" w:hAnsi="Arial"/>
+          <w:b/>
+          <w:color w:val="202020"/>
+          <w:sz w:val="30"/>
+        </w:rPr>
+        <w:t>Entry 13 — May 31 (Final build): Contract MAE evaluation — second quantitative claim for the report</w:t>
+      </w:r>
+    </w:p>
+    <w:p>
+      <w:r>
+        <w:rPr>
+          <w:rFonts w:ascii="Arial" w:hAnsi="Arial"/>
+          <w:b/>
+          <w:sz w:val="20"/>
+        </w:rPr>
+        <w:t>Goal:</w:t>
+      </w:r>
+      <w:r>
+        <w:rPr>
+          <w:rFonts w:ascii="Arial" w:hAnsi="Arial"/>
+          <w:sz w:val="20"/>
+        </w:rPr>
+        <w:t xml:space="preserve"> Quantify how accurate the prompt-based contract forecaster is on held-out contracts. Produce a Mean Absolute Error number that sits alongside the 5-year correlation as a second hard claim for the final report.</w:t>
+      </w:r>
+    </w:p>
+    <w:p>
+      <w:r>
+        <w:rPr>
+          <w:rFonts w:ascii="Arial" w:hAnsi="Arial"/>
+          <w:b/>
+          <w:sz w:val="20"/>
+        </w:rPr>
+        <w:t>What was built</w:t>
+      </w:r>
+    </w:p>
+    <w:p>
+      <w:pPr>
+        <w:pStyle w:val="ListBullet"/>
+      </w:pPr>
+      <w:r>
+        <w:rPr>
+          <w:rFonts w:ascii="Arial" w:hAnsi="Arial"/>
+          <w:b/>
+          <w:sz w:val="20"/>
+        </w:rPr>
+        <w:t>`eval/contract_mae.py`</w:t>
+      </w:r>
+      <w:r>
+        <w:rPr>
+          <w:rFonts w:ascii="Arial" w:hAnsi="Arial"/>
+          <w:sz w:val="20"/>
+        </w:rPr>
+        <w:t xml:space="preserve"> — held-out evaluation script:</w:t>
+      </w:r>
+    </w:p>
+    <w:p>
+      <w:pPr>
+        <w:pStyle w:val="ListNumber"/>
+      </w:pPr>
+      <w:r>
+        <w:rPr>
+          <w:rFonts w:ascii="Arial" w:hAnsi="Arial"/>
+          <w:sz w:val="20"/>
+        </w:rPr>
+        <w:t xml:space="preserve">Sample 30 contracts from </w:t>
+      </w:r>
+      <w:r>
+        <w:rPr>
+          <w:rFonts w:ascii="Consolas" w:hAnsi="Consolas"/>
+          <w:color w:val="444444"/>
+          <w:sz w:val="19"/>
+        </w:rPr>
+        <w:t>contracts.csv</w:t>
+      </w:r>
+      <w:r>
+        <w:rPr>
+          <w:rFonts w:ascii="Arial" w:hAnsi="Arial"/>
+          <w:sz w:val="20"/>
+        </w:rPr>
+        <w:t xml:space="preserve"> signed in 2019–2024 (so the player's signing-year stats are on disk), </w:t>
+      </w:r>
+      <w:r>
+        <w:rPr>
+          <w:rFonts w:ascii="Consolas" w:hAnsi="Consolas"/>
+          <w:color w:val="444444"/>
+          <w:sz w:val="19"/>
+        </w:rPr>
+        <w:t>random.seed=42</w:t>
+      </w:r>
+      <w:r>
+        <w:rPr>
+          <w:rFonts w:ascii="Arial" w:hAnsi="Arial"/>
+          <w:sz w:val="20"/>
+        </w:rPr>
+        <w:t>.</w:t>
+      </w:r>
+    </w:p>
+    <w:p>
+      <w:pPr>
+        <w:pStyle w:val="ListNumber"/>
+      </w:pPr>
+      <w:r>
+        <w:rPr>
+          <w:rFonts w:ascii="Arial" w:hAnsi="Arial"/>
+          <w:sz w:val="20"/>
+        </w:rPr>
+        <w:t xml:space="preserve">For each test contract: load batting/pitching for the signing year, look up the player's stat line, build a comparable pool of contracts at the same position with </w:t>
+      </w:r>
+      <w:r>
+        <w:rPr>
+          <w:rFonts w:ascii="Consolas" w:hAnsi="Consolas"/>
+          <w:color w:val="444444"/>
+          <w:sz w:val="19"/>
+        </w:rPr>
+        <w:t>signed_year STRICTLY LESS than the test contract's signed_year</w:t>
+      </w:r>
+      <w:r>
+        <w:rPr>
+          <w:rFonts w:ascii="Arial" w:hAnsi="Arial"/>
+          <w:sz w:val="20"/>
+        </w:rPr>
+        <w:t xml:space="preserve"> (no leakage — the LLM cannot see the test contract or any later contract at the same position), call </w:t>
+      </w:r>
+      <w:r>
+        <w:rPr>
+          <w:rFonts w:ascii="Consolas" w:hAnsi="Consolas"/>
+          <w:color w:val="444444"/>
+          <w:sz w:val="19"/>
+        </w:rPr>
+        <w:t>forecast_target_contract_llm</w:t>
+      </w:r>
+      <w:r>
+        <w:rPr>
+          <w:rFonts w:ascii="Arial" w:hAnsi="Arial"/>
+          <w:sz w:val="20"/>
+        </w:rPr>
+        <w:t xml:space="preserve"> with </w:t>
+      </w:r>
+      <w:r>
+        <w:rPr>
+          <w:rFonts w:ascii="Consolas" w:hAnsi="Consolas"/>
+          <w:color w:val="444444"/>
+          <w:sz w:val="19"/>
+        </w:rPr>
+        <w:t>market_year</w:t>
+      </w:r>
+      <w:r>
+        <w:rPr>
+          <w:rFonts w:ascii="Arial" w:hAnsi="Arial"/>
+          <w:sz w:val="20"/>
+        </w:rPr>
+        <w:t xml:space="preserve"> set to the test contract's signing year.</w:t>
+      </w:r>
+    </w:p>
+    <w:p>
+      <w:pPr>
+        <w:pStyle w:val="ListNumber"/>
+      </w:pPr>
+      <w:r>
+        <w:rPr>
+          <w:rFonts w:ascii="Arial" w:hAnsi="Arial"/>
+          <w:sz w:val="20"/>
+        </w:rPr>
+        <w:t>Skip cases where the player has no qualifying stats row or no prior position-matched comparable.</w:t>
+      </w:r>
+    </w:p>
+    <w:p>
+      <w:pPr>
+        <w:pStyle w:val="ListNumber"/>
+      </w:pPr>
+      <w:r>
+        <w:rPr>
+          <w:rFonts w:ascii="Arial" w:hAnsi="Arial"/>
+          <w:sz w:val="20"/>
+        </w:rPr>
+        <w:t>Record predicted_aav, actual_aav, absolute error, percent error.</w:t>
+      </w:r>
+    </w:p>
+    <w:p>
+      <w:pPr>
+        <w:pStyle w:val="ListBullet"/>
+      </w:pPr>
+      <w:r>
+        <w:rPr>
+          <w:rFonts w:ascii="Arial" w:hAnsi="Arial"/>
+          <w:sz w:val="20"/>
+        </w:rPr>
+        <w:t xml:space="preserve">Outputs </w:t>
+      </w:r>
+      <w:r>
+        <w:rPr>
+          <w:rFonts w:ascii="Consolas" w:hAnsi="Consolas"/>
+          <w:color w:val="444444"/>
+          <w:sz w:val="19"/>
+        </w:rPr>
+        <w:t>eval/results/contract_mae.csv</w:t>
+      </w:r>
+      <w:r>
+        <w:rPr>
+          <w:rFonts w:ascii="Arial" w:hAnsi="Arial"/>
+          <w:sz w:val="20"/>
+        </w:rPr>
+        <w:t xml:space="preserve">, </w:t>
+      </w:r>
+      <w:r>
+        <w:rPr>
+          <w:rFonts w:ascii="Consolas" w:hAnsi="Consolas"/>
+          <w:color w:val="444444"/>
+          <w:sz w:val="19"/>
+        </w:rPr>
+        <w:t>eval/results/contract_mae_by_position.csv</w:t>
+      </w:r>
+      <w:r>
+        <w:rPr>
+          <w:rFonts w:ascii="Arial" w:hAnsi="Arial"/>
+          <w:sz w:val="20"/>
+        </w:rPr>
+        <w:t xml:space="preserve">, and a </w:t>
+      </w:r>
+      <w:r>
+        <w:rPr>
+          <w:rFonts w:ascii="Consolas" w:hAnsi="Consolas"/>
+          <w:color w:val="444444"/>
+          <w:sz w:val="19"/>
+        </w:rPr>
+        <w:t>predicted vs actual</w:t>
+      </w:r>
+      <w:r>
+        <w:rPr>
+          <w:rFonts w:ascii="Arial" w:hAnsi="Arial"/>
+          <w:sz w:val="20"/>
+        </w:rPr>
+        <w:t xml:space="preserve"> scatter chart with the 45° perfect-prediction line.</w:t>
+      </w:r>
+    </w:p>
+    <w:p>
+      <w:r>
+        <w:rPr>
+          <w:rFonts w:ascii="Arial" w:hAnsi="Arial"/>
+          <w:b/>
+          <w:sz w:val="20"/>
+        </w:rPr>
+        <w:t>What it produced</w:t>
+      </w:r>
+    </w:p>
+    <w:p>
+      <w:r>
+        <w:rPr>
+          <w:rFonts w:ascii="Arial" w:hAnsi="Arial"/>
+          <w:sz w:val="20"/>
+        </w:rPr>
+        <w:t>26 successful predictions (4 skipped — Ozzie Albies + Brandon Lowe 2B 2019 had no prior 2B comparables; Yordan Alvarez DH 2023 had no prior DH comparable; Andres Gimenez 2B 2023 had no qualifying stats row).</w:t>
+      </w:r>
+    </w:p>
+    <w:tbl>
+      <w:tblPr>
+        <w:tblW w:type="auto" w:w="0"/>
+        <w:tblLayout w:type="fixed"/>
+        <w:tblLook w:firstColumn="1" w:firstRow="1" w:lastColumn="0" w:lastRow="0" w:noHBand="0" w:noVBand="1" w:val="04A0"/>
+      </w:tblPr>
+      <w:tblGrid>
+        <w:gridCol w:w="1560"/>
+        <w:gridCol w:w="1560"/>
+        <w:gridCol w:w="1560"/>
+        <w:gridCol w:w="1560"/>
+        <w:gridCol w:w="1560"/>
+        <w:gridCol w:w="1560"/>
+      </w:tblGrid>
+      <w:tr>
+        <w:tc>
+          <w:tcPr>
+            <w:tcW w:type="dxa" w:w="1536"/>
+            <w:shd w:val="clear" w:color="auto" w:fill="EEEEEE"/>
+          </w:tcPr>
+          <w:p>
+            <w:r/>
+            <w:r>
+              <w:rPr>
+                <w:rFonts w:ascii="Arial" w:hAnsi="Arial"/>
+                <w:b/>
+                <w:sz w:val="19"/>
+              </w:rPr>
+              <w:t>Sample</w:t>
+            </w:r>
+          </w:p>
+        </w:tc>
+        <w:tc>
+          <w:tcPr>
+            <w:tcW w:type="dxa" w:w="1536"/>
+            <w:shd w:val="clear" w:color="auto" w:fill="EEEEEE"/>
+          </w:tcPr>
+          <w:p>
+            <w:r/>
+            <w:r>
+              <w:rPr>
+                <w:rFonts w:ascii="Arial" w:hAnsi="Arial"/>
+                <w:b/>
+                <w:sz w:val="19"/>
+              </w:rPr>
+              <w:t>n</w:t>
+            </w:r>
+          </w:p>
+        </w:tc>
+        <w:tc>
+          <w:tcPr>
+            <w:tcW w:type="dxa" w:w="1536"/>
+            <w:shd w:val="clear" w:color="auto" w:fill="EEEEEE"/>
+          </w:tcPr>
+          <w:p>
+            <w:r/>
+            <w:r>
+              <w:rPr>
+                <w:rFonts w:ascii="Arial" w:hAnsi="Arial"/>
+                <w:b/>
+                <w:sz w:val="19"/>
+              </w:rPr>
+              <w:t>Pearson r vs actual?</w:t>
+            </w:r>
+          </w:p>
+        </w:tc>
+        <w:tc>
+          <w:tcPr>
+            <w:tcW w:type="dxa" w:w="1536"/>
+            <w:shd w:val="clear" w:color="auto" w:fill="EEEEEE"/>
+          </w:tcPr>
+          <w:p>
+            <w:r/>
+            <w:r>
+              <w:rPr>
+                <w:rFonts w:ascii="Arial" w:hAnsi="Arial"/>
+                <w:b/>
+                <w:sz w:val="19"/>
+              </w:rPr>
+              <w:t>**MAE**</w:t>
+            </w:r>
+          </w:p>
+        </w:tc>
+        <w:tc>
+          <w:tcPr>
+            <w:tcW w:type="dxa" w:w="1536"/>
+            <w:shd w:val="clear" w:color="auto" w:fill="EEEEEE"/>
+          </w:tcPr>
+          <w:p>
+            <w:r/>
+            <w:r>
+              <w:rPr>
+                <w:rFonts w:ascii="Arial" w:hAnsi="Arial"/>
+                <w:b/>
+                <w:sz w:val="19"/>
+              </w:rPr>
+              <w:t>Median abs err</w:t>
+            </w:r>
+          </w:p>
+        </w:tc>
+        <w:tc>
+          <w:tcPr>
+            <w:tcW w:type="dxa" w:w="1536"/>
+            <w:shd w:val="clear" w:color="auto" w:fill="EEEEEE"/>
+          </w:tcPr>
+          <w:p>
+            <w:r/>
+            <w:r>
+              <w:rPr>
+                <w:rFonts w:ascii="Arial" w:hAnsi="Arial"/>
+                <w:b/>
+                <w:sz w:val="19"/>
+              </w:rPr>
+              <w:t>MAPE</w:t>
+            </w:r>
+          </w:p>
+        </w:tc>
+      </w:tr>
+      <w:tr>
+        <w:tc>
+          <w:tcPr>
+            <w:tcW w:type="dxa" w:w="1536"/>
+          </w:tcPr>
+          <w:p>
+            <w:r/>
+            <w:r>
+              <w:rPr>
+                <w:rFonts w:ascii="Arial" w:hAnsi="Arial"/>
+                <w:sz w:val="19"/>
+              </w:rPr>
+              <w:t>Pooled, all 26</w:t>
+            </w:r>
+          </w:p>
+        </w:tc>
+        <w:tc>
+          <w:tcPr>
+            <w:tcW w:type="dxa" w:w="1536"/>
+          </w:tcPr>
+          <w:p>
+            <w:r/>
+            <w:r>
+              <w:rPr>
+                <w:rFonts w:ascii="Arial" w:hAnsi="Arial"/>
+                <w:sz w:val="19"/>
+              </w:rPr>
+              <w:t>26</w:t>
+            </w:r>
+          </w:p>
+        </w:tc>
+        <w:tc>
+          <w:tcPr>
+            <w:tcW w:type="dxa" w:w="1536"/>
+          </w:tcPr>
+          <w:p>
+            <w:r/>
+            <w:r>
+              <w:rPr>
+                <w:rFonts w:ascii="Arial" w:hAnsi="Arial"/>
+                <w:sz w:val="19"/>
+              </w:rPr>
+              <w:t>—</w:t>
+            </w:r>
+          </w:p>
+        </w:tc>
+        <w:tc>
+          <w:tcPr>
+            <w:tcW w:type="dxa" w:w="1536"/>
+          </w:tcPr>
+          <w:p>
+            <w:r/>
+            <w:r>
+              <w:rPr>
+                <w:rFonts w:ascii="Arial" w:hAnsi="Arial"/>
+                <w:b/>
+                <w:sz w:val="19"/>
+              </w:rPr>
+              <w:t>$4.30M</w:t>
+            </w:r>
+          </w:p>
+        </w:tc>
+        <w:tc>
+          <w:tcPr>
+            <w:tcW w:type="dxa" w:w="1536"/>
+          </w:tcPr>
+          <w:p>
+            <w:r/>
+            <w:r>
+              <w:rPr>
+                <w:rFonts w:ascii="Arial" w:hAnsi="Arial"/>
+                <w:sz w:val="19"/>
+              </w:rPr>
+              <w:t>$3.00M</w:t>
+            </w:r>
+          </w:p>
+        </w:tc>
+        <w:tc>
+          <w:tcPr>
+            <w:tcW w:type="dxa" w:w="1536"/>
+          </w:tcPr>
+          <w:p>
+            <w:r/>
+            <w:r>
+              <w:rPr>
+                <w:rFonts w:ascii="Arial" w:hAnsi="Arial"/>
+                <w:sz w:val="19"/>
+              </w:rPr>
+              <w:t>20.4%</w:t>
+            </w:r>
+          </w:p>
+        </w:tc>
+      </w:tr>
+      <w:tr>
+        <w:tc>
+          <w:tcPr>
+            <w:tcW w:type="dxa" w:w="1536"/>
+          </w:tcPr>
+          <w:p>
+            <w:r/>
+            <w:r>
+              <w:rPr>
+                <w:rFonts w:ascii="Arial" w:hAnsi="Arial"/>
+                <w:sz w:val="19"/>
+              </w:rPr>
+              <w:t>Excluding the Ohtani outlier</w:t>
+            </w:r>
+          </w:p>
+        </w:tc>
+        <w:tc>
+          <w:tcPr>
+            <w:tcW w:type="dxa" w:w="1536"/>
+          </w:tcPr>
+          <w:p>
+            <w:r/>
+            <w:r>
+              <w:rPr>
+                <w:rFonts w:ascii="Arial" w:hAnsi="Arial"/>
+                <w:sz w:val="19"/>
+              </w:rPr>
+              <w:t>25</w:t>
+            </w:r>
+          </w:p>
+        </w:tc>
+        <w:tc>
+          <w:tcPr>
+            <w:tcW w:type="dxa" w:w="1536"/>
+          </w:tcPr>
+          <w:p>
+            <w:r/>
+            <w:r>
+              <w:rPr>
+                <w:rFonts w:ascii="Arial" w:hAnsi="Arial"/>
+                <w:sz w:val="19"/>
+              </w:rPr>
+              <w:t>—</w:t>
+            </w:r>
+          </w:p>
+        </w:tc>
+        <w:tc>
+          <w:tcPr>
+            <w:tcW w:type="dxa" w:w="1536"/>
+          </w:tcPr>
+          <w:p>
+            <w:r/>
+            <w:r>
+              <w:rPr>
+                <w:rFonts w:ascii="Arial" w:hAnsi="Arial"/>
+                <w:sz w:val="19"/>
+              </w:rPr>
+              <w:t>$3.67M</w:t>
+            </w:r>
+          </w:p>
+        </w:tc>
+        <w:tc>
+          <w:tcPr>
+            <w:tcW w:type="dxa" w:w="1536"/>
+          </w:tcPr>
+          <w:p>
+            <w:r/>
+            <w:r>
+              <w:rPr>
+                <w:rFonts w:ascii="Arial" w:hAnsi="Arial"/>
+                <w:sz w:val="19"/>
+              </w:rPr>
+              <w:t>$3.00M</w:t>
+            </w:r>
+          </w:p>
+        </w:tc>
+        <w:tc>
+          <w:tcPr>
+            <w:tcW w:type="dxa" w:w="1536"/>
+          </w:tcPr>
+          <w:p>
+            <w:r/>
+            <w:r>
+              <w:rPr>
+                <w:rFonts w:ascii="Arial" w:hAnsi="Arial"/>
+                <w:sz w:val="19"/>
+              </w:rPr>
+              <w:t>20.1%</w:t>
+            </w:r>
+          </w:p>
+        </w:tc>
+      </w:tr>
+    </w:tbl>
+    <w:p>
+      <w:r>
+        <w:rPr>
+          <w:rFonts w:ascii="Arial" w:hAnsi="Arial"/>
+          <w:b/>
+          <w:sz w:val="20"/>
+        </w:rPr>
+        <w:t>MAE by position bucket</w:t>
+      </w:r>
+    </w:p>
+    <w:tbl>
+      <w:tblPr>
+        <w:tblW w:type="auto" w:w="0"/>
+        <w:tblLayout w:type="fixed"/>
+        <w:tblLook w:firstColumn="1" w:firstRow="1" w:lastColumn="0" w:lastRow="0" w:noHBand="0" w:noVBand="1" w:val="04A0"/>
+      </w:tblPr>
+      <w:tblGrid>
+        <w:gridCol w:w="1872"/>
+        <w:gridCol w:w="1872"/>
+        <w:gridCol w:w="1872"/>
+        <w:gridCol w:w="1872"/>
+        <w:gridCol w:w="1872"/>
+      </w:tblGrid>
+      <w:tr>
+        <w:tc>
+          <w:tcPr>
+            <w:tcW w:type="dxa" w:w="1843"/>
+            <w:shd w:val="clear" w:color="auto" w:fill="EEEEEE"/>
+          </w:tcPr>
+          <w:p>
+            <w:r/>
+            <w:r>
+              <w:rPr>
+                <w:rFonts w:ascii="Arial" w:hAnsi="Arial"/>
+                <w:b/>
+                <w:sz w:val="19"/>
+              </w:rPr>
+              <w:t>Position group</w:t>
+            </w:r>
+          </w:p>
+        </w:tc>
+        <w:tc>
+          <w:tcPr>
+            <w:tcW w:type="dxa" w:w="1843"/>
+            <w:shd w:val="clear" w:color="auto" w:fill="EEEEEE"/>
+          </w:tcPr>
+          <w:p>
+            <w:r/>
+            <w:r>
+              <w:rPr>
+                <w:rFonts w:ascii="Arial" w:hAnsi="Arial"/>
+                <w:b/>
+                <w:sz w:val="19"/>
+              </w:rPr>
+              <w:t>n</w:t>
+            </w:r>
+          </w:p>
+        </w:tc>
+        <w:tc>
+          <w:tcPr>
+            <w:tcW w:type="dxa" w:w="1843"/>
+            <w:shd w:val="clear" w:color="auto" w:fill="EEEEEE"/>
+          </w:tcPr>
+          <w:p>
+            <w:r/>
+            <w:r>
+              <w:rPr>
+                <w:rFonts w:ascii="Arial" w:hAnsi="Arial"/>
+                <w:b/>
+                <w:sz w:val="19"/>
+              </w:rPr>
+              <w:t>MAE</w:t>
+            </w:r>
+          </w:p>
+        </w:tc>
+        <w:tc>
+          <w:tcPr>
+            <w:tcW w:type="dxa" w:w="1843"/>
+            <w:shd w:val="clear" w:color="auto" w:fill="EEEEEE"/>
+          </w:tcPr>
+          <w:p>
+            <w:r/>
+            <w:r>
+              <w:rPr>
+                <w:rFonts w:ascii="Arial" w:hAnsi="Arial"/>
+                <w:b/>
+                <w:sz w:val="19"/>
+              </w:rPr>
+              <w:t>Median</w:t>
+            </w:r>
+          </w:p>
+        </w:tc>
+        <w:tc>
+          <w:tcPr>
+            <w:tcW w:type="dxa" w:w="1843"/>
+            <w:shd w:val="clear" w:color="auto" w:fill="EEEEEE"/>
+          </w:tcPr>
+          <w:p>
+            <w:r/>
+            <w:r>
+              <w:rPr>
+                <w:rFonts w:ascii="Arial" w:hAnsi="Arial"/>
+                <w:b/>
+                <w:sz w:val="19"/>
+              </w:rPr>
+              <w:t>MAPE</w:t>
+            </w:r>
+          </w:p>
+        </w:tc>
+      </w:tr>
+      <w:tr>
+        <w:tc>
+          <w:tcPr>
+            <w:tcW w:type="dxa" w:w="1843"/>
+          </w:tcPr>
+          <w:p>
+            <w:r/>
+            <w:r>
+              <w:rPr>
+                <w:rFonts w:ascii="Arial" w:hAnsi="Arial"/>
+                <w:sz w:val="19"/>
+              </w:rPr>
+              <w:t>SP</w:t>
+            </w:r>
+          </w:p>
+        </w:tc>
+        <w:tc>
+          <w:tcPr>
+            <w:tcW w:type="dxa" w:w="1843"/>
+          </w:tcPr>
+          <w:p>
+            <w:r/>
+            <w:r>
+              <w:rPr>
+                <w:rFonts w:ascii="Arial" w:hAnsi="Arial"/>
+                <w:sz w:val="19"/>
+              </w:rPr>
+              <w:t>4</w:t>
+            </w:r>
+          </w:p>
+        </w:tc>
+        <w:tc>
+          <w:tcPr>
+            <w:tcW w:type="dxa" w:w="1843"/>
+          </w:tcPr>
+          <w:p>
+            <w:r/>
+            <w:r>
+              <w:rPr>
+                <w:rFonts w:ascii="Arial" w:hAnsi="Arial"/>
+                <w:sz w:val="19"/>
+              </w:rPr>
+              <w:t>$3.03M</w:t>
+            </w:r>
+          </w:p>
+        </w:tc>
+        <w:tc>
+          <w:tcPr>
+            <w:tcW w:type="dxa" w:w="1843"/>
+          </w:tcPr>
+          <w:p>
+            <w:r/>
+            <w:r>
+              <w:rPr>
+                <w:rFonts w:ascii="Arial" w:hAnsi="Arial"/>
+                <w:sz w:val="19"/>
+              </w:rPr>
+              <w:t>$3.21M</w:t>
+            </w:r>
+          </w:p>
+        </w:tc>
+        <w:tc>
+          <w:tcPr>
+            <w:tcW w:type="dxa" w:w="1843"/>
+          </w:tcPr>
+          <w:p>
+            <w:r/>
+            <w:r>
+              <w:rPr>
+                <w:rFonts w:ascii="Arial" w:hAnsi="Arial"/>
+                <w:b/>
+                <w:sz w:val="19"/>
+              </w:rPr>
+              <w:t>12.9%</w:t>
+            </w:r>
+            <w:r>
+              <w:rPr>
+                <w:rFonts w:ascii="Arial" w:hAnsi="Arial"/>
+                <w:sz w:val="19"/>
+              </w:rPr>
+              <w:t xml:space="preserve"> (best)</w:t>
+            </w:r>
+          </w:p>
+        </w:tc>
+      </w:tr>
+      <w:tr>
+        <w:tc>
+          <w:tcPr>
+            <w:tcW w:type="dxa" w:w="1843"/>
+          </w:tcPr>
+          <w:p>
+            <w:r/>
+            <w:r>
+              <w:rPr>
+                <w:rFonts w:ascii="Arial" w:hAnsi="Arial"/>
+                <w:sz w:val="19"/>
+              </w:rPr>
+              <w:t>RP</w:t>
+            </w:r>
+          </w:p>
+        </w:tc>
+        <w:tc>
+          <w:tcPr>
+            <w:tcW w:type="dxa" w:w="1843"/>
+          </w:tcPr>
+          <w:p>
+            <w:r/>
+            <w:r>
+              <w:rPr>
+                <w:rFonts w:ascii="Arial" w:hAnsi="Arial"/>
+                <w:sz w:val="19"/>
+              </w:rPr>
+              <w:t>3</w:t>
+            </w:r>
+          </w:p>
+        </w:tc>
+        <w:tc>
+          <w:tcPr>
+            <w:tcW w:type="dxa" w:w="1843"/>
+          </w:tcPr>
+          <w:p>
+            <w:r/>
+            <w:r>
+              <w:rPr>
+                <w:rFonts w:ascii="Arial" w:hAnsi="Arial"/>
+                <w:sz w:val="19"/>
+              </w:rPr>
+              <w:t>$2.77M</w:t>
+            </w:r>
+          </w:p>
+        </w:tc>
+        <w:tc>
+          <w:tcPr>
+            <w:tcW w:type="dxa" w:w="1843"/>
+          </w:tcPr>
+          <w:p>
+            <w:r/>
+            <w:r>
+              <w:rPr>
+                <w:rFonts w:ascii="Arial" w:hAnsi="Arial"/>
+                <w:sz w:val="19"/>
+              </w:rPr>
+              <w:t>$1.50M</w:t>
+            </w:r>
+          </w:p>
+        </w:tc>
+        <w:tc>
+          <w:tcPr>
+            <w:tcW w:type="dxa" w:w="1843"/>
+          </w:tcPr>
+          <w:p>
+            <w:r/>
+            <w:r>
+              <w:rPr>
+                <w:rFonts w:ascii="Arial" w:hAnsi="Arial"/>
+                <w:sz w:val="19"/>
+              </w:rPr>
+              <w:t>27.8%</w:t>
+            </w:r>
+          </w:p>
+        </w:tc>
+      </w:tr>
+      <w:tr>
+        <w:tc>
+          <w:tcPr>
+            <w:tcW w:type="dxa" w:w="1843"/>
+          </w:tcPr>
+          <w:p>
+            <w:r/>
+            <w:r>
+              <w:rPr>
+                <w:rFonts w:ascii="Arial" w:hAnsi="Arial"/>
+                <w:sz w:val="19"/>
+              </w:rPr>
+              <w:t>C</w:t>
+            </w:r>
+          </w:p>
+        </w:tc>
+        <w:tc>
+          <w:tcPr>
+            <w:tcW w:type="dxa" w:w="1843"/>
+          </w:tcPr>
+          <w:p>
+            <w:r/>
+            <w:r>
+              <w:rPr>
+                <w:rFonts w:ascii="Arial" w:hAnsi="Arial"/>
+                <w:sz w:val="19"/>
+              </w:rPr>
+              <w:t>3</w:t>
+            </w:r>
+          </w:p>
+        </w:tc>
+        <w:tc>
+          <w:tcPr>
+            <w:tcW w:type="dxa" w:w="1843"/>
+          </w:tcPr>
+          <w:p>
+            <w:r/>
+            <w:r>
+              <w:rPr>
+                <w:rFonts w:ascii="Arial" w:hAnsi="Arial"/>
+                <w:sz w:val="19"/>
+              </w:rPr>
+              <w:t>$3.17M</w:t>
+            </w:r>
+          </w:p>
+        </w:tc>
+        <w:tc>
+          <w:tcPr>
+            <w:tcW w:type="dxa" w:w="1843"/>
+          </w:tcPr>
+          <w:p>
+            <w:r/>
+            <w:r>
+              <w:rPr>
+                <w:rFonts w:ascii="Arial" w:hAnsi="Arial"/>
+                <w:sz w:val="19"/>
+              </w:rPr>
+              <w:t>$2.00M</w:t>
+            </w:r>
+          </w:p>
+        </w:tc>
+        <w:tc>
+          <w:tcPr>
+            <w:tcW w:type="dxa" w:w="1843"/>
+          </w:tcPr>
+          <w:p>
+            <w:r/>
+            <w:r>
+              <w:rPr>
+                <w:rFonts w:ascii="Arial" w:hAnsi="Arial"/>
+                <w:sz w:val="19"/>
+              </w:rPr>
+              <w:t>27.6%</w:t>
+            </w:r>
+          </w:p>
+        </w:tc>
+      </w:tr>
+      <w:tr>
+        <w:tc>
+          <w:tcPr>
+            <w:tcW w:type="dxa" w:w="1843"/>
+          </w:tcPr>
+          <w:p>
+            <w:r/>
+            <w:r>
+              <w:rPr>
+                <w:rFonts w:ascii="Arial" w:hAnsi="Arial"/>
+                <w:sz w:val="19"/>
+              </w:rPr>
+              <w:t>OF</w:t>
+            </w:r>
+          </w:p>
+        </w:tc>
+        <w:tc>
+          <w:tcPr>
+            <w:tcW w:type="dxa" w:w="1843"/>
+          </w:tcPr>
+          <w:p>
+            <w:r/>
+            <w:r>
+              <w:rPr>
+                <w:rFonts w:ascii="Arial" w:hAnsi="Arial"/>
+                <w:sz w:val="19"/>
+              </w:rPr>
+              <w:t>6</w:t>
+            </w:r>
+          </w:p>
+        </w:tc>
+        <w:tc>
+          <w:tcPr>
+            <w:tcW w:type="dxa" w:w="1843"/>
+          </w:tcPr>
+          <w:p>
+            <w:r/>
+            <w:r>
+              <w:rPr>
+                <w:rFonts w:ascii="Arial" w:hAnsi="Arial"/>
+                <w:sz w:val="19"/>
+              </w:rPr>
+              <w:t>$3.98M</w:t>
+            </w:r>
+          </w:p>
+        </w:tc>
+        <w:tc>
+          <w:tcPr>
+            <w:tcW w:type="dxa" w:w="1843"/>
+          </w:tcPr>
+          <w:p>
+            <w:r/>
+            <w:r>
+              <w:rPr>
+                <w:rFonts w:ascii="Arial" w:hAnsi="Arial"/>
+                <w:sz w:val="19"/>
+              </w:rPr>
+              <w:t>$3.73M</w:t>
+            </w:r>
+          </w:p>
+        </w:tc>
+        <w:tc>
+          <w:tcPr>
+            <w:tcW w:type="dxa" w:w="1843"/>
+          </w:tcPr>
+          <w:p>
+            <w:r/>
+            <w:r>
+              <w:rPr>
+                <w:rFonts w:ascii="Arial" w:hAnsi="Arial"/>
+                <w:sz w:val="19"/>
+              </w:rPr>
+              <w:t>21.8%</w:t>
+            </w:r>
+          </w:p>
+        </w:tc>
+      </w:tr>
+      <w:tr>
+        <w:tc>
+          <w:tcPr>
+            <w:tcW w:type="dxa" w:w="1843"/>
+          </w:tcPr>
+          <w:p>
+            <w:r/>
+            <w:r>
+              <w:rPr>
+                <w:rFonts w:ascii="Arial" w:hAnsi="Arial"/>
+                <w:sz w:val="19"/>
+              </w:rPr>
+              <w:t>IF</w:t>
+            </w:r>
+          </w:p>
+        </w:tc>
+        <w:tc>
+          <w:tcPr>
+            <w:tcW w:type="dxa" w:w="1843"/>
+          </w:tcPr>
+          <w:p>
+            <w:r/>
+            <w:r>
+              <w:rPr>
+                <w:rFonts w:ascii="Arial" w:hAnsi="Arial"/>
+                <w:sz w:val="19"/>
+              </w:rPr>
+              <w:t>9</w:t>
+            </w:r>
+          </w:p>
+        </w:tc>
+        <w:tc>
+          <w:tcPr>
+            <w:tcW w:type="dxa" w:w="1843"/>
+          </w:tcPr>
+          <w:p>
+            <w:r/>
+            <w:r>
+              <w:rPr>
+                <w:rFonts w:ascii="Arial" w:hAnsi="Arial"/>
+                <w:sz w:val="19"/>
+              </w:rPr>
+              <w:t>$4.21M</w:t>
+            </w:r>
+          </w:p>
+        </w:tc>
+        <w:tc>
+          <w:tcPr>
+            <w:tcW w:type="dxa" w:w="1843"/>
+          </w:tcPr>
+          <w:p>
+            <w:r/>
+            <w:r>
+              <w:rPr>
+                <w:rFonts w:ascii="Arial" w:hAnsi="Arial"/>
+                <w:sz w:val="19"/>
+              </w:rPr>
+              <w:t>$3.00M</w:t>
+            </w:r>
+          </w:p>
+        </w:tc>
+        <w:tc>
+          <w:tcPr>
+            <w:tcW w:type="dxa" w:w="1843"/>
+          </w:tcPr>
+          <w:p>
+            <w:r/>
+            <w:r>
+              <w:rPr>
+                <w:rFonts w:ascii="Arial" w:hAnsi="Arial"/>
+                <w:sz w:val="19"/>
+              </w:rPr>
+              <w:t>16.9%</w:t>
+            </w:r>
+          </w:p>
+        </w:tc>
+      </w:tr>
+      <w:tr>
+        <w:tc>
+          <w:tcPr>
+            <w:tcW w:type="dxa" w:w="1843"/>
+          </w:tcPr>
+          <w:p>
+            <w:r/>
+            <w:r>
+              <w:rPr>
+                <w:rFonts w:ascii="Arial" w:hAnsi="Arial"/>
+                <w:sz w:val="19"/>
+              </w:rPr>
+              <w:t>DH</w:t>
+            </w:r>
+          </w:p>
+        </w:tc>
+        <w:tc>
+          <w:tcPr>
+            <w:tcW w:type="dxa" w:w="1843"/>
+          </w:tcPr>
+          <w:p>
+            <w:r/>
+            <w:r>
+              <w:rPr>
+                <w:rFonts w:ascii="Arial" w:hAnsi="Arial"/>
+                <w:sz w:val="19"/>
+              </w:rPr>
+              <w:t>1</w:t>
+            </w:r>
+          </w:p>
+        </w:tc>
+        <w:tc>
+          <w:tcPr>
+            <w:tcW w:type="dxa" w:w="1843"/>
+          </w:tcPr>
+          <w:p>
+            <w:r/>
+            <w:r>
+              <w:rPr>
+                <w:rFonts w:ascii="Arial" w:hAnsi="Arial"/>
+                <w:sz w:val="19"/>
+              </w:rPr>
+              <w:t>$20.0M (Ohtani only)</w:t>
+            </w:r>
+          </w:p>
+        </w:tc>
+        <w:tc>
+          <w:tcPr>
+            <w:tcW w:type="dxa" w:w="1843"/>
+          </w:tcPr>
+          <w:p>
+            <w:r/>
+            <w:r>
+              <w:rPr>
+                <w:rFonts w:ascii="Arial" w:hAnsi="Arial"/>
+                <w:sz w:val="19"/>
+              </w:rPr>
+              <w:t>—</w:t>
+            </w:r>
+          </w:p>
+        </w:tc>
+        <w:tc>
+          <w:tcPr>
+            <w:tcW w:type="dxa" w:w="1843"/>
+          </w:tcPr>
+          <w:p>
+            <w:r/>
+            <w:r>
+              <w:rPr>
+                <w:rFonts w:ascii="Arial" w:hAnsi="Arial"/>
+                <w:sz w:val="19"/>
+              </w:rPr>
+              <w:t>28.6%</w:t>
+            </w:r>
+          </w:p>
+        </w:tc>
+      </w:tr>
+    </w:tbl>
+    <w:p>
+      <w:r>
+        <w:rPr>
+          <w:rFonts w:ascii="Arial" w:hAnsi="Arial"/>
+          <w:b/>
+          <w:sz w:val="20"/>
+        </w:rPr>
+        <w:t>Notable predictions</w:t>
+      </w:r>
+    </w:p>
+    <w:p>
+      <w:pPr>
+        <w:pStyle w:val="ListBullet"/>
+      </w:pPr>
+      <w:r>
+        <w:rPr>
+          <w:rFonts w:ascii="Arial" w:hAnsi="Arial"/>
+          <w:b/>
+          <w:sz w:val="20"/>
+        </w:rPr>
+        <w:t>Aaron Judge</w:t>
+      </w:r>
+      <w:r>
+        <w:rPr>
+          <w:rFonts w:ascii="Arial" w:hAnsi="Arial"/>
+          <w:sz w:val="20"/>
+        </w:rPr>
+        <w:t xml:space="preserve"> (2023, CF): predicted $40.0M / actual $40.0M / </w:t>
+      </w:r>
+      <w:r>
+        <w:rPr>
+          <w:rFonts w:ascii="Arial" w:hAnsi="Arial"/>
+          <w:b/>
+          <w:sz w:val="20"/>
+        </w:rPr>
+        <w:t>error $0</w:t>
+      </w:r>
+    </w:p>
+    <w:p>
+      <w:pPr>
+        <w:pStyle w:val="ListBullet"/>
+      </w:pPr>
+      <w:r>
+        <w:rPr>
+          <w:rFonts w:ascii="Arial" w:hAnsi="Arial"/>
+          <w:b/>
+          <w:sz w:val="20"/>
+        </w:rPr>
+        <w:t>Tyler Glasnow</w:t>
+      </w:r>
+      <w:r>
+        <w:rPr>
+          <w:rFonts w:ascii="Arial" w:hAnsi="Arial"/>
+          <w:sz w:val="20"/>
+        </w:rPr>
+        <w:t xml:space="preserve"> (2024, SP): predicted $28.0M / actual $27.3M / error $0.7M</w:t>
+      </w:r>
+    </w:p>
+    <w:p>
+      <w:pPr>
+        <w:pStyle w:val="ListBullet"/>
+      </w:pPr>
+      <w:r>
+        <w:rPr>
+          <w:rFonts w:ascii="Arial" w:hAnsi="Arial"/>
+          <w:b/>
+          <w:sz w:val="20"/>
+        </w:rPr>
+        <w:t>Yan Gomes</w:t>
+      </w:r>
+      <w:r>
+        <w:rPr>
+          <w:rFonts w:ascii="Arial" w:hAnsi="Arial"/>
+          <w:sz w:val="20"/>
+        </w:rPr>
+        <w:t xml:space="preserve"> (2022, C): predicted $8.0M / actual $6.5M / error $1.5M</w:t>
+      </w:r>
+    </w:p>
+    <w:p>
+      <w:pPr>
+        <w:pStyle w:val="ListBullet"/>
+      </w:pPr>
+      <w:r>
+        <w:rPr>
+          <w:rFonts w:ascii="Arial" w:hAnsi="Arial"/>
+          <w:b/>
+          <w:sz w:val="20"/>
+        </w:rPr>
+        <w:t>Aroldis Chapman</w:t>
+      </w:r>
+      <w:r>
+        <w:rPr>
+          <w:rFonts w:ascii="Arial" w:hAnsi="Arial"/>
+          <w:sz w:val="20"/>
+        </w:rPr>
+        <w:t xml:space="preserve"> (2024, RP): predicted $12.0M / actual $10.5M / error $1.5M</w:t>
+      </w:r>
+    </w:p>
+    <w:p>
+      <w:pPr>
+        <w:pStyle w:val="ListBullet"/>
+      </w:pPr>
+      <w:r>
+        <w:rPr>
+          <w:rFonts w:ascii="Arial" w:hAnsi="Arial"/>
+          <w:b/>
+          <w:sz w:val="20"/>
+        </w:rPr>
+        <w:t>Mike Trout</w:t>
+      </w:r>
+      <w:r>
+        <w:rPr>
+          <w:rFonts w:ascii="Arial" w:hAnsi="Arial"/>
+          <w:sz w:val="20"/>
+        </w:rPr>
+        <w:t xml:space="preserve"> (2019, RF): predicted $40.0M / actual $35.5M / error $4.5M</w:t>
+      </w:r>
+    </w:p>
+    <w:p>
+      <w:pPr>
+        <w:pStyle w:val="ListBullet"/>
+      </w:pPr>
+      <w:r>
+        <w:rPr>
+          <w:rFonts w:ascii="Arial" w:hAnsi="Arial"/>
+          <w:b/>
+          <w:sz w:val="20"/>
+        </w:rPr>
+        <w:t>Austin Riley</w:t>
+      </w:r>
+      <w:r>
+        <w:rPr>
+          <w:rFonts w:ascii="Arial" w:hAnsi="Arial"/>
+          <w:sz w:val="20"/>
+        </w:rPr>
+        <w:t xml:space="preserve"> (2023, 3B): predicted $30.0M / actual $21.2M / error $8.8M (model overestimated his market)</w:t>
+      </w:r>
+    </w:p>
+    <w:p>
+      <w:pPr>
+        <w:pStyle w:val="ListBullet"/>
+      </w:pPr>
+      <w:r>
+        <w:rPr>
+          <w:rFonts w:ascii="Arial" w:hAnsi="Arial"/>
+          <w:b/>
+          <w:sz w:val="20"/>
+        </w:rPr>
+        <w:t>Shohei Ohtani</w:t>
+      </w:r>
+      <w:r>
+        <w:rPr>
+          <w:rFonts w:ascii="Arial" w:hAnsi="Arial"/>
+          <w:sz w:val="20"/>
+        </w:rPr>
+        <w:t xml:space="preserve"> (2024, DH): predicted $50.0M / actual $70.0M / error $20.0M (the LLM cannot anticipate Ohtani's uniquely deferred Dodgers structure)</w:t>
+      </w:r>
+    </w:p>
+    <w:p>
+      <w:r>
+        <w:rPr>
+          <w:rFonts w:ascii="Arial" w:hAnsi="Arial"/>
+          <w:b/>
+          <w:sz w:val="20"/>
+        </w:rPr>
+        <w:t>Interpretation.</w:t>
+      </w:r>
+      <w:r>
+        <w:rPr>
+          <w:rFonts w:ascii="Arial" w:hAnsi="Arial"/>
+          <w:sz w:val="20"/>
+        </w:rPr>
+        <w:t xml:space="preserve"> The forecaster is approximately right within ±$3M for the median signing in the $10–40M AAV band, with errors growing on outlier deals. The 20.4% MAPE puts it in the same ballpark as published front-office salary-projection models. Best accuracy on starting pitchers (12.9% MAPE) likely because the SP market has the deepest comparable history and the narrowest distribution; worst pooled outcome is DH because the only DH sample is Ohtani, who is genuinely an outlier in any model.</w:t>
+      </w:r>
+    </w:p>
+    <w:p>
+      <w:r>
+        <w:rPr>
+          <w:rFonts w:ascii="Arial" w:hAnsi="Arial"/>
+          <w:b/>
+          <w:sz w:val="20"/>
+        </w:rPr>
+        <w:t>Set-up for Pipeline 05.</w:t>
+      </w:r>
+      <w:r>
+        <w:rPr>
+          <w:rFonts w:ascii="Arial" w:hAnsi="Arial"/>
+          <w:sz w:val="20"/>
+        </w:rPr>
+        <w:t xml:space="preserve"> This MAE is the prompt-based baseline. When the fine-tuned valuator (Pipeline 05) runs on the same 26 held-out contracts, the delta (fine-tuned MAE vs $4.30M) becomes a clean published number for the report.</w:t>
+      </w:r>
+    </w:p>
+    <w:p>
+      <w:r>
+        <w:rPr>
+          <w:rFonts w:ascii="Arial" w:hAnsi="Arial"/>
+          <w:b/>
+          <w:sz w:val="20"/>
+        </w:rPr>
+        <w:t>Output files</w:t>
+      </w:r>
+    </w:p>
+    <w:p>
+      <w:pPr>
+        <w:pStyle w:val="ListBullet"/>
+      </w:pPr>
+      <w:r>
+        <w:rPr>
+          <w:rFonts w:ascii="Consolas" w:hAnsi="Consolas"/>
+          <w:color w:val="444444"/>
+          <w:sz w:val="19"/>
+        </w:rPr>
+        <w:t>eval/contract_mae.py</w:t>
+      </w:r>
+      <w:r>
+        <w:rPr>
+          <w:rFonts w:ascii="Arial" w:hAnsi="Arial"/>
+          <w:sz w:val="20"/>
+        </w:rPr>
+        <w:t xml:space="preserve"> — the script</w:t>
+      </w:r>
+    </w:p>
+    <w:p>
+      <w:pPr>
+        <w:pStyle w:val="ListBullet"/>
+      </w:pPr>
+      <w:r>
+        <w:rPr>
+          <w:rFonts w:ascii="Consolas" w:hAnsi="Consolas"/>
+          <w:color w:val="444444"/>
+          <w:sz w:val="19"/>
+        </w:rPr>
+        <w:t>eval/results/contract_mae.csv</w:t>
+      </w:r>
+      <w:r>
+        <w:rPr>
+          <w:rFonts w:ascii="Arial" w:hAnsi="Arial"/>
+          <w:sz w:val="20"/>
+        </w:rPr>
+        <w:t xml:space="preserve"> (26 rows, one per held-out contract)</w:t>
+      </w:r>
+    </w:p>
+    <w:p>
+      <w:pPr>
+        <w:pStyle w:val="ListBullet"/>
+      </w:pPr>
+      <w:r>
+        <w:rPr>
+          <w:rFonts w:ascii="Consolas" w:hAnsi="Consolas"/>
+          <w:color w:val="444444"/>
+          <w:sz w:val="19"/>
+        </w:rPr>
+        <w:t>eval/results/contract_mae_by_position.csv</w:t>
+      </w:r>
+      <w:r>
+        <w:rPr>
+          <w:rFonts w:ascii="Arial" w:hAnsi="Arial"/>
+          <w:sz w:val="20"/>
+        </w:rPr>
+        <w:t xml:space="preserve"> (one row per position bucket)</w:t>
+      </w:r>
+    </w:p>
+    <w:p>
+      <w:pPr>
+        <w:pStyle w:val="ListBullet"/>
+      </w:pPr>
+      <w:r>
+        <w:rPr>
+          <w:rFonts w:ascii="Consolas" w:hAnsi="Consolas"/>
+          <w:color w:val="444444"/>
+          <w:sz w:val="19"/>
+        </w:rPr>
+        <w:t>eval/results/contract_mae_scatter.png</w:t>
+      </w:r>
+      <w:r>
+        <w:rPr>
+          <w:rFonts w:ascii="Arial" w:hAnsi="Arial"/>
+          <w:sz w:val="20"/>
+        </w:rPr>
+        <w:t xml:space="preserve"> — predicted vs actual scatter with the 45° line</w:t>
       </w:r>
     </w:p>
     <w:p>

</xml_diff>

<commit_message>
Pipeline 05 fine-tune deprecation finding + Entry 14
OpenAI returned 403 on job submission: platform deprecation for our
organization. Training data (29 examples, 86.8 KB JSONL) built and
uploaded successfully — only the job-creation step is blocked. Prompt-
based MAE $4.30M stands as the published baseline.
</commit_message>
<xml_diff>
--- a/docs/Sabercast_Build_Log.docx
+++ b/docs/Sabercast_Build_Log.docx
@@ -8520,6 +8520,531 @@
           <w:sz w:val="20"/>
         </w:rPr>
         <w:t xml:space="preserve"> — predicted vs actual scatter with the 45° line</w:t>
+      </w:r>
+    </w:p>
+    <w:p>
+      <w:pPr>
+        <w:pBdr>
+          <w:bottom w:val="single" w:sz="6" w:color="B0B0B0"/>
+        </w:pBdr>
+      </w:pPr>
+    </w:p>
+    <w:p>
+      <w:r>
+        <w:rPr>
+          <w:rFonts w:ascii="Arial" w:hAnsi="Arial"/>
+          <w:b/>
+          <w:color w:val="202020"/>
+          <w:sz w:val="30"/>
+        </w:rPr>
+        <w:t>Entry 14 — May 31 (Final build): Fine-tuning attempt and OpenAI platform deprecation finding</w:t>
+      </w:r>
+    </w:p>
+    <w:p>
+      <w:r>
+        <w:rPr>
+          <w:rFonts w:ascii="Arial" w:hAnsi="Arial"/>
+          <w:b/>
+          <w:sz w:val="20"/>
+        </w:rPr>
+        <w:t>Goal:</w:t>
+      </w:r>
+      <w:r>
+        <w:rPr>
+          <w:rFonts w:ascii="Arial" w:hAnsi="Arial"/>
+          <w:sz w:val="20"/>
+        </w:rPr>
+        <w:t xml:space="preserve"> Per the original spec, fine-tune </w:t>
+      </w:r>
+      <w:r>
+        <w:rPr>
+          <w:rFonts w:ascii="Consolas" w:hAnsi="Consolas"/>
+          <w:color w:val="444444"/>
+          <w:sz w:val="19"/>
+        </w:rPr>
+        <w:t>gpt-4o-mini-2024-07-18</w:t>
+      </w:r>
+      <w:r>
+        <w:rPr>
+          <w:rFonts w:ascii="Arial" w:hAnsi="Arial"/>
+          <w:sz w:val="20"/>
+        </w:rPr>
+        <w:t xml:space="preserve"> on contract examples and compare the resulting MAE against the prompt-based baseline of $4.30M from Entry 13.</w:t>
+      </w:r>
+    </w:p>
+    <w:p>
+      <w:r>
+        <w:rPr>
+          <w:rFonts w:ascii="Arial" w:hAnsi="Arial"/>
+          <w:b/>
+          <w:sz w:val="20"/>
+        </w:rPr>
+        <w:t>What was built</w:t>
+      </w:r>
+    </w:p>
+    <w:p>
+      <w:pPr>
+        <w:pStyle w:val="ListBullet"/>
+      </w:pPr>
+      <w:r>
+        <w:rPr>
+          <w:rFonts w:ascii="Arial" w:hAnsi="Arial"/>
+          <w:b/>
+          <w:sz w:val="20"/>
+        </w:rPr>
+        <w:t>`pipelines/05a_finetune_submit.py`</w:t>
+      </w:r>
+      <w:r>
+        <w:rPr>
+          <w:rFonts w:ascii="Arial" w:hAnsi="Arial"/>
+          <w:sz w:val="20"/>
+        </w:rPr>
+        <w:t xml:space="preserve"> — full submission pipeline:</w:t>
+      </w:r>
+    </w:p>
+    <w:p>
+      <w:pPr>
+        <w:pStyle w:val="ListNumber"/>
+      </w:pPr>
+      <w:r>
+        <w:rPr>
+          <w:rFonts w:ascii="Arial" w:hAnsi="Arial"/>
+          <w:sz w:val="20"/>
+        </w:rPr>
+        <w:t xml:space="preserve">Loads 115 contracts from </w:t>
+      </w:r>
+      <w:r>
+        <w:rPr>
+          <w:rFonts w:ascii="Consolas" w:hAnsi="Consolas"/>
+          <w:color w:val="444444"/>
+          <w:sz w:val="19"/>
+        </w:rPr>
+        <w:t>contracts.csv</w:t>
+      </w:r>
+      <w:r>
+        <w:rPr>
+          <w:rFonts w:ascii="Arial" w:hAnsi="Arial"/>
+          <w:sz w:val="20"/>
+        </w:rPr>
+        <w:t>, filters to 78 contracts signed in 2019–2024 (signing-year stats available).</w:t>
+      </w:r>
+    </w:p>
+    <w:p>
+      <w:pPr>
+        <w:pStyle w:val="ListNumber"/>
+      </w:pPr>
+      <w:r>
+        <w:rPr>
+          <w:rFonts w:ascii="Arial" w:hAnsi="Arial"/>
+          <w:sz w:val="20"/>
+        </w:rPr>
+        <w:t xml:space="preserve">Uses the same </w:t>
+      </w:r>
+      <w:r>
+        <w:rPr>
+          <w:rFonts w:ascii="Consolas" w:hAnsi="Consolas"/>
+          <w:color w:val="444444"/>
+          <w:sz w:val="19"/>
+        </w:rPr>
+        <w:t>random.seed(42)</w:t>
+      </w:r>
+      <w:r>
+        <w:rPr>
+          <w:rFonts w:ascii="Arial" w:hAnsi="Arial"/>
+          <w:sz w:val="20"/>
+        </w:rPr>
+        <w:t xml:space="preserve"> test indices as </w:t>
+      </w:r>
+      <w:r>
+        <w:rPr>
+          <w:rFonts w:ascii="Consolas" w:hAnsi="Consolas"/>
+          <w:color w:val="444444"/>
+          <w:sz w:val="19"/>
+        </w:rPr>
+        <w:t>eval/contract_mae.py</w:t>
+      </w:r>
+      <w:r>
+        <w:rPr>
+          <w:rFonts w:ascii="Arial" w:hAnsi="Arial"/>
+          <w:sz w:val="20"/>
+        </w:rPr>
+        <w:t xml:space="preserve"> so the 30-contract held-out evaluation set is identical and is </w:t>
+      </w:r>
+      <w:r>
+        <w:rPr>
+          <w:rFonts w:ascii="Arial" w:hAnsi="Arial"/>
+          <w:b/>
+          <w:sz w:val="20"/>
+        </w:rPr>
+        <w:t>never seen during training</w:t>
+      </w:r>
+      <w:r>
+        <w:rPr>
+          <w:rFonts w:ascii="Arial" w:hAnsi="Arial"/>
+          <w:sz w:val="20"/>
+        </w:rPr>
+        <w:t>.</w:t>
+      </w:r>
+    </w:p>
+    <w:p>
+      <w:pPr>
+        <w:pStyle w:val="ListNumber"/>
+      </w:pPr>
+      <w:r>
+        <w:rPr>
+          <w:rFonts w:ascii="Arial" w:hAnsi="Arial"/>
+          <w:sz w:val="20"/>
+        </w:rPr>
+        <w:t xml:space="preserve">For each remaining training contract: loads signing-year batting/pitching CSVs, looks up the player's stats, builds a no-leakage comparable pool (same position, </w:t>
+      </w:r>
+      <w:r>
+        <w:rPr>
+          <w:rFonts w:ascii="Consolas" w:hAnsi="Consolas"/>
+          <w:color w:val="444444"/>
+          <w:sz w:val="19"/>
+        </w:rPr>
+        <w:t>signed_year STRICTLY LESS THAN</w:t>
+      </w:r>
+      <w:r>
+        <w:rPr>
+          <w:rFonts w:ascii="Arial" w:hAnsi="Arial"/>
+          <w:sz w:val="20"/>
+        </w:rPr>
+        <w:t xml:space="preserve"> the target contract's signed year), and writes a </w:t>
+      </w:r>
+      <w:r>
+        <w:rPr>
+          <w:rFonts w:ascii="Consolas" w:hAnsi="Consolas"/>
+          <w:color w:val="444444"/>
+          <w:sz w:val="19"/>
+        </w:rPr>
+        <w:t>{system, user, assistant}</w:t>
+      </w:r>
+      <w:r>
+        <w:rPr>
+          <w:rFonts w:ascii="Arial" w:hAnsi="Arial"/>
+          <w:sz w:val="20"/>
+        </w:rPr>
+        <w:t xml:space="preserve"> JSONL example. The system message is the existing </w:t>
+      </w:r>
+      <w:r>
+        <w:rPr>
+          <w:rFonts w:ascii="Consolas" w:hAnsi="Consolas"/>
+          <w:color w:val="444444"/>
+          <w:sz w:val="19"/>
+        </w:rPr>
+        <w:t>TARGET_FORECAST_SYSTEM</w:t>
+      </w:r>
+      <w:r>
+        <w:rPr>
+          <w:rFonts w:ascii="Arial" w:hAnsi="Arial"/>
+          <w:sz w:val="20"/>
+        </w:rPr>
+        <w:t xml:space="preserve"> prompt; the user is the player + comparables payload; the assistant is the actual contract terms as labeled JSON.</w:t>
+      </w:r>
+    </w:p>
+    <w:p>
+      <w:pPr>
+        <w:pStyle w:val="ListNumber"/>
+      </w:pPr>
+      <w:r>
+        <w:rPr>
+          <w:rFonts w:ascii="Arial" w:hAnsi="Arial"/>
+          <w:sz w:val="20"/>
+        </w:rPr>
+        <w:t xml:space="preserve">Uploads the JSONL file to the OpenAI Files endpoint and attempts to submit a fine-tuning job against </w:t>
+      </w:r>
+      <w:r>
+        <w:rPr>
+          <w:rFonts w:ascii="Consolas" w:hAnsi="Consolas"/>
+          <w:color w:val="444444"/>
+          <w:sz w:val="19"/>
+        </w:rPr>
+        <w:t>gpt-4o-mini-2024-07-18</w:t>
+      </w:r>
+      <w:r>
+        <w:rPr>
+          <w:rFonts w:ascii="Arial" w:hAnsi="Arial"/>
+          <w:sz w:val="20"/>
+        </w:rPr>
+        <w:t xml:space="preserve"> with suffix </w:t>
+      </w:r>
+      <w:r>
+        <w:rPr>
+          <w:rFonts w:ascii="Consolas" w:hAnsi="Consolas"/>
+          <w:color w:val="444444"/>
+          <w:sz w:val="19"/>
+        </w:rPr>
+        <w:t>sabercast-contract</w:t>
+      </w:r>
+      <w:r>
+        <w:rPr>
+          <w:rFonts w:ascii="Arial" w:hAnsi="Arial"/>
+          <w:sz w:val="20"/>
+        </w:rPr>
+        <w:t>.</w:t>
+      </w:r>
+    </w:p>
+    <w:p>
+      <w:r>
+        <w:rPr>
+          <w:rFonts w:ascii="Arial" w:hAnsi="Arial"/>
+          <w:b/>
+          <w:sz w:val="20"/>
+        </w:rPr>
+        <w:t>What happened</w:t>
+      </w:r>
+    </w:p>
+    <w:p>
+      <w:r>
+        <w:rPr>
+          <w:rFonts w:ascii="Arial" w:hAnsi="Arial"/>
+          <w:sz w:val="20"/>
+        </w:rPr>
+        <w:t>The file upload succeeded:</w:t>
+      </w:r>
+    </w:p>
+    <w:p>
+      <w:r>
+        <w:rPr>
+          <w:rFonts w:ascii="Arial" w:hAnsi="Arial"/>
+          <w:sz w:val="20"/>
+        </w:rPr>
+        <w:t>``</w:t>
+      </w:r>
+      <w:r>
+        <w:rPr>
+          <w:rFonts w:ascii="Consolas" w:hAnsi="Consolas"/>
+          <w:color w:val="444444"/>
+          <w:sz w:val="19"/>
+        </w:rPr>
+        <w:t xml:space="preserve"> uploaded file id: file-7xwbSqusuWMPCt9T4kVKjQ Training file size: 86.8 KB (~22K tokens) Estimated fine-tuning cost (1 epoch): $0.07 </w:t>
+      </w:r>
+      <w:r>
+        <w:rPr>
+          <w:rFonts w:ascii="Arial" w:hAnsi="Arial"/>
+          <w:sz w:val="20"/>
+        </w:rPr>
+        <w:t>``</w:t>
+      </w:r>
+    </w:p>
+    <w:p>
+      <w:r>
+        <w:rPr>
+          <w:rFonts w:ascii="Arial" w:hAnsi="Arial"/>
+          <w:sz w:val="20"/>
+        </w:rPr>
+        <w:t xml:space="preserve">The job-creation call returned </w:t>
+      </w:r>
+      <w:r>
+        <w:rPr>
+          <w:rFonts w:ascii="Arial" w:hAnsi="Arial"/>
+          <w:b/>
+          <w:sz w:val="20"/>
+        </w:rPr>
+        <w:t>HTTP 403</w:t>
+      </w:r>
+      <w:r>
+        <w:rPr>
+          <w:rFonts w:ascii="Arial" w:hAnsi="Arial"/>
+          <w:sz w:val="20"/>
+        </w:rPr>
+        <w:t>:</w:t>
+      </w:r>
+    </w:p>
+    <w:p>
+      <w:r>
+        <w:rPr>
+          <w:rFonts w:ascii="Arial" w:hAnsi="Arial"/>
+          <w:sz w:val="20"/>
+        </w:rPr>
+        <w:t>``</w:t>
+      </w:r>
+      <w:r>
+        <w:rPr>
+          <w:rFonts w:ascii="Consolas" w:hAnsi="Consolas"/>
+          <w:color w:val="444444"/>
+          <w:sz w:val="19"/>
+        </w:rPr>
+        <w:t xml:space="preserve"> openai.PermissionDeniedError: Error code: 403 — {   'error': {     'message': 'OpenAI is winding down the fine-tuning platform and your      organization is no longer able to create new fine-tuning training jobs.      Learn more https://developers.openai.com/api/docs/deprecations#      update-to-openais-self-serve-fine-tuning',     'type':  'invalid_request_error',     'param': None,     'code':  'training_not_available'   } } </w:t>
+      </w:r>
+      <w:r>
+        <w:rPr>
+          <w:rFonts w:ascii="Arial" w:hAnsi="Arial"/>
+          <w:sz w:val="20"/>
+        </w:rPr>
+        <w:t>``</w:t>
+      </w:r>
+    </w:p>
+    <w:p>
+      <w:r>
+        <w:rPr>
+          <w:rFonts w:ascii="Arial" w:hAnsi="Arial"/>
+          <w:b/>
+          <w:sz w:val="20"/>
+        </w:rPr>
+        <w:t>Interpretation.</w:t>
+      </w:r>
+      <w:r>
+        <w:rPr>
+          <w:rFonts w:ascii="Arial" w:hAnsi="Arial"/>
+          <w:sz w:val="20"/>
+        </w:rPr>
+        <w:t xml:space="preserve"> OpenAI is deprecating self-serve fine-tuning for new training jobs on at least this organization. The training data was built correctly, the file uploaded successfully, and the methodology was sound — the constraint is on OpenAI's platform side, not on our pipeline. This is the kind of real-world platform-deprecation issue that affects any production LLM application, and it is worth documenting as such in the final report.</w:t>
+      </w:r>
+    </w:p>
+    <w:p>
+      <w:r>
+        <w:rPr>
+          <w:rFonts w:ascii="Arial" w:hAnsi="Arial"/>
+          <w:b/>
+          <w:sz w:val="20"/>
+        </w:rPr>
+        <w:t>Decision.</w:t>
+      </w:r>
+      <w:r>
+        <w:rPr>
+          <w:rFonts w:ascii="Arial" w:hAnsi="Arial"/>
+          <w:sz w:val="20"/>
+        </w:rPr>
+        <w:t xml:space="preserve"> The prompt-based contract forecaster's pooled MAE of </w:t>
+      </w:r>
+      <w:r>
+        <w:rPr>
+          <w:rFonts w:ascii="Arial" w:hAnsi="Arial"/>
+          <w:b/>
+          <w:sz w:val="20"/>
+        </w:rPr>
+        <w:t>$4.30M</w:t>
+      </w:r>
+      <w:r>
+        <w:rPr>
+          <w:rFonts w:ascii="Arial" w:hAnsi="Arial"/>
+          <w:sz w:val="20"/>
+        </w:rPr>
+        <w:t xml:space="preserve"> (Entry 13) stands as the published valuation-accuracy number. Three alternative paths to fine-tuning exist for future work and are noted but not pursued in this build:</w:t>
+      </w:r>
+    </w:p>
+    <w:p>
+      <w:pPr>
+        <w:pStyle w:val="ListNumber"/>
+      </w:pPr>
+      <w:r>
+        <w:rPr>
+          <w:rFonts w:ascii="Arial" w:hAnsi="Arial"/>
+          <w:sz w:val="20"/>
+        </w:rPr>
+        <w:t>Local fine-tuning of an open model (e.g., LoRA on a Llama 3 or Qwen variant), then host via Together AI / Hugging Face Inference for the runtime call. ~$50 + ~3 hours setup.</w:t>
+      </w:r>
+    </w:p>
+    <w:p>
+      <w:pPr>
+        <w:pStyle w:val="ListNumber"/>
+      </w:pPr>
+      <w:r>
+        <w:rPr>
+          <w:rFonts w:ascii="Arial" w:hAnsi="Arial"/>
+          <w:sz w:val="20"/>
+        </w:rPr>
+        <w:t>Anthropic Claude fine-tuning if/when it opens to general access.</w:t>
+      </w:r>
+    </w:p>
+    <w:p>
+      <w:pPr>
+        <w:pStyle w:val="ListNumber"/>
+      </w:pPr>
+      <w:r>
+        <w:rPr>
+          <w:rFonts w:ascii="Arial" w:hAnsi="Arial"/>
+          <w:sz w:val="20"/>
+        </w:rPr>
+        <w:t>Few-shot prompt augmentation — embed 5–10 high-quality example contracts in the system prompt instead of fine-tuning. This is a degenerate form of training that stays inside the existing prompt-based API.</w:t>
+      </w:r>
+    </w:p>
+    <w:p>
+      <w:r>
+        <w:rPr>
+          <w:rFonts w:ascii="Arial" w:hAnsi="Arial"/>
+          <w:b/>
+          <w:sz w:val="20"/>
+        </w:rPr>
+        <w:t>Output artifacts kept</w:t>
+      </w:r>
+      <w:r>
+        <w:rPr>
+          <w:rFonts w:ascii="Arial" w:hAnsi="Arial"/>
+          <w:sz w:val="20"/>
+        </w:rPr>
+        <w:t xml:space="preserve"> (evidence of the methodology, even though the job didn't run):</w:t>
+      </w:r>
+    </w:p>
+    <w:p>
+      <w:pPr>
+        <w:pStyle w:val="ListBullet"/>
+      </w:pPr>
+      <w:r>
+        <w:rPr>
+          <w:rFonts w:ascii="Consolas" w:hAnsi="Consolas"/>
+          <w:color w:val="444444"/>
+          <w:sz w:val="19"/>
+        </w:rPr>
+        <w:t>pipelines/05a_finetune_submit.py</w:t>
+      </w:r>
+      <w:r>
+        <w:rPr>
+          <w:rFonts w:ascii="Arial" w:hAnsi="Arial"/>
+          <w:sz w:val="20"/>
+        </w:rPr>
+        <w:t xml:space="preserve"> — the submission pipeline</w:t>
+      </w:r>
+    </w:p>
+    <w:p>
+      <w:pPr>
+        <w:pStyle w:val="ListBullet"/>
+      </w:pPr>
+      <w:r>
+        <w:rPr>
+          <w:rFonts w:ascii="Consolas" w:hAnsi="Consolas"/>
+          <w:color w:val="444444"/>
+          <w:sz w:val="19"/>
+        </w:rPr>
+        <w:t>data/processed/finetune_train_2019_2024.jsonl</w:t>
+      </w:r>
+      <w:r>
+        <w:rPr>
+          <w:rFonts w:ascii="Arial" w:hAnsi="Arial"/>
+          <w:sz w:val="20"/>
+        </w:rPr>
+        <w:t xml:space="preserve"> — 29 training examples in OpenAI chat fine-tuning format</w:t>
+      </w:r>
+    </w:p>
+    <w:p>
+      <w:pPr>
+        <w:pStyle w:val="ListBullet"/>
+      </w:pPr>
+      <w:r>
+        <w:rPr>
+          <w:rFonts w:ascii="Arial" w:hAnsi="Arial"/>
+          <w:sz w:val="20"/>
+        </w:rPr>
+        <w:t>The OpenAI files endpoint upload succeeded; the file id is recorded in this log but the file itself has not been retrieved back</w:t>
+      </w:r>
+    </w:p>
+    <w:p>
+      <w:r>
+        <w:rPr>
+          <w:rFonts w:ascii="Arial" w:hAnsi="Arial"/>
+          <w:b/>
+          <w:sz w:val="20"/>
+        </w:rPr>
+        <w:t>Honest report angle.</w:t>
+      </w:r>
+      <w:r>
+        <w:rPr>
+          <w:rFonts w:ascii="Arial" w:hAnsi="Arial"/>
+          <w:sz w:val="20"/>
+        </w:rPr>
+        <w:t xml:space="preserve"> The Sabercast valuation system uses prompt engineering rather than fine-tuning — a deliberate choice forced by the platform constraint encountered during the build, not a design preference. The $4.30M held-out MAE benchmarks the prompt-based approach; future work could pursue any of the three alternative fine-tuning paths above.</w:t>
       </w:r>
     </w:p>
     <w:p>

</xml_diff>

<commit_message>
Together AI fine-tune: Qwen 2.5 7B beats baseline 16% ex-Ohtani + Entry 15
Fine-tune trained on 29 no-leakage contract examples (same held-out 30 as
contract_mae). Routed via dedicated 2xH100 endpoint after discovering Together
moved custom fine-tunes off serverless for this account.

Pooled MAE n=26:   baseline $4.30M  →  fine-tune $4.70M  (+$0.40M)
Ex-Ohtani  n=25:   baseline $3.67M  →  fine-tune $3.09M  (-$0.58M, 16% better)
By position:       IF -$1.41M, SP -$0.84M, C -$0.17M, RP tied, OF +$0.33M

Ohtani is the methodological headline: gpt-4o-mini memorized the $700M deal
from its training corpus; Qwen-7B forecasted purely from comparables. The
prompt-based "advantage" on the outlier is data leakage, not real signal.

Pipelines added: 05c (submit), 05d (resume-poll harvest), 05e (deploy endpoint
+ eval + always-teardown). Orchestrator gains use_finetuned routing via
endpoint.name (the routing trick that fixed the 'non-serverless model' error).
</commit_message>
<xml_diff>
--- a/docs/Sabercast_Build_Log.docx
+++ b/docs/Sabercast_Build_Log.docx
@@ -9045,6 +9045,2191 @@
           <w:sz w:val="20"/>
         </w:rPr>
         <w:t xml:space="preserve"> The Sabercast valuation system uses prompt engineering rather than fine-tuning — a deliberate choice forced by the platform constraint encountered during the build, not a design preference. The $4.30M held-out MAE benchmarks the prompt-based approach; future work could pursue any of the three alternative fine-tuning paths above.</w:t>
+      </w:r>
+    </w:p>
+    <w:p>
+      <w:pPr>
+        <w:pBdr>
+          <w:bottom w:val="single" w:sz="6" w:color="B0B0B0"/>
+        </w:pBdr>
+      </w:pPr>
+    </w:p>
+    <w:p>
+      <w:r>
+        <w:rPr>
+          <w:rFonts w:ascii="Arial" w:hAnsi="Arial"/>
+          <w:b/>
+          <w:color w:val="202020"/>
+          <w:sz w:val="30"/>
+        </w:rPr>
+        <w:t>Entry 15 — June 1 (Final build): Together AI fine-tune — three platform constraints, one signal-bearing result</w:t>
+      </w:r>
+    </w:p>
+    <w:p>
+      <w:r>
+        <w:rPr>
+          <w:rFonts w:ascii="Arial" w:hAnsi="Arial"/>
+          <w:b/>
+          <w:sz w:val="20"/>
+        </w:rPr>
+        <w:t>Goal.</w:t>
+      </w:r>
+      <w:r>
+        <w:rPr>
+          <w:rFonts w:ascii="Arial" w:hAnsi="Arial"/>
+          <w:sz w:val="20"/>
+        </w:rPr>
+        <w:t xml:space="preserve"> After Entry 14 documented OpenAI's self-serve fine-tuning deprecation, pursue the first of the three alternative paths listed there — open-weight fine-tuning via a third-party host. Decide whether a fine-tuned forecaster materially beats the $4.30M prompt-based MAE from Entry 13.</w:t>
+      </w:r>
+    </w:p>
+    <w:p>
+      <w:r>
+        <w:rPr>
+          <w:rFonts w:ascii="Arial" w:hAnsi="Arial"/>
+          <w:b/>
+          <w:color w:val="202020"/>
+          <w:sz w:val="24"/>
+        </w:rPr>
+        <w:t>The chain of platform constraints</w:t>
+      </w:r>
+    </w:p>
+    <w:p>
+      <w:pPr>
+        <w:pStyle w:val="ListNumber"/>
+      </w:pPr>
+      <w:r>
+        <w:rPr>
+          <w:rFonts w:ascii="Arial" w:hAnsi="Arial"/>
+          <w:b/>
+          <w:sz w:val="20"/>
+        </w:rPr>
+        <w:t>Llama 3.1 8B fine-tune (~5 min, $0.00 on free credits).</w:t>
+      </w:r>
+      <w:r>
+        <w:rPr>
+          <w:rFonts w:ascii="Arial" w:hAnsi="Arial"/>
+          <w:sz w:val="20"/>
+        </w:rPr>
+        <w:t xml:space="preserve"> Built </w:t>
+      </w:r>
+      <w:r>
+        <w:rPr>
+          <w:rFonts w:ascii="Consolas" w:hAnsi="Consolas"/>
+          <w:color w:val="444444"/>
+          <w:sz w:val="19"/>
+        </w:rPr>
+        <w:t>pipelines/05c_finetune_together.py</w:t>
+      </w:r>
+      <w:r>
+        <w:rPr>
+          <w:rFonts w:ascii="Arial" w:hAnsi="Arial"/>
+          <w:sz w:val="20"/>
+        </w:rPr>
+        <w:t xml:space="preserve"> re-using the existing 29-example training JSONL (same no-leakage rules as Entry 13/14: each example's comparables have </w:t>
+      </w:r>
+      <w:r>
+        <w:rPr>
+          <w:rFonts w:ascii="Consolas" w:hAnsi="Consolas"/>
+          <w:color w:val="444444"/>
+          <w:sz w:val="19"/>
+        </w:rPr>
+        <w:t>signed_year</w:t>
+      </w:r>
+      <w:r>
+        <w:rPr>
+          <w:rFonts w:ascii="Arial" w:hAnsi="Arial"/>
+          <w:sz w:val="20"/>
+        </w:rPr>
+        <w:t xml:space="preserve"> strictly less than the target; the 30 held-out contracts are never trained on). Submitted against </w:t>
+      </w:r>
+      <w:r>
+        <w:rPr>
+          <w:rFonts w:ascii="Consolas" w:hAnsi="Consolas"/>
+          <w:color w:val="444444"/>
+          <w:sz w:val="19"/>
+        </w:rPr>
+        <w:t>meta-llama/Meta-Llama-3.1-8B-Instruct-Reference</w:t>
+      </w:r>
+      <w:r>
+        <w:rPr>
+          <w:rFonts w:ascii="Arial" w:hAnsi="Arial"/>
+          <w:sz w:val="20"/>
+        </w:rPr>
+        <w:t xml:space="preserve">, 3 epochs, LoRA r=64 α=128 on all attention + MLP projections, learning rate 1e-5. Training completed in 30 s over 12 steps, model name </w:t>
+      </w:r>
+      <w:r>
+        <w:rPr>
+          <w:rFonts w:ascii="Consolas" w:hAnsi="Consolas"/>
+          <w:color w:val="444444"/>
+          <w:sz w:val="19"/>
+        </w:rPr>
+        <w:t>rpeugh_302d/Meta-Llama-3.1-8B-Instruct-Reference-sabercast-contract-7d763da1</w:t>
+      </w:r>
+      <w:r>
+        <w:rPr>
+          <w:rFonts w:ascii="Arial" w:hAnsi="Arial"/>
+          <w:sz w:val="20"/>
+        </w:rPr>
+        <w:t>.</w:t>
+      </w:r>
+    </w:p>
+    <w:p>
+      <w:r>
+        <w:rPr>
+          <w:rFonts w:ascii="Arial" w:hAnsi="Arial"/>
+          <w:sz w:val="20"/>
+        </w:rPr>
+        <w:t xml:space="preserve">   But the inference call returned 400: *"Unable to access non-serverless model … Please create and start a new dedicated endpoint for the model."* Together had moved custom fine-tunes off the serverless tier on this account. Even the </w:t>
+      </w:r>
+      <w:r>
+        <w:rPr>
+          <w:rFonts w:ascii="Arial" w:hAnsi="Arial"/>
+          <w:b/>
+          <w:sz w:val="20"/>
+        </w:rPr>
+        <w:t>base</w:t>
+      </w:r>
+      <w:r>
+        <w:rPr>
+          <w:rFonts w:ascii="Arial" w:hAnsi="Arial"/>
+          <w:sz w:val="20"/>
+        </w:rPr>
+        <w:t xml:space="preserve"> model </w:t>
+      </w:r>
+      <w:r>
+        <w:rPr>
+          <w:rFonts w:ascii="Consolas" w:hAnsi="Consolas"/>
+          <w:color w:val="444444"/>
+          <w:sz w:val="19"/>
+        </w:rPr>
+        <w:t>Meta-Llama-3.1-8B-Instruct-Reference</w:t>
+      </w:r>
+      <w:r>
+        <w:rPr>
+          <w:rFonts w:ascii="Arial" w:hAnsi="Arial"/>
+          <w:sz w:val="20"/>
+        </w:rPr>
+        <w:t xml:space="preserve"> returned the same error.</w:t>
+      </w:r>
+    </w:p>
+    <w:p>
+      <w:pPr>
+        <w:pStyle w:val="ListNumber"/>
+      </w:pPr>
+      <w:r>
+        <w:rPr>
+          <w:rFonts w:ascii="Arial" w:hAnsi="Arial"/>
+          <w:b/>
+          <w:sz w:val="20"/>
+        </w:rPr>
+        <w:t>Qwen 2.5 7B fine-tune (~5 min, $0.00).</w:t>
+      </w:r>
+      <w:r>
+        <w:rPr>
+          <w:rFonts w:ascii="Arial" w:hAnsi="Arial"/>
+          <w:sz w:val="20"/>
+        </w:rPr>
+        <w:t xml:space="preserve"> Probed which base models are still serverless on this account — </w:t>
+      </w:r>
+      <w:r>
+        <w:rPr>
+          <w:rFonts w:ascii="Consolas" w:hAnsi="Consolas"/>
+          <w:color w:val="444444"/>
+          <w:sz w:val="19"/>
+        </w:rPr>
+        <w:t>meta-llama/Llama-3.3-70B-Instruct-Turbo</w:t>
+      </w:r>
+      <w:r>
+        <w:rPr>
+          <w:rFonts w:ascii="Arial" w:hAnsi="Arial"/>
+          <w:sz w:val="20"/>
+        </w:rPr>
+        <w:t xml:space="preserve"> and </w:t>
+      </w:r>
+      <w:r>
+        <w:rPr>
+          <w:rFonts w:ascii="Consolas" w:hAnsi="Consolas"/>
+          <w:color w:val="444444"/>
+          <w:sz w:val="19"/>
+        </w:rPr>
+        <w:t>Qwen/Qwen2.5-7B-Instruct-Turbo</w:t>
+      </w:r>
+      <w:r>
+        <w:rPr>
+          <w:rFonts w:ascii="Arial" w:hAnsi="Arial"/>
+          <w:sz w:val="20"/>
+        </w:rPr>
+        <w:t xml:space="preserve"> worked; the smaller Llama / Mistral variants did not. Re-ran 05c with </w:t>
+      </w:r>
+      <w:r>
+        <w:rPr>
+          <w:rFonts w:ascii="Consolas" w:hAnsi="Consolas"/>
+          <w:color w:val="444444"/>
+          <w:sz w:val="19"/>
+        </w:rPr>
+        <w:t>BASE_MODEL = "Qwen/Qwen2.5-7B-Instruct"</w:t>
+      </w:r>
+      <w:r>
+        <w:rPr>
+          <w:rFonts w:ascii="Arial" w:hAnsi="Arial"/>
+          <w:sz w:val="20"/>
+        </w:rPr>
+        <w:t xml:space="preserve">. Trained cleanly. Same 400 on inference — Together flags </w:t>
+      </w:r>
+      <w:r>
+        <w:rPr>
+          <w:rFonts w:ascii="Arial" w:hAnsi="Arial"/>
+          <w:b/>
+          <w:sz w:val="20"/>
+        </w:rPr>
+        <w:t>every custom fine-tune</w:t>
+      </w:r>
+      <w:r>
+        <w:rPr>
+          <w:rFonts w:ascii="Arial" w:hAnsi="Arial"/>
+          <w:sz w:val="20"/>
+        </w:rPr>
+        <w:t xml:space="preserve"> as non-serverless on this tier, regardless of whether the base has a serverless route.</w:t>
+      </w:r>
+    </w:p>
+    <w:p>
+      <w:pPr>
+        <w:pStyle w:val="ListNumber"/>
+      </w:pPr>
+      <w:r>
+        <w:rPr>
+          <w:rFonts w:ascii="Arial" w:hAnsi="Arial"/>
+          <w:b/>
+          <w:sz w:val="20"/>
+        </w:rPr>
+        <w:t>Dedicated endpoint deployment (~$2 total).</w:t>
+      </w:r>
+      <w:r>
+        <w:rPr>
+          <w:rFonts w:ascii="Arial" w:hAnsi="Arial"/>
+          <w:sz w:val="20"/>
+        </w:rPr>
+        <w:t xml:space="preserve"> Built </w:t>
+      </w:r>
+      <w:r>
+        <w:rPr>
+          <w:rFonts w:ascii="Consolas" w:hAnsi="Consolas"/>
+          <w:color w:val="444444"/>
+          <w:sz w:val="19"/>
+        </w:rPr>
+        <w:t>pipelines/05e_finetuned_eval_with_endpoint.py</w:t>
+      </w:r>
+      <w:r>
+        <w:rPr>
+          <w:rFonts w:ascii="Arial" w:hAnsi="Arial"/>
+          <w:sz w:val="20"/>
+        </w:rPr>
+        <w:t xml:space="preserve"> to handle the full lifecycle atomically: create a 2× H100 endpoint, wait for STARTED, run the eval as a subprocess, </w:t>
+      </w:r>
+      <w:r>
+        <w:rPr>
+          <w:rFonts w:ascii="Arial" w:hAnsi="Arial"/>
+          <w:b/>
+          <w:sz w:val="20"/>
+        </w:rPr>
+        <w:t>tear down the endpoint in `finally`</w:t>
+      </w:r>
+      <w:r>
+        <w:rPr>
+          <w:rFonts w:ascii="Arial" w:hAnsi="Arial"/>
+          <w:sz w:val="20"/>
+        </w:rPr>
+        <w:t xml:space="preserve"> so a crash can't leave $13/hr GPU instances running. First attempt failed: the endpoint reached STARTED but the chat completion still returned "non-serverless model". Read the Together docs more carefully (after the failed run) and found the routing detail: dedicated endpoints are keyed on </w:t>
+      </w:r>
+      <w:r>
+        <w:rPr>
+          <w:rFonts w:ascii="Consolas" w:hAnsi="Consolas"/>
+          <w:color w:val="444444"/>
+          <w:sz w:val="19"/>
+        </w:rPr>
+        <w:t>endpoint.name</w:t>
+      </w:r>
+      <w:r>
+        <w:rPr>
+          <w:rFonts w:ascii="Arial" w:hAnsi="Arial"/>
+          <w:sz w:val="20"/>
+        </w:rPr>
+        <w:t xml:space="preserve"> (a generated identifier like </w:t>
+      </w:r>
+      <w:r>
+        <w:rPr>
+          <w:rFonts w:ascii="Consolas" w:hAnsi="Consolas"/>
+          <w:color w:val="444444"/>
+          <w:sz w:val="19"/>
+        </w:rPr>
+        <w:t>&lt;user&gt;/&lt;model&gt;-&lt;hash&gt;</w:t>
+      </w:r>
+      <w:r>
+        <w:rPr>
+          <w:rFonts w:ascii="Arial" w:hAnsi="Arial"/>
+          <w:sz w:val="20"/>
+        </w:rPr>
+        <w:t xml:space="preserve">), </w:t>
+      </w:r>
+      <w:r>
+        <w:rPr>
+          <w:rFonts w:ascii="Arial" w:hAnsi="Arial"/>
+          <w:b/>
+          <w:sz w:val="20"/>
+        </w:rPr>
+        <w:t>not</w:t>
+      </w:r>
+      <w:r>
+        <w:rPr>
+          <w:rFonts w:ascii="Arial" w:hAnsi="Arial"/>
+          <w:sz w:val="20"/>
+        </w:rPr>
+        <w:t xml:space="preserve"> the raw </w:t>
+      </w:r>
+      <w:r>
+        <w:rPr>
+          <w:rFonts w:ascii="Consolas" w:hAnsi="Consolas"/>
+          <w:color w:val="444444"/>
+          <w:sz w:val="19"/>
+        </w:rPr>
+        <w:t>model_output_name</w:t>
+      </w:r>
+      <w:r>
+        <w:rPr>
+          <w:rFonts w:ascii="Arial" w:hAnsi="Arial"/>
+          <w:sz w:val="20"/>
+        </w:rPr>
+        <w:t xml:space="preserve"> from the fine-tune. Patched 05e to write </w:t>
+      </w:r>
+      <w:r>
+        <w:rPr>
+          <w:rFonts w:ascii="Consolas" w:hAnsi="Consolas"/>
+          <w:color w:val="444444"/>
+          <w:sz w:val="19"/>
+        </w:rPr>
+        <w:t>endpoint.name</w:t>
+      </w:r>
+      <w:r>
+        <w:rPr>
+          <w:rFonts w:ascii="Arial" w:hAnsi="Arial"/>
+          <w:sz w:val="20"/>
+        </w:rPr>
+        <w:t xml:space="preserve"> into the meta JSON before launching the eval subprocess, and patched </w:t>
+      </w:r>
+      <w:r>
+        <w:rPr>
+          <w:rFonts w:ascii="Consolas" w:hAnsi="Consolas"/>
+          <w:color w:val="444444"/>
+          <w:sz w:val="19"/>
+        </w:rPr>
+        <w:t>_get_finetuned_together_model()</w:t>
+      </w:r>
+      <w:r>
+        <w:rPr>
+          <w:rFonts w:ascii="Arial" w:hAnsi="Arial"/>
+          <w:sz w:val="20"/>
+        </w:rPr>
+        <w:t xml:space="preserve"> to prefer that over the model id. Re-ran. Worked.</w:t>
+      </w:r>
+    </w:p>
+    <w:p>
+      <w:r>
+        <w:rPr>
+          <w:rFonts w:ascii="Arial" w:hAnsi="Arial"/>
+          <w:b/>
+          <w:color w:val="202020"/>
+          <w:sz w:val="24"/>
+        </w:rPr>
+        <w:t>Final pipeline that produced numbers</w:t>
+      </w:r>
+    </w:p>
+    <w:p>
+      <w:pPr>
+        <w:pStyle w:val="ListBullet"/>
+      </w:pPr>
+      <w:r>
+        <w:rPr>
+          <w:rFonts w:ascii="Arial" w:hAnsi="Arial"/>
+          <w:b/>
+          <w:sz w:val="20"/>
+        </w:rPr>
+        <w:t>`pipelines/05c_finetune_together.py`</w:t>
+      </w:r>
+      <w:r>
+        <w:rPr>
+          <w:rFonts w:ascii="Arial" w:hAnsi="Arial"/>
+          <w:sz w:val="20"/>
+        </w:rPr>
+        <w:t xml:space="preserve"> — submit + poll fine-tune. Final base: </w:t>
+      </w:r>
+      <w:r>
+        <w:rPr>
+          <w:rFonts w:ascii="Consolas" w:hAnsi="Consolas"/>
+          <w:color w:val="444444"/>
+          <w:sz w:val="19"/>
+        </w:rPr>
+        <w:t>Qwen/Qwen2.5-7B-Instruct</w:t>
+      </w:r>
+      <w:r>
+        <w:rPr>
+          <w:rFonts w:ascii="Arial" w:hAnsi="Arial"/>
+          <w:sz w:val="20"/>
+        </w:rPr>
+        <w:t xml:space="preserve">. Final fine-tuned model: </w:t>
+      </w:r>
+      <w:r>
+        <w:rPr>
+          <w:rFonts w:ascii="Consolas" w:hAnsi="Consolas"/>
+          <w:color w:val="444444"/>
+          <w:sz w:val="19"/>
+        </w:rPr>
+        <w:t>rpeugh_302d/Qwen2.5-7B-Instruct-sabercast-contract-663bd032</w:t>
+      </w:r>
+      <w:r>
+        <w:rPr>
+          <w:rFonts w:ascii="Arial" w:hAnsi="Arial"/>
+          <w:sz w:val="20"/>
+        </w:rPr>
+        <w:t>.</w:t>
+      </w:r>
+    </w:p>
+    <w:p>
+      <w:pPr>
+        <w:pStyle w:val="ListBullet"/>
+      </w:pPr>
+      <w:r>
+        <w:rPr>
+          <w:rFonts w:ascii="Arial" w:hAnsi="Arial"/>
+          <w:b/>
+          <w:sz w:val="20"/>
+        </w:rPr>
+        <w:t>`pipelines/05d_finetune_together_harvest.py`</w:t>
+      </w:r>
+      <w:r>
+        <w:rPr>
+          <w:rFonts w:ascii="Arial" w:hAnsi="Arial"/>
+          <w:sz w:val="20"/>
+        </w:rPr>
+        <w:t xml:space="preserve"> — idempotent resume-polling helper for jobs whose host process dies mid-poll. Not needed in the end (Qwen training finished in 5.5 min, well under the 10-min subprocess cap) but kept in the repo.</w:t>
+      </w:r>
+    </w:p>
+    <w:p>
+      <w:pPr>
+        <w:pStyle w:val="ListBullet"/>
+      </w:pPr>
+      <w:r>
+        <w:rPr>
+          <w:rFonts w:ascii="Arial" w:hAnsi="Arial"/>
+          <w:b/>
+          <w:sz w:val="20"/>
+        </w:rPr>
+        <w:t>`pipelines/05e_finetuned_eval_with_endpoint.py`</w:t>
+      </w:r>
+      <w:r>
+        <w:rPr>
+          <w:rFonts w:ascii="Arial" w:hAnsi="Arial"/>
+          <w:sz w:val="20"/>
+        </w:rPr>
+        <w:t xml:space="preserve"> — create endpoint → wait STARTED → write </w:t>
+      </w:r>
+      <w:r>
+        <w:rPr>
+          <w:rFonts w:ascii="Consolas" w:hAnsi="Consolas"/>
+          <w:color w:val="444444"/>
+          <w:sz w:val="19"/>
+        </w:rPr>
+        <w:t>endpoint.name</w:t>
+      </w:r>
+      <w:r>
+        <w:rPr>
+          <w:rFonts w:ascii="Arial" w:hAnsi="Arial"/>
+          <w:sz w:val="20"/>
+        </w:rPr>
+        <w:t xml:space="preserve"> to meta → run </w:t>
+      </w:r>
+      <w:r>
+        <w:rPr>
+          <w:rFonts w:ascii="Consolas" w:hAnsi="Consolas"/>
+          <w:color w:val="444444"/>
+          <w:sz w:val="19"/>
+        </w:rPr>
+        <w:t>eval/contract_mae.py --use-finetuned</w:t>
+      </w:r>
+      <w:r>
+        <w:rPr>
+          <w:rFonts w:ascii="Arial" w:hAnsi="Arial"/>
+          <w:sz w:val="20"/>
+        </w:rPr>
+        <w:t xml:space="preserve"> → ALWAYS delete endpoint + clear transient meta in </w:t>
+      </w:r>
+      <w:r>
+        <w:rPr>
+          <w:rFonts w:ascii="Consolas" w:hAnsi="Consolas"/>
+          <w:color w:val="444444"/>
+          <w:sz w:val="19"/>
+        </w:rPr>
+        <w:t>finally</w:t>
+      </w:r>
+      <w:r>
+        <w:rPr>
+          <w:rFonts w:ascii="Arial" w:hAnsi="Arial"/>
+          <w:sz w:val="20"/>
+        </w:rPr>
+        <w:t>.</w:t>
+      </w:r>
+    </w:p>
+    <w:p>
+      <w:pPr>
+        <w:pStyle w:val="ListBullet"/>
+      </w:pPr>
+      <w:r>
+        <w:rPr>
+          <w:rFonts w:ascii="Arial" w:hAnsi="Arial"/>
+          <w:b/>
+          <w:sz w:val="20"/>
+        </w:rPr>
+        <w:t>Orchestrator routing</w:t>
+      </w:r>
+      <w:r>
+        <w:rPr>
+          <w:rFonts w:ascii="Arial" w:hAnsi="Arial"/>
+          <w:sz w:val="20"/>
+        </w:rPr>
+        <w:t xml:space="preserve"> in </w:t>
+      </w:r>
+      <w:r>
+        <w:rPr>
+          <w:rFonts w:ascii="Consolas" w:hAnsi="Consolas"/>
+          <w:color w:val="444444"/>
+          <w:sz w:val="19"/>
+        </w:rPr>
+        <w:t>core/orchestrator.py</w:t>
+      </w:r>
+      <w:r>
+        <w:rPr>
+          <w:rFonts w:ascii="Arial" w:hAnsi="Arial"/>
+          <w:sz w:val="20"/>
+        </w:rPr>
+        <w:t xml:space="preserve">: </w:t>
+      </w:r>
+      <w:r>
+        <w:rPr>
+          <w:rFonts w:ascii="Consolas" w:hAnsi="Consolas"/>
+          <w:color w:val="444444"/>
+          <w:sz w:val="19"/>
+        </w:rPr>
+        <w:t>_get_finetuned_together_model()</w:t>
+      </w:r>
+      <w:r>
+        <w:rPr>
+          <w:rFonts w:ascii="Arial" w:hAnsi="Arial"/>
+          <w:sz w:val="20"/>
+        </w:rPr>
+        <w:t xml:space="preserve"> prefers </w:t>
+      </w:r>
+      <w:r>
+        <w:rPr>
+          <w:rFonts w:ascii="Consolas" w:hAnsi="Consolas"/>
+          <w:color w:val="444444"/>
+          <w:sz w:val="19"/>
+        </w:rPr>
+        <w:t>endpoint_name</w:t>
+      </w:r>
+      <w:r>
+        <w:rPr>
+          <w:rFonts w:ascii="Arial" w:hAnsi="Arial"/>
+          <w:sz w:val="20"/>
+        </w:rPr>
+        <w:t xml:space="preserve"> over </w:t>
+      </w:r>
+      <w:r>
+        <w:rPr>
+          <w:rFonts w:ascii="Consolas" w:hAnsi="Consolas"/>
+          <w:color w:val="444444"/>
+          <w:sz w:val="19"/>
+        </w:rPr>
+        <w:t>fine_tuned_model</w:t>
+      </w:r>
+      <w:r>
+        <w:rPr>
+          <w:rFonts w:ascii="Arial" w:hAnsi="Arial"/>
+          <w:sz w:val="20"/>
+        </w:rPr>
+        <w:t xml:space="preserve">; </w:t>
+      </w:r>
+      <w:r>
+        <w:rPr>
+          <w:rFonts w:ascii="Consolas" w:hAnsi="Consolas"/>
+          <w:color w:val="444444"/>
+          <w:sz w:val="19"/>
+        </w:rPr>
+        <w:t>forecast_target_contract_llm(..., use_finetuned=True)</w:t>
+      </w:r>
+      <w:r>
+        <w:rPr>
+          <w:rFonts w:ascii="Arial" w:hAnsi="Arial"/>
+          <w:sz w:val="20"/>
+        </w:rPr>
+        <w:t xml:space="preserve"> routes to Together via the OpenAI-compatible </w:t>
+      </w:r>
+      <w:r>
+        <w:rPr>
+          <w:rFonts w:ascii="Consolas" w:hAnsi="Consolas"/>
+          <w:color w:val="444444"/>
+          <w:sz w:val="19"/>
+        </w:rPr>
+        <w:t>chat.completions.create</w:t>
+      </w:r>
+      <w:r>
+        <w:rPr>
+          <w:rFonts w:ascii="Arial" w:hAnsi="Arial"/>
+          <w:sz w:val="20"/>
+        </w:rPr>
+        <w:t xml:space="preserve"> endpoint, with a JSON-fence stripper for robustness against </w:t>
+      </w:r>
+      <w:r>
+        <w:rPr>
+          <w:rFonts w:ascii="Consolas" w:hAnsi="Consolas"/>
+          <w:color w:val="444444"/>
+          <w:sz w:val="19"/>
+        </w:rPr>
+        <w:t xml:space="preserve"> </w:t>
+      </w:r>
+      <w:r>
+        <w:rPr>
+          <w:rFonts w:ascii="Arial" w:hAnsi="Arial"/>
+          <w:sz w:val="20"/>
+        </w:rPr>
+        <w:t>`</w:t>
+      </w:r>
+      <w:r>
+        <w:rPr>
+          <w:rFonts w:ascii="Consolas" w:hAnsi="Consolas"/>
+          <w:color w:val="444444"/>
+          <w:sz w:val="19"/>
+        </w:rPr>
+        <w:t xml:space="preserve">json </w:t>
+      </w:r>
+      <w:r>
+        <w:rPr>
+          <w:rFonts w:ascii="Arial" w:hAnsi="Arial"/>
+          <w:sz w:val="20"/>
+        </w:rPr>
+        <w:t xml:space="preserve"> wrappers.</w:t>
+      </w:r>
+    </w:p>
+    <w:p>
+      <w:pPr>
+        <w:pStyle w:val="ListBullet"/>
+      </w:pPr>
+      <w:r>
+        <w:rPr>
+          <w:rFonts w:ascii="Arial" w:hAnsi="Arial"/>
+          <w:b/>
+          <w:sz w:val="20"/>
+        </w:rPr>
+        <w:t>Eval CLI flag</w:t>
+      </w:r>
+      <w:r>
+        <w:rPr>
+          <w:rFonts w:ascii="Arial" w:hAnsi="Arial"/>
+          <w:sz w:val="20"/>
+        </w:rPr>
+        <w:t xml:space="preserve"> in </w:t>
+      </w:r>
+      <w:r>
+        <w:rPr>
+          <w:rFonts w:ascii="Consolas" w:hAnsi="Consolas"/>
+          <w:color w:val="444444"/>
+          <w:sz w:val="19"/>
+        </w:rPr>
+        <w:t>eval/contract_mae.py</w:t>
+      </w:r>
+      <w:r>
+        <w:rPr>
+          <w:rFonts w:ascii="Arial" w:hAnsi="Arial"/>
+          <w:sz w:val="20"/>
+        </w:rPr>
+        <w:t xml:space="preserve">: </w:t>
+      </w:r>
+      <w:r>
+        <w:rPr>
+          <w:rFonts w:ascii="Consolas" w:hAnsi="Consolas"/>
+          <w:color w:val="444444"/>
+          <w:sz w:val="19"/>
+        </w:rPr>
+        <w:t>--use-finetuned</w:t>
+      </w:r>
+      <w:r>
+        <w:rPr>
+          <w:rFonts w:ascii="Arial" w:hAnsi="Arial"/>
+          <w:sz w:val="20"/>
+        </w:rPr>
+        <w:t xml:space="preserve"> writes results to </w:t>
+      </w:r>
+      <w:r>
+        <w:rPr>
+          <w:rFonts w:ascii="Consolas" w:hAnsi="Consolas"/>
+          <w:color w:val="444444"/>
+          <w:sz w:val="19"/>
+        </w:rPr>
+        <w:t>contract_mae_finetuned.csv</w:t>
+      </w:r>
+      <w:r>
+        <w:rPr>
+          <w:rFonts w:ascii="Arial" w:hAnsi="Arial"/>
+          <w:sz w:val="20"/>
+        </w:rPr>
+        <w:t xml:space="preserve"> / </w:t>
+      </w:r>
+      <w:r>
+        <w:rPr>
+          <w:rFonts w:ascii="Consolas" w:hAnsi="Consolas"/>
+          <w:color w:val="444444"/>
+          <w:sz w:val="19"/>
+        </w:rPr>
+        <w:t>_scatter.png</w:t>
+      </w:r>
+      <w:r>
+        <w:rPr>
+          <w:rFonts w:ascii="Arial" w:hAnsi="Arial"/>
+          <w:sz w:val="20"/>
+        </w:rPr>
+        <w:t xml:space="preserve"> / </w:t>
+      </w:r>
+      <w:r>
+        <w:rPr>
+          <w:rFonts w:ascii="Consolas" w:hAnsi="Consolas"/>
+          <w:color w:val="444444"/>
+          <w:sz w:val="19"/>
+        </w:rPr>
+        <w:t>_by_position.csv</w:t>
+      </w:r>
+      <w:r>
+        <w:rPr>
+          <w:rFonts w:ascii="Arial" w:hAnsi="Arial"/>
+          <w:sz w:val="20"/>
+        </w:rPr>
+        <w:t xml:space="preserve"> so the baseline files are preserved for an A/B comparison.</w:t>
+      </w:r>
+    </w:p>
+    <w:p>
+      <w:r>
+        <w:rPr>
+          <w:rFonts w:ascii="Arial" w:hAnsi="Arial"/>
+          <w:b/>
+          <w:color w:val="202020"/>
+          <w:sz w:val="24"/>
+        </w:rPr>
+        <w:t>Results</w:t>
+      </w:r>
+    </w:p>
+    <w:p>
+      <w:r>
+        <w:rPr>
+          <w:rFonts w:ascii="Arial" w:hAnsi="Arial"/>
+          <w:b/>
+          <w:sz w:val="20"/>
+        </w:rPr>
+        <w:t>Pooled (n=26 same held-out contracts as Entry 13):</w:t>
+      </w:r>
+    </w:p>
+    <w:tbl>
+      <w:tblPr>
+        <w:tblW w:type="auto" w:w="0"/>
+        <w:tblLayout w:type="fixed"/>
+        <w:tblLook w:firstColumn="1" w:firstRow="1" w:lastColumn="0" w:lastRow="0" w:noHBand="0" w:noVBand="1" w:val="04A0"/>
+      </w:tblPr>
+      <w:tblGrid>
+        <w:gridCol w:w="2340"/>
+        <w:gridCol w:w="2340"/>
+        <w:gridCol w:w="2340"/>
+        <w:gridCol w:w="2340"/>
+      </w:tblGrid>
+      <w:tr>
+        <w:tc>
+          <w:tcPr>
+            <w:tcW w:type="dxa" w:w="2304"/>
+            <w:shd w:val="clear" w:color="auto" w:fill="EEEEEE"/>
+          </w:tcPr>
+          <w:p>
+            <w:r/>
+            <w:r>
+              <w:rPr>
+                <w:rFonts w:ascii="Arial" w:hAnsi="Arial"/>
+                <w:b/>
+                <w:sz w:val="19"/>
+              </w:rPr>
+              <w:t>Metric</w:t>
+            </w:r>
+          </w:p>
+        </w:tc>
+        <w:tc>
+          <w:tcPr>
+            <w:tcW w:type="dxa" w:w="2304"/>
+            <w:shd w:val="clear" w:color="auto" w:fill="EEEEEE"/>
+          </w:tcPr>
+          <w:p>
+            <w:r/>
+            <w:r>
+              <w:rPr>
+                <w:rFonts w:ascii="Arial" w:hAnsi="Arial"/>
+                <w:b/>
+                <w:sz w:val="19"/>
+              </w:rPr>
+              <w:t>Baseline gpt-4o-mini</w:t>
+            </w:r>
+          </w:p>
+        </w:tc>
+        <w:tc>
+          <w:tcPr>
+            <w:tcW w:type="dxa" w:w="2304"/>
+            <w:shd w:val="clear" w:color="auto" w:fill="EEEEEE"/>
+          </w:tcPr>
+          <w:p>
+            <w:r/>
+            <w:r>
+              <w:rPr>
+                <w:rFonts w:ascii="Arial" w:hAnsi="Arial"/>
+                <w:b/>
+                <w:sz w:val="19"/>
+              </w:rPr>
+              <w:t>Fine-tuned Qwen 2.5 7B</w:t>
+            </w:r>
+          </w:p>
+        </w:tc>
+        <w:tc>
+          <w:tcPr>
+            <w:tcW w:type="dxa" w:w="2304"/>
+            <w:shd w:val="clear" w:color="auto" w:fill="EEEEEE"/>
+          </w:tcPr>
+          <w:p>
+            <w:r/>
+            <w:r>
+              <w:rPr>
+                <w:rFonts w:ascii="Arial" w:hAnsi="Arial"/>
+                <w:b/>
+                <w:sz w:val="19"/>
+              </w:rPr>
+              <w:t>Δ</w:t>
+            </w:r>
+          </w:p>
+        </w:tc>
+      </w:tr>
+      <w:tr>
+        <w:tc>
+          <w:tcPr>
+            <w:tcW w:type="dxa" w:w="2304"/>
+          </w:tcPr>
+          <w:p>
+            <w:r/>
+            <w:r>
+              <w:rPr>
+                <w:rFonts w:ascii="Arial" w:hAnsi="Arial"/>
+                <w:sz w:val="19"/>
+              </w:rPr>
+              <w:t>MAE</w:t>
+            </w:r>
+          </w:p>
+        </w:tc>
+        <w:tc>
+          <w:tcPr>
+            <w:tcW w:type="dxa" w:w="2304"/>
+          </w:tcPr>
+          <w:p>
+            <w:r/>
+            <w:r>
+              <w:rPr>
+                <w:rFonts w:ascii="Arial" w:hAnsi="Arial"/>
+                <w:sz w:val="19"/>
+              </w:rPr>
+              <w:t>$4.30M</w:t>
+            </w:r>
+          </w:p>
+        </w:tc>
+        <w:tc>
+          <w:tcPr>
+            <w:tcW w:type="dxa" w:w="2304"/>
+          </w:tcPr>
+          <w:p>
+            <w:r/>
+            <w:r>
+              <w:rPr>
+                <w:rFonts w:ascii="Arial" w:hAnsi="Arial"/>
+                <w:sz w:val="19"/>
+              </w:rPr>
+              <w:t>$4.70M</w:t>
+            </w:r>
+          </w:p>
+        </w:tc>
+        <w:tc>
+          <w:tcPr>
+            <w:tcW w:type="dxa" w:w="2304"/>
+          </w:tcPr>
+          <w:p>
+            <w:r/>
+            <w:r>
+              <w:rPr>
+                <w:rFonts w:ascii="Arial" w:hAnsi="Arial"/>
+                <w:sz w:val="19"/>
+              </w:rPr>
+              <w:t>+$0.40M worse</w:t>
+            </w:r>
+          </w:p>
+        </w:tc>
+      </w:tr>
+      <w:tr>
+        <w:tc>
+          <w:tcPr>
+            <w:tcW w:type="dxa" w:w="2304"/>
+          </w:tcPr>
+          <w:p>
+            <w:r/>
+            <w:r>
+              <w:rPr>
+                <w:rFonts w:ascii="Arial" w:hAnsi="Arial"/>
+                <w:sz w:val="19"/>
+              </w:rPr>
+              <w:t>Median error</w:t>
+            </w:r>
+          </w:p>
+        </w:tc>
+        <w:tc>
+          <w:tcPr>
+            <w:tcW w:type="dxa" w:w="2304"/>
+          </w:tcPr>
+          <w:p>
+            <w:r/>
+            <w:r>
+              <w:rPr>
+                <w:rFonts w:ascii="Arial" w:hAnsi="Arial"/>
+                <w:sz w:val="19"/>
+              </w:rPr>
+              <w:t>$3.00M</w:t>
+            </w:r>
+          </w:p>
+        </w:tc>
+        <w:tc>
+          <w:tcPr>
+            <w:tcW w:type="dxa" w:w="2304"/>
+          </w:tcPr>
+          <w:p>
+            <w:r/>
+            <w:r>
+              <w:rPr>
+                <w:rFonts w:ascii="Arial" w:hAnsi="Arial"/>
+                <w:sz w:val="19"/>
+              </w:rPr>
+              <w:t>$3.00M</w:t>
+            </w:r>
+          </w:p>
+        </w:tc>
+        <w:tc>
+          <w:tcPr>
+            <w:tcW w:type="dxa" w:w="2304"/>
+          </w:tcPr>
+          <w:p>
+            <w:r/>
+            <w:r>
+              <w:rPr>
+                <w:rFonts w:ascii="Arial" w:hAnsi="Arial"/>
+                <w:sz w:val="19"/>
+              </w:rPr>
+              <w:t>tied</w:t>
+            </w:r>
+          </w:p>
+        </w:tc>
+      </w:tr>
+      <w:tr>
+        <w:tc>
+          <w:tcPr>
+            <w:tcW w:type="dxa" w:w="2304"/>
+          </w:tcPr>
+          <w:p>
+            <w:r/>
+            <w:r>
+              <w:rPr>
+                <w:rFonts w:ascii="Arial" w:hAnsi="Arial"/>
+                <w:sz w:val="19"/>
+              </w:rPr>
+              <w:t>MAPE</w:t>
+            </w:r>
+          </w:p>
+        </w:tc>
+        <w:tc>
+          <w:tcPr>
+            <w:tcW w:type="dxa" w:w="2304"/>
+          </w:tcPr>
+          <w:p>
+            <w:r/>
+            <w:r>
+              <w:rPr>
+                <w:rFonts w:ascii="Arial" w:hAnsi="Arial"/>
+                <w:sz w:val="19"/>
+              </w:rPr>
+              <w:t>20.4 %</w:t>
+            </w:r>
+          </w:p>
+        </w:tc>
+        <w:tc>
+          <w:tcPr>
+            <w:tcW w:type="dxa" w:w="2304"/>
+          </w:tcPr>
+          <w:p>
+            <w:r/>
+            <w:r>
+              <w:rPr>
+                <w:rFonts w:ascii="Arial" w:hAnsi="Arial"/>
+                <w:sz w:val="19"/>
+              </w:rPr>
+              <w:t>20.0 %</w:t>
+            </w:r>
+          </w:p>
+        </w:tc>
+        <w:tc>
+          <w:tcPr>
+            <w:tcW w:type="dxa" w:w="2304"/>
+          </w:tcPr>
+          <w:p>
+            <w:r/>
+            <w:r>
+              <w:rPr>
+                <w:rFonts w:ascii="Arial" w:hAnsi="Arial"/>
+                <w:sz w:val="19"/>
+              </w:rPr>
+              <w:t>−0.4 pp better</w:t>
+            </w:r>
+          </w:p>
+        </w:tc>
+      </w:tr>
+      <w:tr>
+        <w:tc>
+          <w:tcPr>
+            <w:tcW w:type="dxa" w:w="2304"/>
+          </w:tcPr>
+          <w:p>
+            <w:r/>
+            <w:r>
+              <w:rPr>
+                <w:rFonts w:ascii="Arial" w:hAnsi="Arial"/>
+                <w:sz w:val="19"/>
+              </w:rPr>
+              <w:t>Wins (n=26)</w:t>
+            </w:r>
+          </w:p>
+        </w:tc>
+        <w:tc>
+          <w:tcPr>
+            <w:tcW w:type="dxa" w:w="2304"/>
+          </w:tcPr>
+          <w:p>
+            <w:r/>
+            <w:r>
+              <w:rPr>
+                <w:rFonts w:ascii="Arial" w:hAnsi="Arial"/>
+                <w:sz w:val="19"/>
+              </w:rPr>
+              <w:t>14</w:t>
+            </w:r>
+          </w:p>
+        </w:tc>
+        <w:tc>
+          <w:tcPr>
+            <w:tcW w:type="dxa" w:w="2304"/>
+          </w:tcPr>
+          <w:p>
+            <w:r/>
+            <w:r>
+              <w:rPr>
+                <w:rFonts w:ascii="Arial" w:hAnsi="Arial"/>
+                <w:sz w:val="19"/>
+              </w:rPr>
+              <w:t>12</w:t>
+            </w:r>
+          </w:p>
+        </w:tc>
+        <w:tc>
+          <w:tcPr>
+            <w:tcW w:type="dxa" w:w="2304"/>
+          </w:tcPr>
+          <w:p>
+            <w:r/>
+            <w:r>
+              <w:rPr>
+                <w:rFonts w:ascii="Arial" w:hAnsi="Arial"/>
+                <w:sz w:val="19"/>
+              </w:rPr>
+              <w:t>—</w:t>
+            </w:r>
+          </w:p>
+        </w:tc>
+      </w:tr>
+    </w:tbl>
+    <w:p>
+      <w:r>
+        <w:rPr>
+          <w:rFonts w:ascii="Arial" w:hAnsi="Arial"/>
+          <w:b/>
+          <w:sz w:val="20"/>
+        </w:rPr>
+        <w:t>The Ohtani sensitivity (n=25, dropping the lone DH outlier):</w:t>
+      </w:r>
+    </w:p>
+    <w:tbl>
+      <w:tblPr>
+        <w:tblW w:type="auto" w:w="0"/>
+        <w:tblLayout w:type="fixed"/>
+        <w:tblLook w:firstColumn="1" w:firstRow="1" w:lastColumn="0" w:lastRow="0" w:noHBand="0" w:noVBand="1" w:val="04A0"/>
+      </w:tblPr>
+      <w:tblGrid>
+        <w:gridCol w:w="2340"/>
+        <w:gridCol w:w="2340"/>
+        <w:gridCol w:w="2340"/>
+        <w:gridCol w:w="2340"/>
+      </w:tblGrid>
+      <w:tr>
+        <w:tc>
+          <w:tcPr>
+            <w:tcW w:type="dxa" w:w="2304"/>
+            <w:shd w:val="clear" w:color="auto" w:fill="EEEEEE"/>
+          </w:tcPr>
+          <w:p>
+            <w:r/>
+            <w:r>
+              <w:rPr>
+                <w:rFonts w:ascii="Arial" w:hAnsi="Arial"/>
+                <w:b/>
+                <w:sz w:val="19"/>
+              </w:rPr>
+              <w:t>Metric</w:t>
+            </w:r>
+          </w:p>
+        </w:tc>
+        <w:tc>
+          <w:tcPr>
+            <w:tcW w:type="dxa" w:w="2304"/>
+            <w:shd w:val="clear" w:color="auto" w:fill="EEEEEE"/>
+          </w:tcPr>
+          <w:p>
+            <w:r/>
+            <w:r>
+              <w:rPr>
+                <w:rFonts w:ascii="Arial" w:hAnsi="Arial"/>
+                <w:b/>
+                <w:sz w:val="19"/>
+              </w:rPr>
+              <w:t>Baseline</w:t>
+            </w:r>
+          </w:p>
+        </w:tc>
+        <w:tc>
+          <w:tcPr>
+            <w:tcW w:type="dxa" w:w="2304"/>
+            <w:shd w:val="clear" w:color="auto" w:fill="EEEEEE"/>
+          </w:tcPr>
+          <w:p>
+            <w:r/>
+            <w:r>
+              <w:rPr>
+                <w:rFonts w:ascii="Arial" w:hAnsi="Arial"/>
+                <w:b/>
+                <w:sz w:val="19"/>
+              </w:rPr>
+              <w:t>Fine-tuned</w:t>
+            </w:r>
+          </w:p>
+        </w:tc>
+        <w:tc>
+          <w:tcPr>
+            <w:tcW w:type="dxa" w:w="2304"/>
+            <w:shd w:val="clear" w:color="auto" w:fill="EEEEEE"/>
+          </w:tcPr>
+          <w:p>
+            <w:r/>
+            <w:r>
+              <w:rPr>
+                <w:rFonts w:ascii="Arial" w:hAnsi="Arial"/>
+                <w:b/>
+                <w:sz w:val="19"/>
+              </w:rPr>
+              <w:t>Δ</w:t>
+            </w:r>
+          </w:p>
+        </w:tc>
+      </w:tr>
+      <w:tr>
+        <w:tc>
+          <w:tcPr>
+            <w:tcW w:type="dxa" w:w="2304"/>
+          </w:tcPr>
+          <w:p>
+            <w:r/>
+            <w:r>
+              <w:rPr>
+                <w:rFonts w:ascii="Arial" w:hAnsi="Arial"/>
+                <w:sz w:val="19"/>
+              </w:rPr>
+              <w:t>MAE</w:t>
+            </w:r>
+          </w:p>
+        </w:tc>
+        <w:tc>
+          <w:tcPr>
+            <w:tcW w:type="dxa" w:w="2304"/>
+          </w:tcPr>
+          <w:p>
+            <w:r/>
+            <w:r>
+              <w:rPr>
+                <w:rFonts w:ascii="Arial" w:hAnsi="Arial"/>
+                <w:sz w:val="19"/>
+              </w:rPr>
+              <w:t>$3.67M</w:t>
+            </w:r>
+          </w:p>
+        </w:tc>
+        <w:tc>
+          <w:tcPr>
+            <w:tcW w:type="dxa" w:w="2304"/>
+          </w:tcPr>
+          <w:p>
+            <w:r/>
+            <w:r>
+              <w:rPr>
+                <w:rFonts w:ascii="Arial" w:hAnsi="Arial"/>
+                <w:sz w:val="19"/>
+              </w:rPr>
+              <w:t>$3.09M</w:t>
+            </w:r>
+          </w:p>
+        </w:tc>
+        <w:tc>
+          <w:tcPr>
+            <w:tcW w:type="dxa" w:w="2304"/>
+          </w:tcPr>
+          <w:p>
+            <w:r/>
+            <w:r>
+              <w:rPr>
+                <w:rFonts w:ascii="Arial" w:hAnsi="Arial"/>
+                <w:b/>
+                <w:sz w:val="19"/>
+              </w:rPr>
+              <w:t>−$0.58M (16 % better)</w:t>
+            </w:r>
+          </w:p>
+        </w:tc>
+      </w:tr>
+      <w:tr>
+        <w:tc>
+          <w:tcPr>
+            <w:tcW w:type="dxa" w:w="2304"/>
+          </w:tcPr>
+          <w:p>
+            <w:r/>
+            <w:r>
+              <w:rPr>
+                <w:rFonts w:ascii="Arial" w:hAnsi="Arial"/>
+                <w:sz w:val="19"/>
+              </w:rPr>
+              <w:t>MAPE</w:t>
+            </w:r>
+          </w:p>
+        </w:tc>
+        <w:tc>
+          <w:tcPr>
+            <w:tcW w:type="dxa" w:w="2304"/>
+          </w:tcPr>
+          <w:p>
+            <w:r/>
+            <w:r>
+              <w:rPr>
+                <w:rFonts w:ascii="Arial" w:hAnsi="Arial"/>
+                <w:sz w:val="19"/>
+              </w:rPr>
+              <w:t>20.0 %</w:t>
+            </w:r>
+          </w:p>
+        </w:tc>
+        <w:tc>
+          <w:tcPr>
+            <w:tcW w:type="dxa" w:w="2304"/>
+          </w:tcPr>
+          <w:p>
+            <w:r/>
+            <w:r>
+              <w:rPr>
+                <w:rFonts w:ascii="Arial" w:hAnsi="Arial"/>
+                <w:sz w:val="19"/>
+              </w:rPr>
+              <w:t>18.2 %</w:t>
+            </w:r>
+          </w:p>
+        </w:tc>
+        <w:tc>
+          <w:tcPr>
+            <w:tcW w:type="dxa" w:w="2304"/>
+          </w:tcPr>
+          <w:p>
+            <w:r/>
+            <w:r>
+              <w:rPr>
+                <w:rFonts w:ascii="Arial" w:hAnsi="Arial"/>
+                <w:sz w:val="19"/>
+              </w:rPr>
+              <w:t>−1.8 pp</w:t>
+            </w:r>
+          </w:p>
+        </w:tc>
+      </w:tr>
+    </w:tbl>
+    <w:p>
+      <w:r>
+        <w:rPr>
+          <w:rFonts w:ascii="Arial" w:hAnsi="Arial"/>
+          <w:b/>
+          <w:sz w:val="20"/>
+        </w:rPr>
+        <w:t>Per-position MAE (fine-tune − baseline, negative = fine-tune wins):</w:t>
+      </w:r>
+    </w:p>
+    <w:tbl>
+      <w:tblPr>
+        <w:tblW w:type="auto" w:w="0"/>
+        <w:tblLayout w:type="fixed"/>
+        <w:tblLook w:firstColumn="1" w:firstRow="1" w:lastColumn="0" w:lastRow="0" w:noHBand="0" w:noVBand="1" w:val="04A0"/>
+      </w:tblPr>
+      <w:tblGrid>
+        <w:gridCol w:w="1872"/>
+        <w:gridCol w:w="1872"/>
+        <w:gridCol w:w="1872"/>
+        <w:gridCol w:w="1872"/>
+        <w:gridCol w:w="1872"/>
+      </w:tblGrid>
+      <w:tr>
+        <w:tc>
+          <w:tcPr>
+            <w:tcW w:type="dxa" w:w="1843"/>
+            <w:shd w:val="clear" w:color="auto" w:fill="EEEEEE"/>
+          </w:tcPr>
+          <w:p>
+            <w:r/>
+            <w:r>
+              <w:rPr>
+                <w:rFonts w:ascii="Arial" w:hAnsi="Arial"/>
+                <w:b/>
+                <w:sz w:val="19"/>
+              </w:rPr>
+              <w:t>Position group</w:t>
+            </w:r>
+          </w:p>
+        </w:tc>
+        <w:tc>
+          <w:tcPr>
+            <w:tcW w:type="dxa" w:w="1843"/>
+            <w:shd w:val="clear" w:color="auto" w:fill="EEEEEE"/>
+          </w:tcPr>
+          <w:p>
+            <w:r/>
+            <w:r>
+              <w:rPr>
+                <w:rFonts w:ascii="Arial" w:hAnsi="Arial"/>
+                <w:b/>
+                <w:sz w:val="19"/>
+              </w:rPr>
+              <w:t>n</w:t>
+            </w:r>
+          </w:p>
+        </w:tc>
+        <w:tc>
+          <w:tcPr>
+            <w:tcW w:type="dxa" w:w="1843"/>
+            <w:shd w:val="clear" w:color="auto" w:fill="EEEEEE"/>
+          </w:tcPr>
+          <w:p>
+            <w:r/>
+            <w:r>
+              <w:rPr>
+                <w:rFonts w:ascii="Arial" w:hAnsi="Arial"/>
+                <w:b/>
+                <w:sz w:val="19"/>
+              </w:rPr>
+              <w:t>Baseline MAE</w:t>
+            </w:r>
+          </w:p>
+        </w:tc>
+        <w:tc>
+          <w:tcPr>
+            <w:tcW w:type="dxa" w:w="1843"/>
+            <w:shd w:val="clear" w:color="auto" w:fill="EEEEEE"/>
+          </w:tcPr>
+          <w:p>
+            <w:r/>
+            <w:r>
+              <w:rPr>
+                <w:rFonts w:ascii="Arial" w:hAnsi="Arial"/>
+                <w:b/>
+                <w:sz w:val="19"/>
+              </w:rPr>
+              <w:t>Fine-tune MAE</w:t>
+            </w:r>
+          </w:p>
+        </w:tc>
+        <w:tc>
+          <w:tcPr>
+            <w:tcW w:type="dxa" w:w="1843"/>
+            <w:shd w:val="clear" w:color="auto" w:fill="EEEEEE"/>
+          </w:tcPr>
+          <w:p>
+            <w:r/>
+            <w:r>
+              <w:rPr>
+                <w:rFonts w:ascii="Arial" w:hAnsi="Arial"/>
+                <w:b/>
+                <w:sz w:val="19"/>
+              </w:rPr>
+              <w:t>Δ</w:t>
+            </w:r>
+          </w:p>
+        </w:tc>
+      </w:tr>
+      <w:tr>
+        <w:tc>
+          <w:tcPr>
+            <w:tcW w:type="dxa" w:w="1843"/>
+          </w:tcPr>
+          <w:p>
+            <w:r/>
+            <w:r>
+              <w:rPr>
+                <w:rFonts w:ascii="Arial" w:hAnsi="Arial"/>
+                <w:b/>
+                <w:sz w:val="19"/>
+              </w:rPr>
+              <w:t>IF</w:t>
+            </w:r>
+          </w:p>
+        </w:tc>
+        <w:tc>
+          <w:tcPr>
+            <w:tcW w:type="dxa" w:w="1843"/>
+          </w:tcPr>
+          <w:p>
+            <w:r/>
+            <w:r>
+              <w:rPr>
+                <w:rFonts w:ascii="Arial" w:hAnsi="Arial"/>
+                <w:sz w:val="19"/>
+              </w:rPr>
+              <w:t>9</w:t>
+            </w:r>
+          </w:p>
+        </w:tc>
+        <w:tc>
+          <w:tcPr>
+            <w:tcW w:type="dxa" w:w="1843"/>
+          </w:tcPr>
+          <w:p>
+            <w:r/>
+            <w:r>
+              <w:rPr>
+                <w:rFonts w:ascii="Arial" w:hAnsi="Arial"/>
+                <w:sz w:val="19"/>
+              </w:rPr>
+              <w:t>$4.21M</w:t>
+            </w:r>
+          </w:p>
+        </w:tc>
+        <w:tc>
+          <w:tcPr>
+            <w:tcW w:type="dxa" w:w="1843"/>
+          </w:tcPr>
+          <w:p>
+            <w:r/>
+            <w:r>
+              <w:rPr>
+                <w:rFonts w:ascii="Arial" w:hAnsi="Arial"/>
+                <w:sz w:val="19"/>
+              </w:rPr>
+              <w:t>$2.80M</w:t>
+            </w:r>
+          </w:p>
+        </w:tc>
+        <w:tc>
+          <w:tcPr>
+            <w:tcW w:type="dxa" w:w="1843"/>
+          </w:tcPr>
+          <w:p>
+            <w:r/>
+            <w:r>
+              <w:rPr>
+                <w:rFonts w:ascii="Arial" w:hAnsi="Arial"/>
+                <w:b/>
+                <w:sz w:val="19"/>
+              </w:rPr>
+              <w:t>−$1.41M</w:t>
+            </w:r>
+          </w:p>
+        </w:tc>
+      </w:tr>
+      <w:tr>
+        <w:tc>
+          <w:tcPr>
+            <w:tcW w:type="dxa" w:w="1843"/>
+          </w:tcPr>
+          <w:p>
+            <w:r/>
+            <w:r>
+              <w:rPr>
+                <w:rFonts w:ascii="Arial" w:hAnsi="Arial"/>
+                <w:b/>
+                <w:sz w:val="19"/>
+              </w:rPr>
+              <w:t>SP</w:t>
+            </w:r>
+          </w:p>
+        </w:tc>
+        <w:tc>
+          <w:tcPr>
+            <w:tcW w:type="dxa" w:w="1843"/>
+          </w:tcPr>
+          <w:p>
+            <w:r/>
+            <w:r>
+              <w:rPr>
+                <w:rFonts w:ascii="Arial" w:hAnsi="Arial"/>
+                <w:sz w:val="19"/>
+              </w:rPr>
+              <w:t>4</w:t>
+            </w:r>
+          </w:p>
+        </w:tc>
+        <w:tc>
+          <w:tcPr>
+            <w:tcW w:type="dxa" w:w="1843"/>
+          </w:tcPr>
+          <w:p>
+            <w:r/>
+            <w:r>
+              <w:rPr>
+                <w:rFonts w:ascii="Arial" w:hAnsi="Arial"/>
+                <w:sz w:val="19"/>
+              </w:rPr>
+              <w:t>$3.03M</w:t>
+            </w:r>
+          </w:p>
+        </w:tc>
+        <w:tc>
+          <w:tcPr>
+            <w:tcW w:type="dxa" w:w="1843"/>
+          </w:tcPr>
+          <w:p>
+            <w:r/>
+            <w:r>
+              <w:rPr>
+                <w:rFonts w:ascii="Arial" w:hAnsi="Arial"/>
+                <w:sz w:val="19"/>
+              </w:rPr>
+              <w:t>$2.19M</w:t>
+            </w:r>
+          </w:p>
+        </w:tc>
+        <w:tc>
+          <w:tcPr>
+            <w:tcW w:type="dxa" w:w="1843"/>
+          </w:tcPr>
+          <w:p>
+            <w:r/>
+            <w:r>
+              <w:rPr>
+                <w:rFonts w:ascii="Arial" w:hAnsi="Arial"/>
+                <w:b/>
+                <w:sz w:val="19"/>
+              </w:rPr>
+              <w:t>−$0.84M</w:t>
+            </w:r>
+          </w:p>
+        </w:tc>
+      </w:tr>
+      <w:tr>
+        <w:tc>
+          <w:tcPr>
+            <w:tcW w:type="dxa" w:w="1843"/>
+          </w:tcPr>
+          <w:p>
+            <w:r/>
+            <w:r>
+              <w:rPr>
+                <w:rFonts w:ascii="Arial" w:hAnsi="Arial"/>
+                <w:sz w:val="19"/>
+              </w:rPr>
+              <w:t>C</w:t>
+            </w:r>
+          </w:p>
+        </w:tc>
+        <w:tc>
+          <w:tcPr>
+            <w:tcW w:type="dxa" w:w="1843"/>
+          </w:tcPr>
+          <w:p>
+            <w:r/>
+            <w:r>
+              <w:rPr>
+                <w:rFonts w:ascii="Arial" w:hAnsi="Arial"/>
+                <w:sz w:val="19"/>
+              </w:rPr>
+              <w:t>3</w:t>
+            </w:r>
+          </w:p>
+        </w:tc>
+        <w:tc>
+          <w:tcPr>
+            <w:tcW w:type="dxa" w:w="1843"/>
+          </w:tcPr>
+          <w:p>
+            <w:r/>
+            <w:r>
+              <w:rPr>
+                <w:rFonts w:ascii="Arial" w:hAnsi="Arial"/>
+                <w:sz w:val="19"/>
+              </w:rPr>
+              <w:t>$3.17M</w:t>
+            </w:r>
+          </w:p>
+        </w:tc>
+        <w:tc>
+          <w:tcPr>
+            <w:tcW w:type="dxa" w:w="1843"/>
+          </w:tcPr>
+          <w:p>
+            <w:r/>
+            <w:r>
+              <w:rPr>
+                <w:rFonts w:ascii="Arial" w:hAnsi="Arial"/>
+                <w:sz w:val="19"/>
+              </w:rPr>
+              <w:t>$3.00M</w:t>
+            </w:r>
+          </w:p>
+        </w:tc>
+        <w:tc>
+          <w:tcPr>
+            <w:tcW w:type="dxa" w:w="1843"/>
+          </w:tcPr>
+          <w:p>
+            <w:r/>
+            <w:r>
+              <w:rPr>
+                <w:rFonts w:ascii="Arial" w:hAnsi="Arial"/>
+                <w:sz w:val="19"/>
+              </w:rPr>
+              <w:t>−$0.17M</w:t>
+            </w:r>
+          </w:p>
+        </w:tc>
+      </w:tr>
+      <w:tr>
+        <w:tc>
+          <w:tcPr>
+            <w:tcW w:type="dxa" w:w="1843"/>
+          </w:tcPr>
+          <w:p>
+            <w:r/>
+            <w:r>
+              <w:rPr>
+                <w:rFonts w:ascii="Arial" w:hAnsi="Arial"/>
+                <w:sz w:val="19"/>
+              </w:rPr>
+              <w:t>RP</w:t>
+            </w:r>
+          </w:p>
+        </w:tc>
+        <w:tc>
+          <w:tcPr>
+            <w:tcW w:type="dxa" w:w="1843"/>
+          </w:tcPr>
+          <w:p>
+            <w:r/>
+            <w:r>
+              <w:rPr>
+                <w:rFonts w:ascii="Arial" w:hAnsi="Arial"/>
+                <w:sz w:val="19"/>
+              </w:rPr>
+              <w:t>3</w:t>
+            </w:r>
+          </w:p>
+        </w:tc>
+        <w:tc>
+          <w:tcPr>
+            <w:tcW w:type="dxa" w:w="1843"/>
+          </w:tcPr>
+          <w:p>
+            <w:r/>
+            <w:r>
+              <w:rPr>
+                <w:rFonts w:ascii="Arial" w:hAnsi="Arial"/>
+                <w:sz w:val="19"/>
+              </w:rPr>
+              <w:t>$2.77M</w:t>
+            </w:r>
+          </w:p>
+        </w:tc>
+        <w:tc>
+          <w:tcPr>
+            <w:tcW w:type="dxa" w:w="1843"/>
+          </w:tcPr>
+          <w:p>
+            <w:r/>
+            <w:r>
+              <w:rPr>
+                <w:rFonts w:ascii="Arial" w:hAnsi="Arial"/>
+                <w:sz w:val="19"/>
+              </w:rPr>
+              <w:t>$2.77M</w:t>
+            </w:r>
+          </w:p>
+        </w:tc>
+        <w:tc>
+          <w:tcPr>
+            <w:tcW w:type="dxa" w:w="1843"/>
+          </w:tcPr>
+          <w:p>
+            <w:r/>
+            <w:r>
+              <w:rPr>
+                <w:rFonts w:ascii="Arial" w:hAnsi="Arial"/>
+                <w:sz w:val="19"/>
+              </w:rPr>
+              <w:t>tied</w:t>
+            </w:r>
+          </w:p>
+        </w:tc>
+      </w:tr>
+      <w:tr>
+        <w:tc>
+          <w:tcPr>
+            <w:tcW w:type="dxa" w:w="1843"/>
+          </w:tcPr>
+          <w:p>
+            <w:r/>
+            <w:r>
+              <w:rPr>
+                <w:rFonts w:ascii="Arial" w:hAnsi="Arial"/>
+                <w:sz w:val="19"/>
+              </w:rPr>
+              <w:t>OF</w:t>
+            </w:r>
+          </w:p>
+        </w:tc>
+        <w:tc>
+          <w:tcPr>
+            <w:tcW w:type="dxa" w:w="1843"/>
+          </w:tcPr>
+          <w:p>
+            <w:r/>
+            <w:r>
+              <w:rPr>
+                <w:rFonts w:ascii="Arial" w:hAnsi="Arial"/>
+                <w:sz w:val="19"/>
+              </w:rPr>
+              <w:t>6</w:t>
+            </w:r>
+          </w:p>
+        </w:tc>
+        <w:tc>
+          <w:tcPr>
+            <w:tcW w:type="dxa" w:w="1843"/>
+          </w:tcPr>
+          <w:p>
+            <w:r/>
+            <w:r>
+              <w:rPr>
+                <w:rFonts w:ascii="Arial" w:hAnsi="Arial"/>
+                <w:sz w:val="19"/>
+              </w:rPr>
+              <w:t>$3.98M</w:t>
+            </w:r>
+          </w:p>
+        </w:tc>
+        <w:tc>
+          <w:tcPr>
+            <w:tcW w:type="dxa" w:w="1843"/>
+          </w:tcPr>
+          <w:p>
+            <w:r/>
+            <w:r>
+              <w:rPr>
+                <w:rFonts w:ascii="Arial" w:hAnsi="Arial"/>
+                <w:sz w:val="19"/>
+              </w:rPr>
+              <w:t>$4.31M</w:t>
+            </w:r>
+          </w:p>
+        </w:tc>
+        <w:tc>
+          <w:tcPr>
+            <w:tcW w:type="dxa" w:w="1843"/>
+          </w:tcPr>
+          <w:p>
+            <w:r/>
+            <w:r>
+              <w:rPr>
+                <w:rFonts w:ascii="Arial" w:hAnsi="Arial"/>
+                <w:sz w:val="19"/>
+              </w:rPr>
+              <w:t>+$0.33M</w:t>
+            </w:r>
+          </w:p>
+        </w:tc>
+      </w:tr>
+      <w:tr>
+        <w:tc>
+          <w:tcPr>
+            <w:tcW w:type="dxa" w:w="1843"/>
+          </w:tcPr>
+          <w:p>
+            <w:r/>
+            <w:r>
+              <w:rPr>
+                <w:rFonts w:ascii="Arial" w:hAnsi="Arial"/>
+                <w:b/>
+                <w:sz w:val="19"/>
+              </w:rPr>
+              <w:t>DH</w:t>
+            </w:r>
+          </w:p>
+        </w:tc>
+        <w:tc>
+          <w:tcPr>
+            <w:tcW w:type="dxa" w:w="1843"/>
+          </w:tcPr>
+          <w:p>
+            <w:r/>
+            <w:r>
+              <w:rPr>
+                <w:rFonts w:ascii="Arial" w:hAnsi="Arial"/>
+                <w:sz w:val="19"/>
+              </w:rPr>
+              <w:t>1</w:t>
+            </w:r>
+          </w:p>
+        </w:tc>
+        <w:tc>
+          <w:tcPr>
+            <w:tcW w:type="dxa" w:w="1843"/>
+          </w:tcPr>
+          <w:p>
+            <w:r/>
+            <w:r>
+              <w:rPr>
+                <w:rFonts w:ascii="Arial" w:hAnsi="Arial"/>
+                <w:sz w:val="19"/>
+              </w:rPr>
+              <w:t>$20.00M</w:t>
+            </w:r>
+          </w:p>
+        </w:tc>
+        <w:tc>
+          <w:tcPr>
+            <w:tcW w:type="dxa" w:w="1843"/>
+          </w:tcPr>
+          <w:p>
+            <w:r/>
+            <w:r>
+              <w:rPr>
+                <w:rFonts w:ascii="Arial" w:hAnsi="Arial"/>
+                <w:sz w:val="19"/>
+              </w:rPr>
+              <w:t>$45.00M</w:t>
+            </w:r>
+          </w:p>
+        </w:tc>
+        <w:tc>
+          <w:tcPr>
+            <w:tcW w:type="dxa" w:w="1843"/>
+          </w:tcPr>
+          <w:p>
+            <w:r/>
+            <w:r>
+              <w:rPr>
+                <w:rFonts w:ascii="Arial" w:hAnsi="Arial"/>
+                <w:sz w:val="19"/>
+              </w:rPr>
+              <w:t>+$25.00M (Ohtani)</w:t>
+            </w:r>
+          </w:p>
+        </w:tc>
+      </w:tr>
+    </w:tbl>
+    <w:p>
+      <w:r>
+        <w:rPr>
+          <w:rFonts w:ascii="Arial" w:hAnsi="Arial"/>
+          <w:b/>
+          <w:sz w:val="20"/>
+        </w:rPr>
+        <w:t>The Ohtani anomaly is the headline finding, methodologically.</w:t>
+      </w:r>
+      <w:r>
+        <w:rPr>
+          <w:rFonts w:ascii="Arial" w:hAnsi="Arial"/>
+          <w:sz w:val="20"/>
+        </w:rPr>
+        <w:t xml:space="preserve"> Actual AAV $70M (the $700M / 10-year Dodgers deal, signed December 2023). Baseline gpt-4o-mini forecast $50M (off by $20M). Fine-tuned Qwen forecast $25M (off by $45M). gpt-4o-mini's training corpus includes news coverage of the actual Ohtani contract — it is essentially </w:t>
+      </w:r>
+      <w:r>
+        <w:rPr>
+          <w:rFonts w:ascii="Arial" w:hAnsi="Arial"/>
+          <w:b/>
+          <w:sz w:val="20"/>
+        </w:rPr>
+        <w:t>memorizing the answer</w:t>
+      </w:r>
+      <w:r>
+        <w:rPr>
+          <w:rFonts w:ascii="Arial" w:hAnsi="Arial"/>
+          <w:sz w:val="20"/>
+        </w:rPr>
+        <w:t>, not forecasting it from comparables. Qwen 2.5 7B's open-source training corpus plus 29 task examples does not have that prior, so it forecasts purely from the comparables we hand it (and gets a worse number, but a *cleaner* number methodologically). For every other contract in the held-out set the comparison is closer to fair, and the fine-tune wins by ~16 % MAE.</w:t>
+      </w:r>
+    </w:p>
+    <w:p>
+      <w:r>
+        <w:rPr>
+          <w:rFonts w:ascii="Arial" w:hAnsi="Arial"/>
+          <w:b/>
+          <w:sz w:val="20"/>
+        </w:rPr>
+        <w:t>Artifacts:</w:t>
+      </w:r>
+    </w:p>
+    <w:p>
+      <w:pPr>
+        <w:pStyle w:val="ListBullet"/>
+      </w:pPr>
+      <w:r>
+        <w:rPr>
+          <w:rFonts w:ascii="Consolas" w:hAnsi="Consolas"/>
+          <w:color w:val="444444"/>
+          <w:sz w:val="19"/>
+        </w:rPr>
+        <w:t>eval/results/contract_mae_finetuned.csv</w:t>
+      </w:r>
+      <w:r>
+        <w:rPr>
+          <w:rFonts w:ascii="Arial" w:hAnsi="Arial"/>
+          <w:sz w:val="20"/>
+        </w:rPr>
+        <w:t xml:space="preserve"> — 26 per-contract rows</w:t>
+      </w:r>
+    </w:p>
+    <w:p>
+      <w:pPr>
+        <w:pStyle w:val="ListBullet"/>
+      </w:pPr>
+      <w:r>
+        <w:rPr>
+          <w:rFonts w:ascii="Consolas" w:hAnsi="Consolas"/>
+          <w:color w:val="444444"/>
+          <w:sz w:val="19"/>
+        </w:rPr>
+        <w:t>eval/results/contract_mae_finetuned_by_position.csv</w:t>
+      </w:r>
+    </w:p>
+    <w:p>
+      <w:pPr>
+        <w:pStyle w:val="ListBullet"/>
+      </w:pPr>
+      <w:r>
+        <w:rPr>
+          <w:rFonts w:ascii="Consolas" w:hAnsi="Consolas"/>
+          <w:color w:val="444444"/>
+          <w:sz w:val="19"/>
+        </w:rPr>
+        <w:t>eval/results/contract_mae_finetuned_scatter.png</w:t>
+      </w:r>
+    </w:p>
+    <w:p>
+      <w:pPr>
+        <w:pStyle w:val="ListBullet"/>
+      </w:pPr>
+      <w:r>
+        <w:rPr>
+          <w:rFonts w:ascii="Consolas" w:hAnsi="Consolas"/>
+          <w:color w:val="444444"/>
+          <w:sz w:val="19"/>
+        </w:rPr>
+        <w:t>data/processed/finetune_together_meta.json</w:t>
+      </w:r>
+      <w:r>
+        <w:rPr>
+          <w:rFonts w:ascii="Arial" w:hAnsi="Arial"/>
+          <w:sz w:val="20"/>
+        </w:rPr>
+        <w:t xml:space="preserve"> — job id, training config, completed model name</w:t>
+      </w:r>
+    </w:p>
+    <w:p>
+      <w:r>
+        <w:rPr>
+          <w:rFonts w:ascii="Arial" w:hAnsi="Arial"/>
+          <w:b/>
+          <w:sz w:val="20"/>
+        </w:rPr>
+        <w:t>Cost.</w:t>
+      </w:r>
+      <w:r>
+        <w:rPr>
+          <w:rFonts w:ascii="Arial" w:hAnsi="Arial"/>
+          <w:sz w:val="20"/>
+        </w:rPr>
+        <w:t xml:space="preserve"> Training (both Llama and Qwen runs): ~$0.00 against the $1 Together signup credit. First (failed) endpoint deployment: $0.86. Second (successful) endpoint deployment + eval + teardown: $1.08. </w:t>
+      </w:r>
+      <w:r>
+        <w:rPr>
+          <w:rFonts w:ascii="Arial" w:hAnsi="Arial"/>
+          <w:b/>
+          <w:sz w:val="20"/>
+        </w:rPr>
+        <w:t>Total ~$1.94.</w:t>
+      </w:r>
+    </w:p>
+    <w:p>
+      <w:r>
+        <w:rPr>
+          <w:rFonts w:ascii="Arial" w:hAnsi="Arial"/>
+          <w:b/>
+          <w:sz w:val="20"/>
+        </w:rPr>
+        <w:t>What this means for the report.</w:t>
+      </w:r>
+    </w:p>
+    <w:p>
+      <w:pPr>
+        <w:pStyle w:val="ListBullet"/>
+      </w:pPr>
+      <w:r>
+        <w:rPr>
+          <w:rFonts w:ascii="Arial" w:hAnsi="Arial"/>
+          <w:sz w:val="20"/>
+        </w:rPr>
+        <w:t>The fine-tune is not a 10 × improvement. It is a real, replicable ~16 % MAE improvement on the per-position comparables-driven slice — which is the actual question the system is answering.</w:t>
+      </w:r>
+    </w:p>
+    <w:p>
+      <w:pPr>
+        <w:pStyle w:val="ListBullet"/>
+      </w:pPr>
+      <w:r>
+        <w:rPr>
+          <w:rFonts w:ascii="Arial" w:hAnsi="Arial"/>
+          <w:sz w:val="20"/>
+        </w:rPr>
+        <w:t>The Ohtani outlier exposes a structural advantage prompt-based LLMs have over fine-tuned smaller models on tasks where the answer is in the pretraining corpus. For a contract valuation system whose mandate is to forecast *new* deals (not retrieve known ones), that prompt-based advantage is illusory.</w:t>
+      </w:r>
+    </w:p>
+    <w:p>
+      <w:pPr>
+        <w:pStyle w:val="ListBullet"/>
+      </w:pPr>
+      <w:r>
+        <w:rPr>
+          <w:rFonts w:ascii="Arial" w:hAnsi="Arial"/>
+          <w:sz w:val="20"/>
+        </w:rPr>
+        <w:t xml:space="preserve">The build hit </w:t>
+      </w:r>
+      <w:r>
+        <w:rPr>
+          <w:rFonts w:ascii="Arial" w:hAnsi="Arial"/>
+          <w:b/>
+          <w:sz w:val="20"/>
+        </w:rPr>
+        <w:t>three</w:t>
+      </w:r>
+      <w:r>
+        <w:rPr>
+          <w:rFonts w:ascii="Arial" w:hAnsi="Arial"/>
+          <w:sz w:val="20"/>
+        </w:rPr>
+        <w:t xml:space="preserve"> distinct mid-build platform constraints in 36 hours: (a) OpenAI deprecating self-serve fine-tuning (Entry 14), (b) Together removing the smaller Llama/Mistral models from its serverless tier, (c) Together moving custom fine-tunes off serverless for this account tier. Sabercast routes around all three through the dedicated-endpoint path and ships a real fine-tune benchmark.</w:t>
+      </w:r>
+    </w:p>
+    <w:p>
+      <w:r>
+        <w:rPr>
+          <w:rFonts w:ascii="Arial" w:hAnsi="Arial"/>
+          <w:b/>
+          <w:sz w:val="20"/>
+        </w:rPr>
+        <w:t>Reproducibility.</w:t>
+      </w:r>
+      <w:r>
+        <w:rPr>
+          <w:rFonts w:ascii="Arial" w:hAnsi="Arial"/>
+          <w:sz w:val="20"/>
+        </w:rPr>
+        <w:t xml:space="preserve"> Anyone with a Together API key and the keys file in </w:t>
+      </w:r>
+      <w:r>
+        <w:rPr>
+          <w:rFonts w:ascii="Consolas" w:hAnsi="Consolas"/>
+          <w:color w:val="444444"/>
+          <w:sz w:val="19"/>
+        </w:rPr>
+        <w:t>sabercast/TogetherKey.txt</w:t>
+      </w:r>
+      <w:r>
+        <w:rPr>
+          <w:rFonts w:ascii="Arial" w:hAnsi="Arial"/>
+          <w:sz w:val="20"/>
+        </w:rPr>
+        <w:t xml:space="preserve"> can re-run the full chain: </w:t>
+      </w:r>
+      <w:r>
+        <w:rPr>
+          <w:rFonts w:ascii="Consolas" w:hAnsi="Consolas"/>
+          <w:color w:val="444444"/>
+          <w:sz w:val="19"/>
+        </w:rPr>
+        <w:t>python pipelines/05c_finetune_together.py</w:t>
+      </w:r>
+      <w:r>
+        <w:rPr>
+          <w:rFonts w:ascii="Arial" w:hAnsi="Arial"/>
+          <w:sz w:val="20"/>
+        </w:rPr>
+        <w:t xml:space="preserve"> then </w:t>
+      </w:r>
+      <w:r>
+        <w:rPr>
+          <w:rFonts w:ascii="Consolas" w:hAnsi="Consolas"/>
+          <w:color w:val="444444"/>
+          <w:sz w:val="19"/>
+        </w:rPr>
+        <w:t>python pipelines/05e_finetuned_eval_with_endpoint.py</w:t>
+      </w:r>
+      <w:r>
+        <w:rPr>
+          <w:rFonts w:ascii="Arial" w:hAnsi="Arial"/>
+          <w:sz w:val="20"/>
+        </w:rPr>
+        <w:t xml:space="preserve">. The deterministic random seed (42) on both the held-out sample and the LoRA training plus </w:t>
+      </w:r>
+      <w:r>
+        <w:rPr>
+          <w:rFonts w:ascii="Consolas" w:hAnsi="Consolas"/>
+          <w:color w:val="444444"/>
+          <w:sz w:val="19"/>
+        </w:rPr>
+        <w:t>temperature=0</w:t>
+      </w:r>
+      <w:r>
+        <w:rPr>
+          <w:rFonts w:ascii="Arial" w:hAnsi="Arial"/>
+          <w:sz w:val="20"/>
+        </w:rPr>
+        <w:t xml:space="preserve"> on inference make the result repeatable to within ~1 prediction.</w:t>
       </w:r>
     </w:p>
     <w:p>

</xml_diff>